<commit_message>
V3.1.1 - enhance maturity scoring and radar chart generation; support 0-100 inputs and add Cost of Inaction tag
</commit_message>
<xml_diff>
--- a/planet_it_maturity_assessment_template.docx
+++ b/planet_it_maturity_assessment_template.docx
@@ -611,7 +611,6 @@
                                 <w:szCs w:val="80"/>
                               </w:rPr>
                             </w:pPr>
-                            <w:proofErr w:type="gramStart"/>
                             <w:r>
                               <w:rPr>
                                 <w:rFonts w:cs="Consolas"/>
@@ -619,29 +618,28 @@
                                 <w:sz w:val="80"/>
                                 <w:szCs w:val="80"/>
                               </w:rPr>
-                              <w:t xml:space="preserve">{{ </w:t>
+                              <w:t>{{ customer_name }}</w:t>
                             </w:r>
-                            <w:proofErr w:type="spellStart"/>
-                            <w:r>
+                          </w:p>
+                          <w:p>
+                            <w:pPr>
                               <w:rPr>
                                 <w:rFonts w:cs="Consolas"/>
                                 <w:color w:val="FFFFFF" w:themeColor="background1"/>
                                 <w:sz w:val="80"/>
                                 <w:szCs w:val="80"/>
                               </w:rPr>
-                              <w:t>customer</w:t>
-                            </w:r>
-                            <w:proofErr w:type="gramEnd"/>
-                            <w:r>
+                            </w:pPr>
+                          </w:p>
+                          <w:p>
+                            <w:pPr>
                               <w:rPr>
                                 <w:rFonts w:cs="Consolas"/>
                                 <w:color w:val="FFFFFF" w:themeColor="background1"/>
                                 <w:sz w:val="80"/>
                                 <w:szCs w:val="80"/>
                               </w:rPr>
-                              <w:t>_</w:t>
-                            </w:r>
-                            <w:proofErr w:type="gramStart"/>
+                            </w:pPr>
                             <w:r>
                               <w:rPr>
                                 <w:rFonts w:cs="Consolas"/>
@@ -649,9 +647,8 @@
                                 <w:sz w:val="80"/>
                                 <w:szCs w:val="80"/>
                               </w:rPr>
-                              <w:t>name</w:t>
+                              <w:t>Prepared by</w:t>
                             </w:r>
-                            <w:proofErr w:type="spellEnd"/>
                             <w:r>
                               <w:rPr>
                                 <w:rFonts w:cs="Consolas"/>
@@ -659,9 +656,8 @@
                                 <w:sz w:val="80"/>
                                 <w:szCs w:val="80"/>
                               </w:rPr>
-                              <w:t xml:space="preserve"> }</w:t>
+                              <w:t xml:space="preserve"> </w:t>
                             </w:r>
-                            <w:proofErr w:type="gramEnd"/>
                             <w:r>
                               <w:rPr>
                                 <w:rFonts w:cs="Consolas"/>
@@ -669,105 +665,7 @@
                                 <w:sz w:val="80"/>
                                 <w:szCs w:val="80"/>
                               </w:rPr>
-                              <w:t>}</w:t>
-                            </w:r>
-                          </w:p>
-                          <w:p>
-                            <w:pPr>
-                              <w:rPr>
-                                <w:rFonts w:cs="Consolas"/>
-                                <w:color w:val="FFFFFF" w:themeColor="background1"/>
-                                <w:sz w:val="80"/>
-                                <w:szCs w:val="80"/>
-                              </w:rPr>
-                            </w:pPr>
-                          </w:p>
-                          <w:p>
-                            <w:pPr>
-                              <w:rPr>
-                                <w:rFonts w:cs="Consolas"/>
-                                <w:color w:val="FFFFFF" w:themeColor="background1"/>
-                                <w:sz w:val="80"/>
-                                <w:szCs w:val="80"/>
-                              </w:rPr>
-                            </w:pPr>
-                            <w:r>
-                              <w:rPr>
-                                <w:rFonts w:cs="Consolas"/>
-                                <w:color w:val="FFFFFF" w:themeColor="background1"/>
-                                <w:sz w:val="80"/>
-                                <w:szCs w:val="80"/>
-                              </w:rPr>
-                              <w:t>Prepared by</w:t>
-                            </w:r>
-                            <w:r>
-                              <w:rPr>
-                                <w:rFonts w:cs="Consolas"/>
-                                <w:color w:val="FFFFFF" w:themeColor="background1"/>
-                                <w:sz w:val="80"/>
-                                <w:szCs w:val="80"/>
-                              </w:rPr>
-                              <w:t xml:space="preserve"> </w:t>
-                            </w:r>
-                            <w:proofErr w:type="gramStart"/>
-                            <w:r>
-                              <w:rPr>
-                                <w:rFonts w:cs="Consolas"/>
-                                <w:color w:val="FFFFFF" w:themeColor="background1"/>
-                                <w:sz w:val="80"/>
-                                <w:szCs w:val="80"/>
-                              </w:rPr>
-                              <w:t xml:space="preserve">{{ </w:t>
-                            </w:r>
-                            <w:proofErr w:type="spellStart"/>
-                            <w:r>
-                              <w:rPr>
-                                <w:rFonts w:cs="Consolas"/>
-                                <w:color w:val="FFFFFF" w:themeColor="background1"/>
-                                <w:sz w:val="80"/>
-                                <w:szCs w:val="80"/>
-                              </w:rPr>
-                              <w:t>consultant</w:t>
-                            </w:r>
-                            <w:proofErr w:type="gramEnd"/>
-                            <w:r>
-                              <w:rPr>
-                                <w:rFonts w:cs="Consolas"/>
-                                <w:color w:val="FFFFFF" w:themeColor="background1"/>
-                                <w:sz w:val="80"/>
-                                <w:szCs w:val="80"/>
-                              </w:rPr>
-                              <w:t>_</w:t>
-                            </w:r>
-                            <w:proofErr w:type="gramStart"/>
-                            <w:r>
-                              <w:rPr>
-                                <w:rFonts w:cs="Consolas"/>
-                                <w:color w:val="FFFFFF" w:themeColor="background1"/>
-                                <w:sz w:val="80"/>
-                                <w:szCs w:val="80"/>
-                              </w:rPr>
-                              <w:t>name</w:t>
-                            </w:r>
-                            <w:proofErr w:type="spellEnd"/>
-                            <w:r>
-                              <w:rPr>
-                                <w:rFonts w:cs="Consolas"/>
-                                <w:color w:val="FFFFFF" w:themeColor="background1"/>
-                                <w:sz w:val="80"/>
-                                <w:szCs w:val="80"/>
-                              </w:rPr>
-                              <w:t xml:space="preserve"> }</w:t>
-                            </w:r>
-                            <w:proofErr w:type="gramEnd"/>
-                            <w:r>
-                              <w:rPr>
-                                <w:rFonts w:cs="Consolas"/>
-                                <w:color w:val="FFFFFF" w:themeColor="background1"/>
-                                <w:sz w:val="80"/>
-                                <w:szCs w:val="80"/>
-                              </w:rPr>
-                              <w:t>}</w:t>
+                              <w:t>{{ consultant_name }}</w:t>
                             </w:r>
                           </w:p>
                           <w:p>
@@ -1128,99 +1026,7 @@
           <w:bCs/>
           <w:color w:val="EE0000"/>
         </w:rPr>
-        <w:t xml:space="preserve">{% for guide in </w:t>
-      </w:r>
-      <w:proofErr w:type="spellStart"/>
-      <w:r>
-        <w:rPr>
-          <w:b/>
-          <w:bCs/>
-          <w:color w:val="EE0000"/>
-        </w:rPr>
-        <w:t>consultant_discovery_guide</w:t>
-      </w:r>
-      <w:proofErr w:type="spellEnd"/>
-      <w:r>
-        <w:rPr>
-          <w:b/>
-          <w:bCs/>
-          <w:color w:val="EE0000"/>
-        </w:rPr>
-        <w:t xml:space="preserve"> </w:t>
-      </w:r>
-      <w:proofErr w:type="gramStart"/>
-      <w:r>
-        <w:rPr>
-          <w:b/>
-          <w:bCs/>
-          <w:color w:val="EE0000"/>
-        </w:rPr>
-        <w:t>%}•</w:t>
-      </w:r>
-      <w:proofErr w:type="gramEnd"/>
-      <w:r>
-        <w:rPr>
-          <w:b/>
-          <w:bCs/>
-          <w:color w:val="EE0000"/>
-        </w:rPr>
-        <w:t xml:space="preserve"> </w:t>
-      </w:r>
-      <w:proofErr w:type="gramStart"/>
-      <w:r>
-        <w:rPr>
-          <w:b/>
-          <w:bCs/>
-          <w:color w:val="EE0000"/>
-        </w:rPr>
-        <w:t>{{ guide</w:t>
-      </w:r>
-      <w:proofErr w:type="gramEnd"/>
-      <w:r>
-        <w:rPr>
-          <w:b/>
-          <w:bCs/>
-          <w:color w:val="EE0000"/>
-        </w:rPr>
-        <w:t xml:space="preserve"> </w:t>
-      </w:r>
-      <w:proofErr w:type="gramStart"/>
-      <w:r>
-        <w:rPr>
-          <w:b/>
-          <w:bCs/>
-          <w:color w:val="EE0000"/>
-        </w:rPr>
-        <w:t>}}{</w:t>
-      </w:r>
-      <w:proofErr w:type="gramEnd"/>
-      <w:r>
-        <w:rPr>
-          <w:b/>
-          <w:bCs/>
-          <w:color w:val="EE0000"/>
-        </w:rPr>
-        <w:t xml:space="preserve">% if not </w:t>
-      </w:r>
-      <w:proofErr w:type="spellStart"/>
-      <w:proofErr w:type="gramStart"/>
-      <w:r>
-        <w:rPr>
-          <w:b/>
-          <w:bCs/>
-          <w:color w:val="EE0000"/>
-        </w:rPr>
-        <w:t>loop.last</w:t>
-      </w:r>
-      <w:proofErr w:type="spellEnd"/>
-      <w:proofErr w:type="gramEnd"/>
-      <w:r>
-        <w:rPr>
-          <w:b/>
-          <w:bCs/>
-          <w:color w:val="EE0000"/>
-        </w:rPr>
-        <w:t xml:space="preserve"> %}</w:t>
+        <w:t>{% for guide in consultant_discovery_guide %}• {{ guide }}{% if not loop.last %}</w:t>
       </w:r>
       <w:r>
         <w:rPr>
@@ -1229,43 +1035,7 @@
           <w:color w:val="EE0000"/>
         </w:rPr>
         <w:br/>
-        <w:t xml:space="preserve">{% endif </w:t>
-      </w:r>
-      <w:proofErr w:type="gramStart"/>
-      <w:r>
-        <w:rPr>
-          <w:b/>
-          <w:bCs/>
-          <w:color w:val="EE0000"/>
-        </w:rPr>
-        <w:t>%}{</w:t>
-      </w:r>
-      <w:proofErr w:type="gramEnd"/>
-      <w:r>
-        <w:rPr>
-          <w:b/>
-          <w:bCs/>
-          <w:color w:val="EE0000"/>
-        </w:rPr>
-        <w:t xml:space="preserve">% </w:t>
-      </w:r>
-      <w:proofErr w:type="spellStart"/>
-      <w:r>
-        <w:rPr>
-          <w:b/>
-          <w:bCs/>
-          <w:color w:val="EE0000"/>
-        </w:rPr>
-        <w:t>endfor</w:t>
-      </w:r>
-      <w:proofErr w:type="spellEnd"/>
-      <w:r>
-        <w:rPr>
-          <w:b/>
-          <w:bCs/>
-          <w:color w:val="EE0000"/>
-        </w:rPr>
-        <w:t xml:space="preserve"> %}</w:t>
+        <w:t>{% endif %}{% endfor %}</w:t>
       </w:r>
     </w:p>
     <w:p/>
@@ -1276,29 +1046,8 @@
         <w:pStyle w:val="Heading1"/>
         <w:spacing w:after="240"/>
       </w:pPr>
-      <w:proofErr w:type="gramStart"/>
-      <w:r>
-        <w:t xml:space="preserve">{{ </w:t>
-      </w:r>
-      <w:proofErr w:type="spellStart"/>
-      <w:r>
-        <w:t>customer</w:t>
-      </w:r>
-      <w:proofErr w:type="gramEnd"/>
-      <w:r>
-        <w:t>_</w:t>
-      </w:r>
-      <w:proofErr w:type="gramStart"/>
-      <w:r>
-        <w:t>name</w:t>
-      </w:r>
-      <w:proofErr w:type="spellEnd"/>
-      <w:r>
-        <w:t xml:space="preserve"> }</w:t>
-      </w:r>
-      <w:proofErr w:type="gramEnd"/>
-      <w:r>
-        <w:t>}</w:t>
+      <w:r>
+        <w:t>{{ customer_name }}</w:t>
       </w:r>
       <w:r>
         <w:t xml:space="preserve"> </w:t>
@@ -1315,29 +1064,8 @@
     </w:p>
     <w:p/>
     <w:p>
-      <w:proofErr w:type="gramStart"/>
-      <w:r>
-        <w:t xml:space="preserve">{{ </w:t>
-      </w:r>
-      <w:proofErr w:type="spellStart"/>
-      <w:r>
-        <w:t>customer</w:t>
-      </w:r>
-      <w:proofErr w:type="gramEnd"/>
-      <w:r>
-        <w:t>_</w:t>
-      </w:r>
-      <w:proofErr w:type="gramStart"/>
-      <w:r>
-        <w:t>name</w:t>
-      </w:r>
-      <w:proofErr w:type="spellEnd"/>
-      <w:r>
-        <w:t xml:space="preserve"> }</w:t>
-      </w:r>
-      <w:proofErr w:type="gramEnd"/>
-      <w:r>
-        <w:t>}</w:t>
+      <w:r>
+        <w:t>{{ customer_name }}</w:t>
       </w:r>
       <w:r>
         <w:t xml:space="preserve"> have undergone a Security Maturity Assessment completed by Planet IT.  This comprehensive assessment of the </w:t>
@@ -1345,29 +1073,8 @@
       <w:r>
         <w:t xml:space="preserve">current security implementation of </w:t>
       </w:r>
-      <w:proofErr w:type="gramStart"/>
-      <w:r>
-        <w:t xml:space="preserve">{{ </w:t>
-      </w:r>
-      <w:proofErr w:type="spellStart"/>
-      <w:r>
-        <w:t>customer</w:t>
-      </w:r>
-      <w:proofErr w:type="gramEnd"/>
-      <w:r>
-        <w:t>_</w:t>
-      </w:r>
-      <w:proofErr w:type="gramStart"/>
-      <w:r>
-        <w:t>name</w:t>
-      </w:r>
-      <w:proofErr w:type="spellEnd"/>
-      <w:r>
-        <w:t xml:space="preserve"> }</w:t>
-      </w:r>
-      <w:proofErr w:type="gramEnd"/>
-      <w:r>
-        <w:t>}</w:t>
+      <w:r>
+        <w:t>{{ customer_name }}</w:t>
       </w:r>
       <w:r>
         <w:t xml:space="preserve"> focused on assessing the security maturity </w:t>
@@ -1375,29 +1082,8 @@
       <w:r>
         <w:t xml:space="preserve">of the systems, solutions and culture in place at </w:t>
       </w:r>
-      <w:proofErr w:type="gramStart"/>
-      <w:r>
-        <w:t xml:space="preserve">{{ </w:t>
-      </w:r>
-      <w:proofErr w:type="spellStart"/>
-      <w:r>
-        <w:t>customer</w:t>
-      </w:r>
-      <w:proofErr w:type="gramEnd"/>
-      <w:r>
-        <w:t>_</w:t>
-      </w:r>
-      <w:proofErr w:type="gramStart"/>
-      <w:r>
-        <w:t>name</w:t>
-      </w:r>
-      <w:proofErr w:type="spellEnd"/>
-      <w:r>
-        <w:t xml:space="preserve"> }</w:t>
-      </w:r>
-      <w:proofErr w:type="gramEnd"/>
-      <w:r>
-        <w:t>}</w:t>
+      <w:r>
+        <w:t>{{ customer_name }}</w:t>
       </w:r>
       <w:r>
         <w:t>.</w:t>
@@ -1614,29 +1300,8 @@
       <w:r>
         <w:t xml:space="preserve">estimated security maturity in place at </w:t>
       </w:r>
-      <w:proofErr w:type="gramStart"/>
-      <w:r>
-        <w:t xml:space="preserve">{{ </w:t>
-      </w:r>
-      <w:proofErr w:type="spellStart"/>
-      <w:r>
-        <w:t>customer</w:t>
-      </w:r>
-      <w:proofErr w:type="gramEnd"/>
-      <w:r>
-        <w:t>_</w:t>
-      </w:r>
-      <w:proofErr w:type="gramStart"/>
-      <w:r>
-        <w:t>name</w:t>
-      </w:r>
-      <w:proofErr w:type="spellEnd"/>
-      <w:r>
-        <w:t xml:space="preserve"> }</w:t>
-      </w:r>
-      <w:proofErr w:type="gramEnd"/>
-      <w:r>
-        <w:t>}</w:t>
+      <w:r>
+        <w:t>{{ customer_name }}</w:t>
       </w:r>
       <w:r>
         <w:t xml:space="preserve">, </w:t>
@@ -1650,29 +1315,8 @@
       <w:r>
         <w:t xml:space="preserve">and culture at </w:t>
       </w:r>
-      <w:proofErr w:type="gramStart"/>
-      <w:r>
-        <w:t xml:space="preserve">{{ </w:t>
-      </w:r>
-      <w:proofErr w:type="spellStart"/>
-      <w:r>
-        <w:t>customer</w:t>
-      </w:r>
-      <w:proofErr w:type="gramEnd"/>
-      <w:r>
-        <w:t>_</w:t>
-      </w:r>
-      <w:proofErr w:type="gramStart"/>
-      <w:r>
-        <w:t>name</w:t>
-      </w:r>
-      <w:proofErr w:type="spellEnd"/>
-      <w:r>
-        <w:t xml:space="preserve"> }</w:t>
-      </w:r>
-      <w:proofErr w:type="gramEnd"/>
-      <w:r>
-        <w:t>}</w:t>
+      <w:r>
+        <w:t>{{ customer_name }}</w:t>
       </w:r>
       <w:r>
         <w:t>.</w:t>
@@ -1882,15 +1526,7 @@
           </w:tcPr>
           <w:p>
             <w:r>
-              <w:t xml:space="preserve">{%tr for ki in </w:t>
-            </w:r>
-            <w:proofErr w:type="spellStart"/>
-            <w:r>
-              <w:t>adjudicated_known_issues</w:t>
-            </w:r>
-            <w:proofErr w:type="spellEnd"/>
-            <w:r>
-              <w:t xml:space="preserve"> %}</w:t>
+              <w:t>{%tr for ki in adjudicated_known_issues %}</w:t>
             </w:r>
           </w:p>
         </w:tc>
@@ -1946,46 +1582,9 @@
             <w:hideMark/>
           </w:tcPr>
           <w:p>
-            <w:proofErr w:type="gramStart"/>
             <w:r>
               <w:lastRenderedPageBreak/>
-              <w:t xml:space="preserve">{{ </w:t>
-            </w:r>
-            <w:proofErr w:type="spellStart"/>
-            <w:r>
-              <w:t>loop</w:t>
-            </w:r>
-            <w:proofErr w:type="gramEnd"/>
-            <w:r>
-              <w:t>.</w:t>
-            </w:r>
-            <w:proofErr w:type="gramStart"/>
-            <w:r>
-              <w:t>index</w:t>
-            </w:r>
-            <w:proofErr w:type="spellEnd"/>
-            <w:r>
-              <w:t xml:space="preserve"> }</w:t>
-            </w:r>
-            <w:proofErr w:type="gramEnd"/>
-            <w:r>
-              <w:t xml:space="preserve">}. </w:t>
-            </w:r>
-            <w:proofErr w:type="gramStart"/>
-            <w:r>
-              <w:t xml:space="preserve">{{ </w:t>
-            </w:r>
-            <w:proofErr w:type="spellStart"/>
-            <w:r>
-              <w:t>ki</w:t>
-            </w:r>
-            <w:proofErr w:type="gramEnd"/>
-            <w:r>
-              <w:t>.issue_text</w:t>
-            </w:r>
-            <w:proofErr w:type="spellEnd"/>
-            <w:r>
-              <w:t xml:space="preserve"> }}</w:t>
+              <w:t>{{ loop.index }}. {{ ki.issue_text }}</w:t>
             </w:r>
           </w:p>
         </w:tc>
@@ -2007,21 +1606,8 @@
             <w:hideMark/>
           </w:tcPr>
           <w:p>
-            <w:proofErr w:type="gramStart"/>
-            <w:r>
-              <w:t xml:space="preserve">{{ </w:t>
-            </w:r>
-            <w:proofErr w:type="spellStart"/>
-            <w:r>
-              <w:t>ki.our</w:t>
-            </w:r>
-            <w:proofErr w:type="gramEnd"/>
-            <w:r>
-              <w:t>_ruling</w:t>
-            </w:r>
-            <w:proofErr w:type="spellEnd"/>
-            <w:r>
-              <w:t xml:space="preserve"> }}</w:t>
+            <w:r>
+              <w:t>{{ ki.our_ruling }}</w:t>
             </w:r>
           </w:p>
         </w:tc>
@@ -2043,21 +1629,8 @@
             <w:hideMark/>
           </w:tcPr>
           <w:p>
-            <w:proofErr w:type="gramStart"/>
-            <w:r>
-              <w:t xml:space="preserve">{{ </w:t>
-            </w:r>
-            <w:proofErr w:type="spellStart"/>
-            <w:r>
-              <w:t>ki</w:t>
-            </w:r>
-            <w:proofErr w:type="gramEnd"/>
-            <w:r>
-              <w:t>.rationale</w:t>
-            </w:r>
-            <w:proofErr w:type="spellEnd"/>
-            <w:r>
-              <w:t xml:space="preserve"> }}</w:t>
+            <w:r>
+              <w:t>{{ ki.rationale }}</w:t>
             </w:r>
           </w:p>
         </w:tc>
@@ -2080,74 +1653,11 @@
           </w:tcPr>
           <w:p>
             <w:r>
-              <w:t xml:space="preserve">{% for a in </w:t>
-            </w:r>
-            <w:proofErr w:type="spellStart"/>
-            <w:proofErr w:type="gramStart"/>
-            <w:r>
-              <w:t>ki.suggested</w:t>
-            </w:r>
-            <w:proofErr w:type="gramEnd"/>
-            <w:r>
-              <w:t>_remediations</w:t>
-            </w:r>
-            <w:proofErr w:type="spellEnd"/>
-            <w:r>
-              <w:t xml:space="preserve"> </w:t>
-            </w:r>
-            <w:proofErr w:type="gramStart"/>
-            <w:r>
-              <w:t>%}•</w:t>
-            </w:r>
-            <w:proofErr w:type="gramEnd"/>
-            <w:r>
-              <w:t xml:space="preserve"> </w:t>
-            </w:r>
-            <w:proofErr w:type="gramStart"/>
-            <w:r>
-              <w:t>{{ a</w:t>
-            </w:r>
-            <w:proofErr w:type="gramEnd"/>
-            <w:r>
-              <w:t xml:space="preserve"> </w:t>
-            </w:r>
-            <w:proofErr w:type="gramStart"/>
-            <w:r>
-              <w:t>}}{</w:t>
-            </w:r>
-            <w:proofErr w:type="gramEnd"/>
-            <w:r>
-              <w:t xml:space="preserve">% if not </w:t>
-            </w:r>
-            <w:proofErr w:type="spellStart"/>
-            <w:proofErr w:type="gramStart"/>
-            <w:r>
-              <w:t>loop.last</w:t>
-            </w:r>
-            <w:proofErr w:type="spellEnd"/>
-            <w:proofErr w:type="gramEnd"/>
-            <w:r>
-              <w:t xml:space="preserve"> %}</w:t>
+              <w:t>{% for a in ki.suggested_remediations %}• {{ a }}{% if not loop.last %}</w:t>
             </w:r>
             <w:r>
               <w:br/>
-              <w:t xml:space="preserve">{% endif </w:t>
-            </w:r>
-            <w:proofErr w:type="gramStart"/>
-            <w:r>
-              <w:t>%}{</w:t>
-            </w:r>
-            <w:proofErr w:type="gramEnd"/>
-            <w:r>
-              <w:t xml:space="preserve">% </w:t>
-            </w:r>
-            <w:proofErr w:type="spellStart"/>
-            <w:r>
-              <w:t>endfor</w:t>
-            </w:r>
-            <w:proofErr w:type="spellEnd"/>
-            <w:r>
-              <w:t xml:space="preserve"> %}</w:t>
+              <w:t>{% endif %}{% endfor %}</w:t>
             </w:r>
           </w:p>
         </w:tc>
@@ -2170,74 +1680,11 @@
           </w:tcPr>
           <w:p>
             <w:r>
-              <w:t xml:space="preserve">{% for s in </w:t>
-            </w:r>
-            <w:proofErr w:type="spellStart"/>
-            <w:proofErr w:type="gramStart"/>
-            <w:r>
-              <w:t>ki.aligned</w:t>
-            </w:r>
-            <w:proofErr w:type="gramEnd"/>
-            <w:r>
-              <w:t>_solutions</w:t>
-            </w:r>
-            <w:proofErr w:type="spellEnd"/>
-            <w:r>
-              <w:t xml:space="preserve"> </w:t>
-            </w:r>
-            <w:proofErr w:type="gramStart"/>
-            <w:r>
-              <w:t>%}•</w:t>
-            </w:r>
-            <w:proofErr w:type="gramEnd"/>
-            <w:r>
-              <w:t xml:space="preserve"> </w:t>
-            </w:r>
-            <w:proofErr w:type="gramStart"/>
-            <w:r>
-              <w:t>{{ s</w:t>
-            </w:r>
-            <w:proofErr w:type="gramEnd"/>
-            <w:r>
-              <w:t xml:space="preserve"> </w:t>
-            </w:r>
-            <w:proofErr w:type="gramStart"/>
-            <w:r>
-              <w:t>}}{</w:t>
-            </w:r>
-            <w:proofErr w:type="gramEnd"/>
-            <w:r>
-              <w:t xml:space="preserve">% if not </w:t>
-            </w:r>
-            <w:proofErr w:type="spellStart"/>
-            <w:proofErr w:type="gramStart"/>
-            <w:r>
-              <w:t>loop.last</w:t>
-            </w:r>
-            <w:proofErr w:type="spellEnd"/>
-            <w:proofErr w:type="gramEnd"/>
-            <w:r>
-              <w:t xml:space="preserve"> %}</w:t>
+              <w:t>{% for s in ki.aligned_solutions %}• {{ s }}{% if not loop.last %}</w:t>
             </w:r>
             <w:r>
               <w:br/>
-              <w:t xml:space="preserve">{% endif </w:t>
-            </w:r>
-            <w:proofErr w:type="gramStart"/>
-            <w:r>
-              <w:t>%}{</w:t>
-            </w:r>
-            <w:proofErr w:type="gramEnd"/>
-            <w:r>
-              <w:t xml:space="preserve">% </w:t>
-            </w:r>
-            <w:proofErr w:type="spellStart"/>
-            <w:r>
-              <w:t>endfor</w:t>
-            </w:r>
-            <w:proofErr w:type="spellEnd"/>
-            <w:r>
-              <w:t xml:space="preserve"> %}</w:t>
+              <w:t>{% endif %}{% endfor %}</w:t>
             </w:r>
           </w:p>
         </w:tc>
@@ -2251,15 +1698,7 @@
           </w:tcPr>
           <w:p>
             <w:r>
-              <w:t xml:space="preserve">{%tr </w:t>
-            </w:r>
-            <w:proofErr w:type="spellStart"/>
-            <w:r>
-              <w:t>endfor</w:t>
-            </w:r>
-            <w:proofErr w:type="spellEnd"/>
-            <w:r>
-              <w:t xml:space="preserve"> %}</w:t>
+              <w:t>{%tr endfor %}</w:t>
             </w:r>
           </w:p>
         </w:tc>
@@ -2311,113 +1750,24 @@
       <w:pPr>
         <w:pStyle w:val="Heading2"/>
       </w:pPr>
-      <w:proofErr w:type="gramStart"/>
-      <w:r>
-        <w:t xml:space="preserve">{{ </w:t>
-      </w:r>
-      <w:proofErr w:type="spellStart"/>
-      <w:r>
-        <w:t>security</w:t>
-      </w:r>
-      <w:proofErr w:type="gramEnd"/>
-      <w:r>
-        <w:t>_</w:t>
-      </w:r>
-      <w:proofErr w:type="gramStart"/>
-      <w:r>
-        <w:t>rating.score</w:t>
-      </w:r>
-      <w:proofErr w:type="gramEnd"/>
-      <w:r>
-        <w:t>_</w:t>
-      </w:r>
-      <w:proofErr w:type="gramStart"/>
-      <w:r>
-        <w:t>statement</w:t>
-      </w:r>
-      <w:proofErr w:type="spellEnd"/>
-      <w:r>
-        <w:t xml:space="preserve"> }</w:t>
-      </w:r>
-      <w:proofErr w:type="gramEnd"/>
-      <w:r>
-        <w:t>}</w:t>
+      <w:r>
+        <w:t>{{ security_rating.score_statement }}</w:t>
       </w:r>
     </w:p>
     <w:p>
-      <w:proofErr w:type="gramStart"/>
-      <w:r>
-        <w:t xml:space="preserve">{{ </w:t>
-      </w:r>
-      <w:proofErr w:type="spellStart"/>
-      <w:r>
-        <w:t>security</w:t>
-      </w:r>
-      <w:proofErr w:type="gramEnd"/>
-      <w:r>
-        <w:t>_</w:t>
-      </w:r>
-      <w:proofErr w:type="gramStart"/>
-      <w:r>
-        <w:t>rating.caveat</w:t>
-      </w:r>
-      <w:proofErr w:type="spellEnd"/>
-      <w:proofErr w:type="gramEnd"/>
-      <w:r>
-        <w:t xml:space="preserve"> }}</w:t>
+      <w:r>
+        <w:t>{{ security_rating.caveat }}</w:t>
       </w:r>
     </w:p>
     <w:p/>
     <w:p>
-      <w:proofErr w:type="gramStart"/>
-      <w:r>
-        <w:t xml:space="preserve">{{ </w:t>
-      </w:r>
-      <w:proofErr w:type="spellStart"/>
-      <w:r>
-        <w:t>maturity</w:t>
-      </w:r>
-      <w:proofErr w:type="gramEnd"/>
-      <w:r>
-        <w:t>_</w:t>
-      </w:r>
-      <w:proofErr w:type="gramStart"/>
-      <w:r>
-        <w:t>gauge</w:t>
-      </w:r>
-      <w:proofErr w:type="spellEnd"/>
-      <w:r>
-        <w:t xml:space="preserve"> }</w:t>
-      </w:r>
-      <w:proofErr w:type="gramEnd"/>
-      <w:r>
-        <w:t>}</w:t>
+      <w:r>
+        <w:t>{{ maturity_gauge }}</w:t>
       </w:r>
     </w:p>
     <w:p>
-      <w:proofErr w:type="gramStart"/>
-      <w:r>
-        <w:t xml:space="preserve">{{ </w:t>
-      </w:r>
-      <w:proofErr w:type="spellStart"/>
-      <w:r>
-        <w:t>maturity</w:t>
-      </w:r>
-      <w:proofErr w:type="gramEnd"/>
-      <w:r>
-        <w:t>_gauge_</w:t>
-      </w:r>
-      <w:proofErr w:type="gramStart"/>
-      <w:r>
-        <w:t>caption</w:t>
-      </w:r>
-      <w:proofErr w:type="spellEnd"/>
-      <w:r>
-        <w:t xml:space="preserve"> }</w:t>
-      </w:r>
-      <w:proofErr w:type="gramEnd"/>
-      <w:r>
-        <w:t>}</w:t>
+      <w:r>
+        <w:t>{{ maturity_gauge_caption }}</w:t>
       </w:r>
     </w:p>
     <w:p/>
@@ -2563,37 +1913,8 @@
             <w:hideMark/>
           </w:tcPr>
           <w:p>
-            <w:proofErr w:type="gramStart"/>
-            <w:r>
-              <w:t xml:space="preserve">{{ </w:t>
-            </w:r>
-            <w:proofErr w:type="spellStart"/>
-            <w:r>
-              <w:t>security</w:t>
-            </w:r>
-            <w:proofErr w:type="gramEnd"/>
-            <w:r>
-              <w:t>_</w:t>
-            </w:r>
-            <w:proofErr w:type="gramStart"/>
-            <w:r>
-              <w:t>rating.snapshot</w:t>
-            </w:r>
-            <w:proofErr w:type="gramEnd"/>
-            <w:r>
-              <w:t>.overall_</w:t>
-            </w:r>
-            <w:proofErr w:type="gramStart"/>
-            <w:r>
-              <w:t>score</w:t>
-            </w:r>
-            <w:proofErr w:type="spellEnd"/>
-            <w:r>
-              <w:t xml:space="preserve"> }}/</w:t>
-            </w:r>
-            <w:proofErr w:type="gramEnd"/>
-            <w:r>
-              <w:t>100</w:t>
+            <w:r>
+              <w:t>{{ security_rating.snapshot.overall_score }}/100</w:t>
             </w:r>
           </w:p>
         </w:tc>
@@ -2646,29 +1967,8 @@
             <w:hideMark/>
           </w:tcPr>
           <w:p>
-            <w:proofErr w:type="gramStart"/>
-            <w:r>
-              <w:t xml:space="preserve">{{ </w:t>
-            </w:r>
-            <w:proofErr w:type="spellStart"/>
-            <w:r>
-              <w:t>security</w:t>
-            </w:r>
-            <w:proofErr w:type="gramEnd"/>
-            <w:r>
-              <w:t>_</w:t>
-            </w:r>
-            <w:proofErr w:type="gramStart"/>
-            <w:r>
-              <w:t>rating.snapshot</w:t>
-            </w:r>
-            <w:proofErr w:type="gramEnd"/>
-            <w:r>
-              <w:t>.maturity_rating</w:t>
-            </w:r>
-            <w:proofErr w:type="spellEnd"/>
-            <w:r>
-              <w:t xml:space="preserve"> }}</w:t>
+            <w:r>
+              <w:t>{{ security_rating.snapshot.maturity_rating }}</w:t>
             </w:r>
           </w:p>
         </w:tc>
@@ -2721,29 +2021,8 @@
             <w:hideMark/>
           </w:tcPr>
           <w:p>
-            <w:proofErr w:type="gramStart"/>
-            <w:r>
-              <w:t xml:space="preserve">{{ </w:t>
-            </w:r>
-            <w:proofErr w:type="spellStart"/>
-            <w:r>
-              <w:t>security</w:t>
-            </w:r>
-            <w:proofErr w:type="gramEnd"/>
-            <w:r>
-              <w:t>_</w:t>
-            </w:r>
-            <w:proofErr w:type="gramStart"/>
-            <w:r>
-              <w:t>rating.snapshot</w:t>
-            </w:r>
-            <w:proofErr w:type="gramEnd"/>
-            <w:r>
-              <w:t>.direction_of_travel</w:t>
-            </w:r>
-            <w:proofErr w:type="spellEnd"/>
-            <w:r>
-              <w:t xml:space="preserve"> }}</w:t>
+            <w:r>
+              <w:t>{{ security_rating.snapshot.direction_of_travel }}</w:t>
             </w:r>
           </w:p>
         </w:tc>
@@ -2796,37 +2075,8 @@
             <w:hideMark/>
           </w:tcPr>
           <w:p>
-            <w:proofErr w:type="gramStart"/>
-            <w:r>
-              <w:t xml:space="preserve">{{ </w:t>
-            </w:r>
-            <w:proofErr w:type="spellStart"/>
-            <w:r>
-              <w:t>security</w:t>
-            </w:r>
-            <w:proofErr w:type="gramEnd"/>
-            <w:r>
-              <w:t>_</w:t>
-            </w:r>
-            <w:proofErr w:type="gramStart"/>
-            <w:r>
-              <w:t>rating.snapshot</w:t>
-            </w:r>
-            <w:proofErr w:type="gramEnd"/>
-            <w:r>
-              <w:t>.primary_strengths|</w:t>
-            </w:r>
-            <w:proofErr w:type="gramStart"/>
-            <w:r>
-              <w:t>join</w:t>
-            </w:r>
-            <w:proofErr w:type="spellEnd"/>
-            <w:r>
-              <w:t>(</w:t>
-            </w:r>
-            <w:proofErr w:type="gramEnd"/>
-            <w:r>
-              <w:t>', ') }}</w:t>
+            <w:r>
+              <w:t>{{ security_rating.snapshot.primary_strengths|join(', ') }}</w:t>
             </w:r>
           </w:p>
         </w:tc>
@@ -2879,37 +2129,8 @@
             <w:hideMark/>
           </w:tcPr>
           <w:p>
-            <w:proofErr w:type="gramStart"/>
-            <w:r>
-              <w:t xml:space="preserve">{{ </w:t>
-            </w:r>
-            <w:proofErr w:type="spellStart"/>
-            <w:r>
-              <w:t>security</w:t>
-            </w:r>
-            <w:proofErr w:type="gramEnd"/>
-            <w:r>
-              <w:t>_</w:t>
-            </w:r>
-            <w:proofErr w:type="gramStart"/>
-            <w:r>
-              <w:t>rating.snapshot</w:t>
-            </w:r>
-            <w:proofErr w:type="gramEnd"/>
-            <w:r>
-              <w:t>.primary_gaps|</w:t>
-            </w:r>
-            <w:proofErr w:type="gramStart"/>
-            <w:r>
-              <w:t>join</w:t>
-            </w:r>
-            <w:proofErr w:type="spellEnd"/>
-            <w:r>
-              <w:t>(</w:t>
-            </w:r>
-            <w:proofErr w:type="gramEnd"/>
-            <w:r>
-              <w:t>', ') }}</w:t>
+            <w:r>
+              <w:t>{{ security_rating.snapshot.primary_gaps|join(', ') }}</w:t>
             </w:r>
           </w:p>
         </w:tc>
@@ -2962,29 +2183,8 @@
             <w:hideMark/>
           </w:tcPr>
           <w:p>
-            <w:proofErr w:type="gramStart"/>
-            <w:r>
-              <w:t xml:space="preserve">{{ </w:t>
-            </w:r>
-            <w:proofErr w:type="spellStart"/>
-            <w:r>
-              <w:t>security</w:t>
-            </w:r>
-            <w:proofErr w:type="gramEnd"/>
-            <w:r>
-              <w:t>_</w:t>
-            </w:r>
-            <w:proofErr w:type="gramStart"/>
-            <w:r>
-              <w:t>rating.snapshot</w:t>
-            </w:r>
-            <w:proofErr w:type="gramEnd"/>
-            <w:r>
-              <w:t>.board_level_takeaway</w:t>
-            </w:r>
-            <w:proofErr w:type="spellEnd"/>
-            <w:r>
-              <w:t xml:space="preserve"> }}</w:t>
+            <w:r>
+              <w:t>{{ security_rating.snapshot.board_level_takeaway }}</w:t>
             </w:r>
           </w:p>
         </w:tc>
@@ -3229,23 +2429,7 @@
           </w:tcPr>
           <w:p>
             <w:r>
-              <w:t xml:space="preserve">{%tr for it in </w:t>
-            </w:r>
-            <w:proofErr w:type="spellStart"/>
-            <w:r>
-              <w:t>security_</w:t>
-            </w:r>
-            <w:proofErr w:type="gramStart"/>
-            <w:r>
-              <w:t>rating.weighted</w:t>
-            </w:r>
-            <w:proofErr w:type="gramEnd"/>
-            <w:r>
-              <w:t>_areas</w:t>
-            </w:r>
-            <w:proofErr w:type="spellEnd"/>
-            <w:r>
-              <w:t xml:space="preserve"> %}</w:t>
+              <w:t>{%tr for it in security_rating.weighted_areas %}</w:t>
             </w:r>
           </w:p>
         </w:tc>
@@ -3301,21 +2485,8 @@
             <w:hideMark/>
           </w:tcPr>
           <w:p>
-            <w:proofErr w:type="gramStart"/>
-            <w:r>
-              <w:t xml:space="preserve">{{ </w:t>
-            </w:r>
-            <w:proofErr w:type="spellStart"/>
-            <w:r>
-              <w:t>it</w:t>
-            </w:r>
-            <w:proofErr w:type="gramEnd"/>
-            <w:r>
-              <w:t>.area</w:t>
-            </w:r>
-            <w:proofErr w:type="spellEnd"/>
-            <w:r>
-              <w:t xml:space="preserve"> }}</w:t>
+            <w:r>
+              <w:t>{{ it.area }}</w:t>
             </w:r>
           </w:p>
         </w:tc>
@@ -3337,27 +2508,9 @@
             <w:hideMark/>
           </w:tcPr>
           <w:p>
-            <w:proofErr w:type="gramStart"/>
-            <w:r>
-              <w:t xml:space="preserve">{{ </w:t>
-            </w:r>
-            <w:proofErr w:type="spellStart"/>
-            <w:r>
-              <w:t>it</w:t>
-            </w:r>
-            <w:proofErr w:type="gramEnd"/>
-            <w:r>
-              <w:t>.weight_</w:t>
-            </w:r>
-            <w:proofErr w:type="gramStart"/>
-            <w:r>
-              <w:t>percent</w:t>
-            </w:r>
-            <w:proofErr w:type="spellEnd"/>
-            <w:r>
-              <w:t xml:space="preserve"> }}%</w:t>
-            </w:r>
-            <w:proofErr w:type="gramEnd"/>
+            <w:r>
+              <w:t>{{ it.weight_percent }}%</w:t>
+            </w:r>
           </w:p>
         </w:tc>
         <w:tc>
@@ -3378,21 +2531,8 @@
             <w:hideMark/>
           </w:tcPr>
           <w:p>
-            <w:proofErr w:type="gramStart"/>
-            <w:r>
-              <w:t xml:space="preserve">{{ </w:t>
-            </w:r>
-            <w:proofErr w:type="spellStart"/>
-            <w:r>
-              <w:t>it</w:t>
-            </w:r>
-            <w:proofErr w:type="gramEnd"/>
-            <w:r>
-              <w:t>.indicative_score</w:t>
-            </w:r>
-            <w:proofErr w:type="spellEnd"/>
-            <w:r>
-              <w:t xml:space="preserve"> }}</w:t>
+            <w:r>
+              <w:t>{{ it.indicative_score }}</w:t>
             </w:r>
           </w:p>
         </w:tc>
@@ -3414,27 +2554,9 @@
             <w:hideMark/>
           </w:tcPr>
           <w:p>
-            <w:proofErr w:type="gramStart"/>
-            <w:r>
-              <w:t xml:space="preserve">{{ </w:t>
-            </w:r>
-            <w:proofErr w:type="spellStart"/>
-            <w:r>
-              <w:t>it</w:t>
-            </w:r>
-            <w:proofErr w:type="gramEnd"/>
-            <w:r>
-              <w:t>.weighted_</w:t>
-            </w:r>
-            <w:proofErr w:type="gramStart"/>
-            <w:r>
-              <w:t>contribution</w:t>
-            </w:r>
-            <w:proofErr w:type="spellEnd"/>
-            <w:r>
-              <w:t xml:space="preserve"> }}%</w:t>
-            </w:r>
-            <w:proofErr w:type="gramEnd"/>
+            <w:r>
+              <w:t>{{ it.weighted_contribution }}%</w:t>
+            </w:r>
           </w:p>
         </w:tc>
         <w:tc>
@@ -3455,21 +2577,8 @@
             <w:hideMark/>
           </w:tcPr>
           <w:p>
-            <w:proofErr w:type="gramStart"/>
-            <w:r>
-              <w:t xml:space="preserve">{{ </w:t>
-            </w:r>
-            <w:proofErr w:type="spellStart"/>
-            <w:r>
-              <w:t>it</w:t>
-            </w:r>
-            <w:proofErr w:type="gramEnd"/>
-            <w:r>
-              <w:t>.rationale</w:t>
-            </w:r>
-            <w:proofErr w:type="spellEnd"/>
-            <w:r>
-              <w:t xml:space="preserve"> }}</w:t>
+            <w:r>
+              <w:t>{{ it.rationale }}</w:t>
             </w:r>
           </w:p>
         </w:tc>
@@ -3483,15 +2592,7 @@
           </w:tcPr>
           <w:p>
             <w:r>
-              <w:t xml:space="preserve">{%tr </w:t>
-            </w:r>
-            <w:proofErr w:type="spellStart"/>
-            <w:r>
-              <w:t>endfor</w:t>
-            </w:r>
-            <w:proofErr w:type="spellEnd"/>
-            <w:r>
-              <w:t xml:space="preserve"> %}</w:t>
+              <w:t>{%tr endfor %}</w:t>
             </w:r>
           </w:p>
         </w:tc>
@@ -3672,23 +2773,7 @@
           </w:tcPr>
           <w:p>
             <w:r>
-              <w:t xml:space="preserve">{%tr for b in </w:t>
-            </w:r>
-            <w:proofErr w:type="spellStart"/>
-            <w:r>
-              <w:t>security_</w:t>
-            </w:r>
-            <w:proofErr w:type="gramStart"/>
-            <w:r>
-              <w:t>rating.maturity</w:t>
-            </w:r>
-            <w:proofErr w:type="gramEnd"/>
-            <w:r>
-              <w:t>_bands</w:t>
-            </w:r>
-            <w:proofErr w:type="spellEnd"/>
-            <w:r>
-              <w:t xml:space="preserve"> %}</w:t>
+              <w:t>{%tr for b in security_rating.maturity_bands %}</w:t>
             </w:r>
           </w:p>
         </w:tc>
@@ -3728,21 +2813,8 @@
             <w:hideMark/>
           </w:tcPr>
           <w:p>
-            <w:proofErr w:type="gramStart"/>
-            <w:r>
-              <w:t xml:space="preserve">{{ </w:t>
-            </w:r>
-            <w:proofErr w:type="spellStart"/>
-            <w:r>
-              <w:t>b</w:t>
-            </w:r>
-            <w:proofErr w:type="gramEnd"/>
-            <w:r>
-              <w:t>.score_range</w:t>
-            </w:r>
-            <w:proofErr w:type="spellEnd"/>
-            <w:r>
-              <w:t xml:space="preserve"> }}</w:t>
+            <w:r>
+              <w:t>{{ b.score_range }}</w:t>
             </w:r>
           </w:p>
         </w:tc>
@@ -3764,21 +2836,8 @@
             <w:hideMark/>
           </w:tcPr>
           <w:p>
-            <w:proofErr w:type="gramStart"/>
-            <w:r>
-              <w:t xml:space="preserve">{{ </w:t>
-            </w:r>
-            <w:proofErr w:type="spellStart"/>
-            <w:r>
-              <w:t>b</w:t>
-            </w:r>
-            <w:proofErr w:type="gramEnd"/>
-            <w:r>
-              <w:t>.rating</w:t>
-            </w:r>
-            <w:proofErr w:type="spellEnd"/>
-            <w:r>
-              <w:t xml:space="preserve"> }}</w:t>
+            <w:r>
+              <w:t>{{ b.rating }}</w:t>
             </w:r>
           </w:p>
         </w:tc>
@@ -3800,21 +2859,8 @@
             <w:hideMark/>
           </w:tcPr>
           <w:p>
-            <w:proofErr w:type="gramStart"/>
-            <w:r>
-              <w:t xml:space="preserve">{{ </w:t>
-            </w:r>
-            <w:proofErr w:type="spellStart"/>
-            <w:r>
-              <w:t>b</w:t>
-            </w:r>
-            <w:proofErr w:type="gramEnd"/>
-            <w:r>
-              <w:t>.meaning</w:t>
-            </w:r>
-            <w:proofErr w:type="spellEnd"/>
-            <w:r>
-              <w:t xml:space="preserve"> }}</w:t>
+            <w:r>
+              <w:t>{{ b.meaning }}</w:t>
             </w:r>
           </w:p>
         </w:tc>
@@ -3828,15 +2874,7 @@
           </w:tcPr>
           <w:p>
             <w:r>
-              <w:t xml:space="preserve">{%tr </w:t>
-            </w:r>
-            <w:proofErr w:type="spellStart"/>
-            <w:r>
-              <w:t>endfor</w:t>
-            </w:r>
-            <w:proofErr w:type="spellEnd"/>
-            <w:r>
-              <w:t xml:space="preserve"> %}</w:t>
+              <w:t>{%tr endfor %}</w:t>
             </w:r>
           </w:p>
         </w:tc>
@@ -3860,37 +2898,8 @@
     </w:tbl>
     <w:p/>
     <w:p>
-      <w:proofErr w:type="gramStart"/>
-      <w:r>
-        <w:t xml:space="preserve">{{ </w:t>
-      </w:r>
-      <w:proofErr w:type="spellStart"/>
-      <w:r>
-        <w:t>security</w:t>
-      </w:r>
-      <w:proofErr w:type="gramEnd"/>
-      <w:r>
-        <w:t>_</w:t>
-      </w:r>
-      <w:proofErr w:type="gramStart"/>
-      <w:r>
-        <w:t>rating.executive</w:t>
-      </w:r>
-      <w:proofErr w:type="gramEnd"/>
-      <w:r>
-        <w:t>_</w:t>
-      </w:r>
-      <w:proofErr w:type="gramStart"/>
-      <w:r>
-        <w:t>interpretation</w:t>
-      </w:r>
-      <w:proofErr w:type="spellEnd"/>
-      <w:r>
-        <w:t xml:space="preserve"> }</w:t>
-      </w:r>
-      <w:proofErr w:type="gramEnd"/>
-      <w:r>
-        <w:t>}</w:t>
+      <w:r>
+        <w:t>{{ security_rating.executive_interpretation }}</w:t>
       </w:r>
     </w:p>
     <w:p>
@@ -3911,29 +2920,8 @@
       </w:r>
     </w:p>
     <w:p>
-      <w:proofErr w:type="gramStart"/>
-      <w:r>
-        <w:t xml:space="preserve">{{ </w:t>
-      </w:r>
-      <w:proofErr w:type="spellStart"/>
-      <w:r>
-        <w:t>board</w:t>
-      </w:r>
-      <w:proofErr w:type="gramEnd"/>
-      <w:r>
-        <w:t>_</w:t>
-      </w:r>
-      <w:proofErr w:type="gramStart"/>
-      <w:r>
-        <w:t>summary</w:t>
-      </w:r>
-      <w:proofErr w:type="spellEnd"/>
-      <w:r>
-        <w:t xml:space="preserve"> }</w:t>
-      </w:r>
-      <w:proofErr w:type="gramEnd"/>
-      <w:r>
-        <w:t>}</w:t>
+      <w:r>
+        <w:t>{{ board_summary }}</w:t>
       </w:r>
     </w:p>
     <w:p>
@@ -3943,29 +2931,8 @@
           <w:lang w:eastAsia="en-GB"/>
         </w:rPr>
       </w:pPr>
-      <w:proofErr w:type="gramStart"/>
-      <w:r>
-        <w:t xml:space="preserve">{{ </w:t>
-      </w:r>
-      <w:proofErr w:type="spellStart"/>
-      <w:r>
-        <w:t>executive</w:t>
-      </w:r>
-      <w:proofErr w:type="gramEnd"/>
-      <w:r>
-        <w:t>_summary_actions_</w:t>
-      </w:r>
-      <w:proofErr w:type="gramStart"/>
-      <w:r>
-        <w:t>bullets</w:t>
-      </w:r>
-      <w:proofErr w:type="spellEnd"/>
-      <w:r>
-        <w:t xml:space="preserve"> }</w:t>
-      </w:r>
-      <w:proofErr w:type="gramEnd"/>
-      <w:r>
-        <w:t>}</w:t>
+      <w:r>
+        <w:t>{{ executive_summary_actions_bullets }}</w:t>
       </w:r>
     </w:p>
     <w:p/>
@@ -4130,15 +3097,7 @@
           </w:tcPr>
           <w:p>
             <w:r>
-              <w:t xml:space="preserve">{%tr for r in </w:t>
-            </w:r>
-            <w:proofErr w:type="spellStart"/>
-            <w:r>
-              <w:t>rag_summary</w:t>
-            </w:r>
-            <w:proofErr w:type="spellEnd"/>
-            <w:r>
-              <w:t xml:space="preserve"> %}</w:t>
+              <w:t>{%tr for r in rag_summary %}</w:t>
             </w:r>
           </w:p>
         </w:tc>
@@ -4186,51 +3145,9 @@
             <w:hideMark/>
           </w:tcPr>
           <w:p>
-            <w:proofErr w:type="gramStart"/>
-            <w:r>
-              <w:t xml:space="preserve">{{ </w:t>
-            </w:r>
-            <w:proofErr w:type="spellStart"/>
-            <w:r>
-              <w:t>r</w:t>
-            </w:r>
-            <w:proofErr w:type="gramEnd"/>
-            <w:r>
-              <w:t>.severity_</w:t>
-            </w:r>
-            <w:proofErr w:type="gramStart"/>
-            <w:r>
-              <w:t>label</w:t>
-            </w:r>
-            <w:proofErr w:type="spellEnd"/>
-            <w:r>
-              <w:t xml:space="preserve"> }</w:t>
-            </w:r>
-            <w:proofErr w:type="gramEnd"/>
-            <w:r>
-              <w:t xml:space="preserve">} </w:t>
-            </w:r>
-            <w:proofErr w:type="gramStart"/>
-            <w:r>
-              <w:t xml:space="preserve">{{ </w:t>
-            </w:r>
-            <w:proofErr w:type="spellStart"/>
-            <w:r>
-              <w:t>r</w:t>
-            </w:r>
-            <w:proofErr w:type="gramEnd"/>
-            <w:r>
-              <w:t>.severity_</w:t>
-            </w:r>
-            <w:proofErr w:type="gramStart"/>
-            <w:r>
-              <w:t>pct</w:t>
-            </w:r>
-            <w:proofErr w:type="spellEnd"/>
-            <w:r>
-              <w:t xml:space="preserve"> }}%</w:t>
-            </w:r>
-            <w:proofErr w:type="gramEnd"/>
+            <w:r>
+              <w:t>{{ r.severity_label }} {{ r.severity_pct }}%</w:t>
+            </w:r>
           </w:p>
         </w:tc>
         <w:tc>
@@ -4251,21 +3168,8 @@
             <w:hideMark/>
           </w:tcPr>
           <w:p>
-            <w:proofErr w:type="gramStart"/>
-            <w:r>
-              <w:t xml:space="preserve">{{ </w:t>
-            </w:r>
-            <w:proofErr w:type="spellStart"/>
-            <w:r>
-              <w:t>r</w:t>
-            </w:r>
-            <w:proofErr w:type="gramEnd"/>
-            <w:r>
-              <w:t>.issue_title</w:t>
-            </w:r>
-            <w:proofErr w:type="spellEnd"/>
-            <w:r>
-              <w:t xml:space="preserve"> }}</w:t>
+            <w:r>
+              <w:t>{{ r.issue_title }}</w:t>
             </w:r>
           </w:p>
         </w:tc>
@@ -4287,21 +3191,8 @@
             <w:hideMark/>
           </w:tcPr>
           <w:p>
-            <w:proofErr w:type="gramStart"/>
-            <w:r>
-              <w:t xml:space="preserve">{{ </w:t>
-            </w:r>
-            <w:proofErr w:type="spellStart"/>
-            <w:r>
-              <w:t>r</w:t>
-            </w:r>
-            <w:proofErr w:type="gramEnd"/>
-            <w:r>
-              <w:t>.business_exposure</w:t>
-            </w:r>
-            <w:proofErr w:type="spellEnd"/>
-            <w:r>
-              <w:t xml:space="preserve"> }}</w:t>
+            <w:r>
+              <w:t>{{ r.business_exposure }}</w:t>
             </w:r>
           </w:p>
         </w:tc>
@@ -4323,21 +3214,8 @@
             <w:hideMark/>
           </w:tcPr>
           <w:p>
-            <w:proofErr w:type="gramStart"/>
-            <w:r>
-              <w:t xml:space="preserve">{{ </w:t>
-            </w:r>
-            <w:proofErr w:type="spellStart"/>
-            <w:r>
-              <w:t>r</w:t>
-            </w:r>
-            <w:proofErr w:type="gramEnd"/>
-            <w:r>
-              <w:t>.priority_action</w:t>
-            </w:r>
-            <w:proofErr w:type="spellEnd"/>
-            <w:r>
-              <w:t xml:space="preserve"> }}</w:t>
+            <w:r>
+              <w:t>{{ r.priority_action }}</w:t>
             </w:r>
           </w:p>
         </w:tc>
@@ -4351,15 +3229,7 @@
           </w:tcPr>
           <w:p>
             <w:r>
-              <w:t xml:space="preserve">{%tr </w:t>
-            </w:r>
-            <w:proofErr w:type="spellStart"/>
-            <w:r>
-              <w:t>endfor</w:t>
-            </w:r>
-            <w:proofErr w:type="spellEnd"/>
-            <w:r>
-              <w:t xml:space="preserve"> %}</w:t>
+              <w:t>{%tr endfor %}</w:t>
             </w:r>
           </w:p>
         </w:tc>
@@ -4481,51 +3351,7 @@
                 <w:sz w:val="22"/>
                 <w:szCs w:val="22"/>
               </w:rPr>
-              <w:t xml:space="preserve">Why this fits </w:t>
-            </w:r>
-            <w:proofErr w:type="gramStart"/>
-            <w:r>
-              <w:rPr>
-                <w:b/>
-                <w:bCs/>
-                <w:color w:val="FFFFFF"/>
-                <w:sz w:val="22"/>
-                <w:szCs w:val="22"/>
-              </w:rPr>
-              <w:t xml:space="preserve">{{ </w:t>
-            </w:r>
-            <w:proofErr w:type="spellStart"/>
-            <w:r>
-              <w:rPr>
-                <w:b/>
-                <w:bCs/>
-                <w:color w:val="FFFFFF"/>
-                <w:sz w:val="22"/>
-                <w:szCs w:val="22"/>
-              </w:rPr>
-              <w:t>customer</w:t>
-            </w:r>
-            <w:proofErr w:type="gramEnd"/>
-            <w:r>
-              <w:rPr>
-                <w:b/>
-                <w:bCs/>
-                <w:color w:val="FFFFFF"/>
-                <w:sz w:val="22"/>
-                <w:szCs w:val="22"/>
-              </w:rPr>
-              <w:t>_name</w:t>
-            </w:r>
-            <w:proofErr w:type="spellEnd"/>
-            <w:r>
-              <w:rPr>
-                <w:b/>
-                <w:bCs/>
-                <w:color w:val="FFFFFF"/>
-                <w:sz w:val="22"/>
-                <w:szCs w:val="22"/>
-              </w:rPr>
-              <w:t xml:space="preserve"> }}</w:t>
+              <w:t>Why this fits {{ customer_name }}</w:t>
             </w:r>
           </w:p>
         </w:tc>
@@ -4571,15 +3397,7 @@
           </w:tcPr>
           <w:p>
             <w:r>
-              <w:t xml:space="preserve">{%tr for opt in </w:t>
-            </w:r>
-            <w:proofErr w:type="spellStart"/>
-            <w:r>
-              <w:t>programme_options</w:t>
-            </w:r>
-            <w:proofErr w:type="spellEnd"/>
-            <w:r>
-              <w:t xml:space="preserve"> %}</w:t>
+              <w:t>{%tr for opt in programme_options %}</w:t>
             </w:r>
           </w:p>
         </w:tc>
@@ -4619,21 +3437,8 @@
             <w:hideMark/>
           </w:tcPr>
           <w:p>
-            <w:proofErr w:type="gramStart"/>
-            <w:r>
-              <w:t xml:space="preserve">{{ </w:t>
-            </w:r>
-            <w:proofErr w:type="spellStart"/>
-            <w:r>
-              <w:t>opt</w:t>
-            </w:r>
-            <w:proofErr w:type="gramEnd"/>
-            <w:r>
-              <w:t>.solution</w:t>
-            </w:r>
-            <w:proofErr w:type="spellEnd"/>
-            <w:r>
-              <w:t xml:space="preserve"> }}</w:t>
+            <w:r>
+              <w:t>{{ opt.solution }}</w:t>
             </w:r>
           </w:p>
         </w:tc>
@@ -4655,21 +3460,8 @@
             <w:hideMark/>
           </w:tcPr>
           <w:p>
-            <w:proofErr w:type="gramStart"/>
-            <w:r>
-              <w:t xml:space="preserve">{{ </w:t>
-            </w:r>
-            <w:proofErr w:type="spellStart"/>
-            <w:r>
-              <w:t>opt.why</w:t>
-            </w:r>
-            <w:proofErr w:type="gramEnd"/>
-            <w:r>
-              <w:t>_this_fits</w:t>
-            </w:r>
-            <w:proofErr w:type="spellEnd"/>
-            <w:r>
-              <w:t xml:space="preserve"> }}</w:t>
+            <w:r>
+              <w:t>{{ opt.why_this_fits }}</w:t>
             </w:r>
           </w:p>
         </w:tc>
@@ -4691,21 +3483,8 @@
             <w:hideMark/>
           </w:tcPr>
           <w:p>
-            <w:proofErr w:type="gramStart"/>
-            <w:r>
-              <w:t xml:space="preserve">{{ </w:t>
-            </w:r>
-            <w:proofErr w:type="spellStart"/>
-            <w:r>
-              <w:t>opt</w:t>
-            </w:r>
-            <w:proofErr w:type="gramEnd"/>
-            <w:r>
-              <w:t>.cost_band</w:t>
-            </w:r>
-            <w:proofErr w:type="spellEnd"/>
-            <w:r>
-              <w:t xml:space="preserve"> }}</w:t>
+            <w:r>
+              <w:t>{{ opt.cost_band }}</w:t>
             </w:r>
           </w:p>
         </w:tc>
@@ -4719,15 +3498,7 @@
           </w:tcPr>
           <w:p>
             <w:r>
-              <w:t xml:space="preserve">{%tr </w:t>
-            </w:r>
-            <w:proofErr w:type="spellStart"/>
-            <w:r>
-              <w:t>endfor</w:t>
-            </w:r>
-            <w:proofErr w:type="spellEnd"/>
-            <w:r>
-              <w:t xml:space="preserve"> %}</w:t>
+              <w:t>{%tr endfor %}</w:t>
             </w:r>
           </w:p>
         </w:tc>
@@ -4784,7 +3555,6 @@
         </w:rPr>
         <w:t xml:space="preserve">Disclaimer: this is a fictional breach scenario leveraging threat intelligence and known threat actor activity mapped to the current technology stack and perceived security maturity of </w:t>
       </w:r>
-      <w:proofErr w:type="gramStart"/>
       <w:r>
         <w:rPr>
           <w:bCs/>
@@ -4793,53 +3563,8 @@
           <w:sz w:val="12"/>
           <w:szCs w:val="12"/>
         </w:rPr>
-        <w:t xml:space="preserve">{{ </w:t>
-      </w:r>
-      <w:proofErr w:type="spellStart"/>
-      <w:r>
-        <w:rPr>
-          <w:bCs/>
-          <w:i/>
-          <w:iCs/>
-          <w:sz w:val="12"/>
-          <w:szCs w:val="12"/>
-        </w:rPr>
-        <w:t>customer</w:t>
-      </w:r>
-      <w:proofErr w:type="gramEnd"/>
-      <w:r>
-        <w:rPr>
-          <w:bCs/>
-          <w:i/>
-          <w:iCs/>
-          <w:sz w:val="12"/>
-          <w:szCs w:val="12"/>
-        </w:rPr>
-        <w:t>_</w:t>
-      </w:r>
-      <w:proofErr w:type="gramStart"/>
-      <w:r>
-        <w:rPr>
-          <w:bCs/>
-          <w:i/>
-          <w:iCs/>
-          <w:sz w:val="12"/>
-          <w:szCs w:val="12"/>
-        </w:rPr>
-        <w:t>name</w:t>
-      </w:r>
-      <w:proofErr w:type="spellEnd"/>
-      <w:r>
-        <w:rPr>
-          <w:bCs/>
-          <w:i/>
-          <w:iCs/>
-          <w:sz w:val="12"/>
-          <w:szCs w:val="12"/>
-        </w:rPr>
-        <w:t xml:space="preserve"> }</w:t>
-      </w:r>
-      <w:proofErr w:type="gramEnd"/>
+        <w:t>{{ customer_name }</w:t>
+      </w:r>
       <w:r>
         <w:rPr>
           <w:bCs/>
@@ -4876,29 +3601,8 @@
           <w:lang w:eastAsia="en-GB"/>
         </w:rPr>
       </w:pPr>
-      <w:proofErr w:type="gramStart"/>
-      <w:r>
-        <w:t xml:space="preserve">{{ </w:t>
-      </w:r>
-      <w:proofErr w:type="spellStart"/>
-      <w:r>
-        <w:t>threat</w:t>
-      </w:r>
-      <w:proofErr w:type="gramEnd"/>
-      <w:r>
-        <w:t>_</w:t>
-      </w:r>
-      <w:proofErr w:type="gramStart"/>
-      <w:r>
-        <w:t>scenarios</w:t>
-      </w:r>
-      <w:proofErr w:type="spellEnd"/>
-      <w:r>
-        <w:t xml:space="preserve"> }</w:t>
-      </w:r>
-      <w:proofErr w:type="gramEnd"/>
-      <w:r>
-        <w:t>}</w:t>
+      <w:r>
+        <w:t>{{ threat_scenarios }}</w:t>
       </w:r>
     </w:p>
     <w:p/>
@@ -4920,29 +3624,8 @@
           <w:lang w:eastAsia="en-GB"/>
         </w:rPr>
       </w:pPr>
-      <w:proofErr w:type="gramStart"/>
-      <w:r>
-        <w:t xml:space="preserve">{{ </w:t>
-      </w:r>
-      <w:proofErr w:type="spellStart"/>
-      <w:r>
-        <w:t>radar</w:t>
-      </w:r>
-      <w:proofErr w:type="gramEnd"/>
-      <w:r>
-        <w:t>_</w:t>
-      </w:r>
-      <w:proofErr w:type="gramStart"/>
-      <w:r>
-        <w:t>chart</w:t>
-      </w:r>
-      <w:proofErr w:type="spellEnd"/>
-      <w:r>
-        <w:t xml:space="preserve"> }</w:t>
-      </w:r>
-      <w:proofErr w:type="gramEnd"/>
-      <w:r>
-        <w:t>}</w:t>
+      <w:r>
+        <w:t>{{ radar_chart }}</w:t>
       </w:r>
     </w:p>
     <w:p/>
@@ -4970,29 +3653,8 @@
       </w:r>
     </w:p>
     <w:p>
-      <w:proofErr w:type="gramStart"/>
-      <w:r>
-        <w:t xml:space="preserve">{{ </w:t>
-      </w:r>
-      <w:proofErr w:type="spellStart"/>
-      <w:r>
-        <w:t>matrix</w:t>
-      </w:r>
-      <w:proofErr w:type="gramEnd"/>
-      <w:r>
-        <w:t>_</w:t>
-      </w:r>
-      <w:proofErr w:type="gramStart"/>
-      <w:r>
-        <w:t>mapping</w:t>
-      </w:r>
-      <w:proofErr w:type="spellEnd"/>
-      <w:r>
-        <w:t xml:space="preserve"> }</w:t>
-      </w:r>
-      <w:proofErr w:type="gramEnd"/>
-      <w:r>
-        <w:t>}</w:t>
+      <w:r>
+        <w:t>{{ matrix_mapping }}</w:t>
       </w:r>
     </w:p>
     <w:p/>
@@ -5266,71 +3928,17 @@
         </w:rPr>
       </w:pPr>
       <w:r>
-        <w:t xml:space="preserve">{% for comp in </w:t>
-      </w:r>
-      <w:proofErr w:type="spellStart"/>
-      <w:r>
-        <w:t>compliance_alignment</w:t>
-      </w:r>
-      <w:proofErr w:type="spellEnd"/>
-      <w:r>
-        <w:t xml:space="preserve"> </w:t>
-      </w:r>
-      <w:proofErr w:type="gramStart"/>
-      <w:r>
-        <w:t>%}</w:t>
+        <w:t>{% for comp in compliance_alignment %}</w:t>
       </w:r>
       <w:r>
         <w:rPr>
           <w:b/>
           <w:bCs/>
         </w:rPr>
-        <w:t>Standard</w:t>
-      </w:r>
-      <w:proofErr w:type="gramEnd"/>
-      <w:r>
-        <w:rPr>
-          <w:b/>
-          <w:bCs/>
-        </w:rPr>
-        <w:t>:</w:t>
-      </w:r>
-      <w:r>
-        <w:t xml:space="preserve"> </w:t>
-      </w:r>
-      <w:proofErr w:type="gramStart"/>
-      <w:r>
-        <w:t xml:space="preserve">{{ </w:t>
-      </w:r>
-      <w:proofErr w:type="spellStart"/>
-      <w:r>
-        <w:t>comp</w:t>
-      </w:r>
-      <w:proofErr w:type="gramEnd"/>
-      <w:r>
-        <w:t>.</w:t>
-      </w:r>
-      <w:proofErr w:type="gramStart"/>
-      <w:r>
-        <w:t>standard</w:t>
-      </w:r>
-      <w:proofErr w:type="spellEnd"/>
-      <w:r>
-        <w:t xml:space="preserve"> }}{</w:t>
-      </w:r>
-      <w:proofErr w:type="gramEnd"/>
-      <w:r>
-        <w:t xml:space="preserve">% if </w:t>
-      </w:r>
-      <w:proofErr w:type="spellStart"/>
-      <w:proofErr w:type="gramStart"/>
-      <w:r>
-        <w:t>comp.gaps</w:t>
-      </w:r>
-      <w:proofErr w:type="spellEnd"/>
-      <w:proofErr w:type="gramEnd"/>
-      <w:r>
-        <w:t xml:space="preserve"> %} </w:t>
+        <w:t>Standard:</w:t>
+      </w:r>
+      <w:r>
+        <w:t xml:space="preserve"> {{ comp.standard }}{% if comp.gaps %} </w:t>
       </w:r>
       <w:r>
         <w:rPr>
@@ -5340,70 +3948,7 @@
         <w:t>Gaps:</w:t>
       </w:r>
       <w:r>
-        <w:t xml:space="preserve"> {% for gap in </w:t>
-      </w:r>
-      <w:proofErr w:type="spellStart"/>
-      <w:proofErr w:type="gramStart"/>
-      <w:r>
-        <w:t>comp.gaps</w:t>
-      </w:r>
-      <w:proofErr w:type="spellEnd"/>
-      <w:proofErr w:type="gramEnd"/>
-      <w:r>
-        <w:t xml:space="preserve"> </w:t>
-      </w:r>
-      <w:proofErr w:type="gramStart"/>
-      <w:r>
-        <w:t>%}•</w:t>
-      </w:r>
-      <w:proofErr w:type="gramEnd"/>
-      <w:r>
-        <w:t xml:space="preserve"> </w:t>
-      </w:r>
-      <w:proofErr w:type="gramStart"/>
-      <w:r>
-        <w:t>{{ gap</w:t>
-      </w:r>
-      <w:proofErr w:type="gramEnd"/>
-      <w:r>
-        <w:t xml:space="preserve"> }} {% </w:t>
-      </w:r>
-      <w:proofErr w:type="spellStart"/>
-      <w:r>
-        <w:t>endfor</w:t>
-      </w:r>
-      <w:proofErr w:type="spellEnd"/>
-      <w:r>
-        <w:t xml:space="preserve"> </w:t>
-      </w:r>
-      <w:proofErr w:type="gramStart"/>
-      <w:r>
-        <w:t>%}{</w:t>
-      </w:r>
-      <w:proofErr w:type="gramEnd"/>
-      <w:r>
-        <w:t xml:space="preserve">% endif </w:t>
-      </w:r>
-      <w:proofErr w:type="gramStart"/>
-      <w:r>
-        <w:t>%}{</w:t>
-      </w:r>
-      <w:proofErr w:type="gramEnd"/>
-      <w:r>
-        <w:t xml:space="preserve">% if </w:t>
-      </w:r>
-      <w:proofErr w:type="spellStart"/>
-      <w:proofErr w:type="gramStart"/>
-      <w:r>
-        <w:t>comp.fill</w:t>
-      </w:r>
-      <w:proofErr w:type="gramEnd"/>
-      <w:r>
-        <w:t>_plan</w:t>
-      </w:r>
-      <w:proofErr w:type="spellEnd"/>
-      <w:r>
-        <w:t xml:space="preserve"> %} </w:t>
+        <w:t xml:space="preserve"> {% for gap in comp.gaps %}• {{ gap }} {% endfor %}{% endif %}{% if comp.fill_plan %} </w:t>
       </w:r>
       <w:r>
         <w:rPr>
@@ -5413,74 +3958,17 @@
         <w:t>Remediation Plans:</w:t>
       </w:r>
       <w:r>
-        <w:t xml:space="preserve"> {% for </w:t>
-      </w:r>
-      <w:proofErr w:type="spellStart"/>
-      <w:r>
-        <w:t>gp</w:t>
-      </w:r>
-      <w:proofErr w:type="spellEnd"/>
-      <w:r>
-        <w:t xml:space="preserve"> in </w:t>
-      </w:r>
-      <w:proofErr w:type="spellStart"/>
-      <w:proofErr w:type="gramStart"/>
-      <w:r>
-        <w:t>comp.fill</w:t>
-      </w:r>
-      <w:proofErr w:type="gramEnd"/>
-      <w:r>
-        <w:t>_plan</w:t>
-      </w:r>
-      <w:proofErr w:type="spellEnd"/>
-      <w:r>
-        <w:t xml:space="preserve"> </w:t>
-      </w:r>
-      <w:proofErr w:type="gramStart"/>
-      <w:r>
-        <w:t>%}</w:t>
+        <w:t xml:space="preserve"> {% for gp in comp.fill_plan %}</w:t>
       </w:r>
       <w:r>
         <w:rPr>
           <w:b/>
           <w:bCs/>
         </w:rPr>
-        <w:t>Gap</w:t>
-      </w:r>
-      <w:proofErr w:type="gramEnd"/>
-      <w:r>
-        <w:rPr>
-          <w:b/>
-          <w:bCs/>
-        </w:rPr>
-        <w:t>:</w:t>
-      </w:r>
-      <w:r>
-        <w:t xml:space="preserve"> </w:t>
-      </w:r>
-      <w:proofErr w:type="gramStart"/>
-      <w:r>
-        <w:t xml:space="preserve">{{ </w:t>
-      </w:r>
-      <w:proofErr w:type="spellStart"/>
-      <w:r>
-        <w:t>gp.gap</w:t>
-      </w:r>
-      <w:proofErr w:type="gramEnd"/>
-      <w:r>
-        <w:t>_</w:t>
-      </w:r>
-      <w:proofErr w:type="gramStart"/>
-      <w:r>
-        <w:t>description</w:t>
-      </w:r>
-      <w:proofErr w:type="spellEnd"/>
-      <w:r>
-        <w:t xml:space="preserve"> }</w:t>
-      </w:r>
-      <w:proofErr w:type="gramEnd"/>
-      <w:r>
-        <w:t xml:space="preserve">} </w:t>
+        <w:t>Gap:</w:t>
+      </w:r>
+      <w:r>
+        <w:t xml:space="preserve"> {{ gp.gap_description }} </w:t>
       </w:r>
       <w:r>
         <w:rPr>
@@ -5490,90 +3978,17 @@
         <w:t>Actions:</w:t>
       </w:r>
       <w:r>
-        <w:t xml:space="preserve"> {% for action in </w:t>
-      </w:r>
-      <w:proofErr w:type="spellStart"/>
-      <w:proofErr w:type="gramStart"/>
-      <w:r>
-        <w:t>gp.recommended</w:t>
-      </w:r>
-      <w:proofErr w:type="gramEnd"/>
-      <w:r>
-        <w:t>_actions</w:t>
-      </w:r>
-      <w:proofErr w:type="spellEnd"/>
-      <w:r>
-        <w:t xml:space="preserve"> </w:t>
-      </w:r>
-      <w:proofErr w:type="gramStart"/>
-      <w:r>
-        <w:t>%}•</w:t>
-      </w:r>
-      <w:proofErr w:type="gramEnd"/>
-      <w:r>
-        <w:t xml:space="preserve"> </w:t>
-      </w:r>
-      <w:proofErr w:type="gramStart"/>
-      <w:r>
-        <w:t>{{ action</w:t>
-      </w:r>
-      <w:proofErr w:type="gramEnd"/>
-      <w:r>
-        <w:t xml:space="preserve"> }} {% </w:t>
-      </w:r>
-      <w:proofErr w:type="spellStart"/>
-      <w:r>
-        <w:t>endfor</w:t>
-      </w:r>
-      <w:proofErr w:type="spellEnd"/>
-      <w:r>
-        <w:t xml:space="preserve"> </w:t>
-      </w:r>
-      <w:proofErr w:type="gramStart"/>
-      <w:r>
-        <w:t>%}</w:t>
+        <w:t xml:space="preserve"> {% for action in gp.recommended_actions %}• {{ action }} {% endfor %}</w:t>
       </w:r>
       <w:r>
         <w:rPr>
           <w:b/>
           <w:bCs/>
         </w:rPr>
-        <w:t>Owner</w:t>
-      </w:r>
-      <w:proofErr w:type="gramEnd"/>
-      <w:r>
-        <w:rPr>
-          <w:b/>
-          <w:bCs/>
-        </w:rPr>
-        <w:t>:</w:t>
-      </w:r>
-      <w:r>
-        <w:t xml:space="preserve"> </w:t>
-      </w:r>
-      <w:proofErr w:type="gramStart"/>
-      <w:r>
-        <w:t xml:space="preserve">{{ </w:t>
-      </w:r>
-      <w:proofErr w:type="spellStart"/>
-      <w:r>
-        <w:t>gp</w:t>
-      </w:r>
-      <w:proofErr w:type="gramEnd"/>
-      <w:r>
-        <w:t>.</w:t>
-      </w:r>
-      <w:proofErr w:type="gramStart"/>
-      <w:r>
-        <w:t>owner</w:t>
-      </w:r>
-      <w:proofErr w:type="spellEnd"/>
-      <w:r>
-        <w:t xml:space="preserve"> }</w:t>
-      </w:r>
-      <w:proofErr w:type="gramEnd"/>
-      <w:r>
-        <w:t xml:space="preserve">} </w:t>
+        <w:t>Owner:</w:t>
+      </w:r>
+      <w:r>
+        <w:t xml:space="preserve"> {{ gp.owner }} </w:t>
       </w:r>
       <w:r>
         <w:rPr>
@@ -5583,88 +3998,14 @@
         <w:t>Due By:</w:t>
       </w:r>
       <w:r>
-        <w:t xml:space="preserve"> </w:t>
-      </w:r>
-      <w:proofErr w:type="gramStart"/>
-      <w:r>
-        <w:t xml:space="preserve">{{ </w:t>
-      </w:r>
-      <w:proofErr w:type="spellStart"/>
-      <w:r>
-        <w:t>gp.due</w:t>
-      </w:r>
-      <w:proofErr w:type="gramEnd"/>
-      <w:r>
-        <w:t>_</w:t>
-      </w:r>
-      <w:proofErr w:type="gramStart"/>
-      <w:r>
-        <w:t>by</w:t>
-      </w:r>
-      <w:proofErr w:type="spellEnd"/>
-      <w:r>
-        <w:t xml:space="preserve"> }</w:t>
-      </w:r>
-      <w:proofErr w:type="gramEnd"/>
-      <w:r>
-        <w:t xml:space="preserve">} {% </w:t>
-      </w:r>
-      <w:proofErr w:type="spellStart"/>
-      <w:r>
-        <w:t>endfor</w:t>
-      </w:r>
-      <w:proofErr w:type="spellEnd"/>
-      <w:r>
-        <w:t xml:space="preserve"> </w:t>
-      </w:r>
-      <w:proofErr w:type="gramStart"/>
-      <w:r>
-        <w:t>%}{</w:t>
-      </w:r>
-      <w:proofErr w:type="gramEnd"/>
-      <w:r>
-        <w:t xml:space="preserve">% endif </w:t>
-      </w:r>
-      <w:proofErr w:type="gramStart"/>
-      <w:r>
-        <w:t>%}{</w:t>
-      </w:r>
-      <w:proofErr w:type="gramEnd"/>
-      <w:r>
-        <w:t xml:space="preserve">% if not </w:t>
-      </w:r>
-      <w:proofErr w:type="spellStart"/>
-      <w:proofErr w:type="gramStart"/>
-      <w:r>
-        <w:t>loop.last</w:t>
-      </w:r>
-      <w:proofErr w:type="spellEnd"/>
-      <w:proofErr w:type="gramEnd"/>
-      <w:r>
-        <w:t xml:space="preserve"> %}</w:t>
+        <w:t xml:space="preserve"> {{ gp.due_by }} {% endfor %}{% endif %}{% if not loop.last %}</w:t>
       </w:r>
       <w:r>
         <w:br/>
       </w:r>
       <w:r>
         <w:br/>
-        <w:t xml:space="preserve">{% endif </w:t>
-      </w:r>
-      <w:proofErr w:type="gramStart"/>
-      <w:r>
-        <w:t>%}{</w:t>
-      </w:r>
-      <w:proofErr w:type="gramEnd"/>
-      <w:r>
-        <w:t xml:space="preserve">% </w:t>
-      </w:r>
-      <w:proofErr w:type="spellStart"/>
-      <w:r>
-        <w:t>endfor</w:t>
-      </w:r>
-      <w:proofErr w:type="spellEnd"/>
-      <w:r>
-        <w:t xml:space="preserve"> %}</w:t>
+        <w:t>{% endif %}{% endfor %}</w:t>
       </w:r>
     </w:p>
     <w:p>
@@ -5693,86 +4034,23 @@
       </w:r>
     </w:p>
     <w:p>
-      <w:proofErr w:type="gramStart"/>
-      <w:r>
-        <w:t xml:space="preserve">{{ </w:t>
-      </w:r>
-      <w:proofErr w:type="spellStart"/>
-      <w:r>
-        <w:t>cost</w:t>
-      </w:r>
-      <w:proofErr w:type="gramEnd"/>
-      <w:r>
-        <w:t>_of_</w:t>
-      </w:r>
-      <w:proofErr w:type="gramStart"/>
-      <w:r>
-        <w:t>inaction</w:t>
-      </w:r>
-      <w:proofErr w:type="spellEnd"/>
-      <w:r>
-        <w:t xml:space="preserve"> }</w:t>
-      </w:r>
-      <w:proofErr w:type="gramEnd"/>
-      <w:r>
-        <w:t>}</w:t>
+      <w:r>
+        <w:t>{{ cost_of_inaction }}</w:t>
       </w:r>
     </w:p>
     <w:p/>
     <w:p>
-      <w:proofErr w:type="gramStart"/>
       <w:r>
         <w:t>{</w:t>
       </w:r>
       <w:r>
-        <w:t xml:space="preserve">{ </w:t>
-      </w:r>
-      <w:proofErr w:type="spellStart"/>
-      <w:r>
-        <w:t>cost</w:t>
-      </w:r>
-      <w:proofErr w:type="gramEnd"/>
-      <w:r>
-        <w:t>_of_inaction_</w:t>
-      </w:r>
-      <w:proofErr w:type="gramStart"/>
-      <w:r>
-        <w:t>summary</w:t>
-      </w:r>
-      <w:proofErr w:type="spellEnd"/>
-      <w:r>
-        <w:t xml:space="preserve"> }</w:t>
-      </w:r>
-      <w:proofErr w:type="gramEnd"/>
-      <w:r>
-        <w:t>}</w:t>
+        <w:t>{ cost_of_inaction_summary }}</w:t>
       </w:r>
     </w:p>
     <w:p/>
     <w:p>
-      <w:proofErr w:type="gramStart"/>
-      <w:r>
-        <w:t xml:space="preserve">{{ </w:t>
-      </w:r>
-      <w:proofErr w:type="spellStart"/>
-      <w:r>
-        <w:t>threat</w:t>
-      </w:r>
-      <w:proofErr w:type="gramEnd"/>
-      <w:r>
-        <w:t>_intelligence_</w:t>
-      </w:r>
-      <w:proofErr w:type="gramStart"/>
-      <w:r>
-        <w:t>context</w:t>
-      </w:r>
-      <w:proofErr w:type="spellEnd"/>
-      <w:r>
-        <w:t xml:space="preserve"> }</w:t>
-      </w:r>
-      <w:proofErr w:type="gramEnd"/>
-      <w:r>
-        <w:t>}</w:t>
+      <w:r>
+        <w:t>{{ threat_intelligence_context }}</w:t>
       </w:r>
     </w:p>
     <w:p/>
@@ -5974,13 +4252,8 @@
             <w:hideMark/>
           </w:tcPr>
           <w:p>
-            <w:proofErr w:type="gramStart"/>
-            <w:r>
-              <w:t>{{ industry</w:t>
-            </w:r>
-            <w:proofErr w:type="gramEnd"/>
-            <w:r>
-              <w:t xml:space="preserve"> }}</w:t>
+            <w:r>
+              <w:t>{{ industry }}</w:t>
             </w:r>
           </w:p>
         </w:tc>
@@ -6036,13 +4309,8 @@
             <w:hideMark/>
           </w:tcPr>
           <w:p>
-            <w:proofErr w:type="gramStart"/>
-            <w:r>
-              <w:t>{{ users</w:t>
-            </w:r>
-            <w:proofErr w:type="gramEnd"/>
-            <w:r>
-              <w:t xml:space="preserve"> }}</w:t>
+            <w:r>
+              <w:t>{{ users }}</w:t>
             </w:r>
           </w:p>
         </w:tc>
@@ -6098,21 +4366,8 @@
             <w:hideMark/>
           </w:tcPr>
           <w:p>
-            <w:proofErr w:type="gramStart"/>
-            <w:r>
-              <w:t>{{ endpoints</w:t>
-            </w:r>
-            <w:proofErr w:type="gramEnd"/>
-            <w:r>
-              <w:t xml:space="preserve"> }} / </w:t>
-            </w:r>
-            <w:proofErr w:type="gramStart"/>
-            <w:r>
-              <w:t>{{ servers</w:t>
-            </w:r>
-            <w:proofErr w:type="gramEnd"/>
-            <w:r>
-              <w:t xml:space="preserve"> }}</w:t>
+            <w:r>
+              <w:t>{{ endpoints }} / {{ servers }}</w:t>
             </w:r>
           </w:p>
         </w:tc>
@@ -6168,21 +4423,8 @@
             <w:hideMark/>
           </w:tcPr>
           <w:p>
-            <w:proofErr w:type="gramStart"/>
-            <w:r>
-              <w:t xml:space="preserve">{{ </w:t>
-            </w:r>
-            <w:proofErr w:type="spellStart"/>
-            <w:r>
-              <w:t>operating</w:t>
-            </w:r>
-            <w:proofErr w:type="gramEnd"/>
-            <w:r>
-              <w:t>_systems</w:t>
-            </w:r>
-            <w:proofErr w:type="spellEnd"/>
-            <w:r>
-              <w:t xml:space="preserve"> }}</w:t>
+            <w:r>
+              <w:t>{{ operating_systems }}</w:t>
             </w:r>
           </w:p>
         </w:tc>
@@ -6238,21 +4480,8 @@
             <w:hideMark/>
           </w:tcPr>
           <w:p>
-            <w:proofErr w:type="gramStart"/>
-            <w:r>
-              <w:t xml:space="preserve">{{ </w:t>
-            </w:r>
-            <w:proofErr w:type="spellStart"/>
-            <w:r>
-              <w:t>cloud</w:t>
-            </w:r>
-            <w:proofErr w:type="gramEnd"/>
-            <w:r>
-              <w:t>_env</w:t>
-            </w:r>
-            <w:proofErr w:type="spellEnd"/>
-            <w:r>
-              <w:t xml:space="preserve"> }}</w:t>
+            <w:r>
+              <w:t>{{ cloud_env }}</w:t>
             </w:r>
           </w:p>
         </w:tc>
@@ -6312,13 +4541,8 @@
             <w:vAlign w:val="center"/>
           </w:tcPr>
           <w:p>
-            <w:proofErr w:type="gramStart"/>
-            <w:r>
-              <w:t>{{ m</w:t>
-            </w:r>
-            <w:proofErr w:type="gramEnd"/>
-            <w:r>
-              <w:t>365_license }}</w:t>
+            <w:r>
+              <w:t>{{ m365_license }}</w:t>
             </w:r>
           </w:p>
         </w:tc>
@@ -6374,21 +4598,8 @@
             <w:hideMark/>
           </w:tcPr>
           <w:p>
-            <w:proofErr w:type="gramStart"/>
-            <w:r>
-              <w:t xml:space="preserve">{{ </w:t>
-            </w:r>
-            <w:proofErr w:type="spellStart"/>
-            <w:r>
-              <w:t>in</w:t>
-            </w:r>
-            <w:proofErr w:type="gramEnd"/>
-            <w:r>
-              <w:t>_house_team</w:t>
-            </w:r>
-            <w:proofErr w:type="spellEnd"/>
-            <w:r>
-              <w:t xml:space="preserve"> }}</w:t>
+            <w:r>
+              <w:t>{{ in_house_team }}</w:t>
             </w:r>
           </w:p>
         </w:tc>
@@ -6444,13 +4655,8 @@
             <w:hideMark/>
           </w:tcPr>
           <w:p>
-            <w:proofErr w:type="gramStart"/>
-            <w:r>
-              <w:t>{{ compliance</w:t>
-            </w:r>
-            <w:proofErr w:type="gramEnd"/>
-            <w:r>
-              <w:t xml:space="preserve"> }}</w:t>
+            <w:r>
+              <w:t>{{ compliance }}</w:t>
             </w:r>
           </w:p>
         </w:tc>
@@ -6506,21 +4712,8 @@
             <w:hideMark/>
           </w:tcPr>
           <w:p>
-            <w:proofErr w:type="gramStart"/>
-            <w:r>
-              <w:t xml:space="preserve">{{ </w:t>
-            </w:r>
-            <w:proofErr w:type="spellStart"/>
-            <w:r>
-              <w:t>cap</w:t>
-            </w:r>
-            <w:proofErr w:type="gramEnd"/>
-            <w:r>
-              <w:t>_summary</w:t>
-            </w:r>
-            <w:proofErr w:type="spellEnd"/>
-            <w:r>
-              <w:t xml:space="preserve"> }}</w:t>
+            <w:r>
+              <w:t>{{ cap_summary }}</w:t>
             </w:r>
           </w:p>
         </w:tc>
@@ -6687,21 +4880,8 @@
             <w:hideMark/>
           </w:tcPr>
           <w:p>
-            <w:proofErr w:type="gramStart"/>
-            <w:r>
-              <w:t xml:space="preserve">{{ </w:t>
-            </w:r>
-            <w:proofErr w:type="spellStart"/>
-            <w:r>
-              <w:t>mdr</w:t>
-            </w:r>
-            <w:proofErr w:type="gramEnd"/>
-            <w:r>
-              <w:t>_provider</w:t>
-            </w:r>
-            <w:proofErr w:type="spellEnd"/>
-            <w:r>
-              <w:t xml:space="preserve"> }}</w:t>
+            <w:r>
+              <w:t>{{ mdr_provider }}</w:t>
             </w:r>
           </w:p>
         </w:tc>
@@ -6757,13 +4937,8 @@
             <w:hideMark/>
           </w:tcPr>
           <w:p>
-            <w:proofErr w:type="gramStart"/>
-            <w:r>
-              <w:t>{{ endpoint</w:t>
-            </w:r>
-            <w:proofErr w:type="gramEnd"/>
-            <w:r>
-              <w:t xml:space="preserve"> }}</w:t>
+            <w:r>
+              <w:t>{{ endpoint }}</w:t>
             </w:r>
           </w:p>
         </w:tc>
@@ -6823,21 +4998,8 @@
             <w:vAlign w:val="center"/>
           </w:tcPr>
           <w:p>
-            <w:proofErr w:type="gramStart"/>
-            <w:r>
-              <w:t xml:space="preserve">{{ </w:t>
-            </w:r>
-            <w:proofErr w:type="spellStart"/>
-            <w:r>
-              <w:t>endpoint</w:t>
-            </w:r>
-            <w:proofErr w:type="gramEnd"/>
-            <w:r>
-              <w:t>_posture</w:t>
-            </w:r>
-            <w:proofErr w:type="spellEnd"/>
-            <w:r>
-              <w:t xml:space="preserve"> }}</w:t>
+            <w:r>
+              <w:t>{{ endpoint_posture }}</w:t>
             </w:r>
           </w:p>
         </w:tc>
@@ -6893,13 +5055,8 @@
             <w:hideMark/>
           </w:tcPr>
           <w:p>
-            <w:proofErr w:type="gramStart"/>
-            <w:r>
-              <w:t>{{ firewall</w:t>
-            </w:r>
-            <w:proofErr w:type="gramEnd"/>
-            <w:r>
-              <w:t xml:space="preserve"> }}</w:t>
+            <w:r>
+              <w:t>{{ firewall }}</w:t>
             </w:r>
           </w:p>
         </w:tc>
@@ -6955,13 +5112,8 @@
             <w:hideMark/>
           </w:tcPr>
           <w:p>
-            <w:proofErr w:type="gramStart"/>
-            <w:r>
-              <w:t>{{ identity</w:t>
-            </w:r>
-            <w:proofErr w:type="gramEnd"/>
-            <w:r>
-              <w:t xml:space="preserve"> }}</w:t>
+            <w:r>
+              <w:t>{{ identity }}</w:t>
             </w:r>
           </w:p>
         </w:tc>
@@ -7017,13 +5169,8 @@
             <w:hideMark/>
           </w:tcPr>
           <w:p>
-            <w:proofErr w:type="gramStart"/>
-            <w:r>
-              <w:t>{{ email</w:t>
-            </w:r>
-            <w:proofErr w:type="gramEnd"/>
-            <w:r>
-              <w:t xml:space="preserve"> }}</w:t>
+            <w:r>
+              <w:t>{{ email }}</w:t>
             </w:r>
           </w:p>
         </w:tc>
@@ -7079,13 +5226,8 @@
             <w:hideMark/>
           </w:tcPr>
           <w:p>
-            <w:proofErr w:type="gramStart"/>
-            <w:r>
-              <w:t>{{ savviness</w:t>
-            </w:r>
-            <w:proofErr w:type="gramEnd"/>
-            <w:r>
-              <w:t xml:space="preserve"> }}</w:t>
+            <w:r>
+              <w:t>{{ savviness }}</w:t>
             </w:r>
           </w:p>
         </w:tc>
@@ -7141,21 +5283,8 @@
             <w:hideMark/>
           </w:tcPr>
           <w:p>
-            <w:proofErr w:type="gramStart"/>
-            <w:r>
-              <w:t xml:space="preserve">{{ </w:t>
-            </w:r>
-            <w:proofErr w:type="spellStart"/>
-            <w:r>
-              <w:t>in</w:t>
-            </w:r>
-            <w:proofErr w:type="gramEnd"/>
-            <w:r>
-              <w:t>_house_team</w:t>
-            </w:r>
-            <w:proofErr w:type="spellEnd"/>
-            <w:r>
-              <w:t xml:space="preserve"> }}</w:t>
+            <w:r>
+              <w:t>{{ in_house_team }}</w:t>
             </w:r>
           </w:p>
         </w:tc>
@@ -7211,21 +5340,8 @@
             <w:hideMark/>
           </w:tcPr>
           <w:p>
-            <w:proofErr w:type="gramStart"/>
-            <w:r>
-              <w:t xml:space="preserve">{{ </w:t>
-            </w:r>
-            <w:proofErr w:type="spellStart"/>
-            <w:r>
-              <w:t>pentest</w:t>
-            </w:r>
-            <w:proofErr w:type="gramEnd"/>
-            <w:r>
-              <w:t>_status</w:t>
-            </w:r>
-            <w:proofErr w:type="spellEnd"/>
-            <w:r>
-              <w:t xml:space="preserve"> }}</w:t>
+            <w:r>
+              <w:t>{{ pentest_status }}</w:t>
             </w:r>
           </w:p>
         </w:tc>
@@ -7281,21 +5397,8 @@
             <w:hideMark/>
           </w:tcPr>
           <w:p>
-            <w:proofErr w:type="gramStart"/>
-            <w:r>
-              <w:t xml:space="preserve">{{ </w:t>
-            </w:r>
-            <w:proofErr w:type="spellStart"/>
-            <w:r>
-              <w:t>vuln</w:t>
-            </w:r>
-            <w:proofErr w:type="gramEnd"/>
-            <w:r>
-              <w:t>_scanning</w:t>
-            </w:r>
-            <w:proofErr w:type="spellEnd"/>
-            <w:r>
-              <w:t xml:space="preserve"> }}</w:t>
+            <w:r>
+              <w:t>{{ vuln_scanning }}</w:t>
             </w:r>
           </w:p>
         </w:tc>
@@ -7446,13 +5549,8 @@
             <w:hideMark/>
           </w:tcPr>
           <w:p>
-            <w:proofErr w:type="gramStart"/>
-            <w:r>
-              <w:t>{{ backups</w:t>
-            </w:r>
-            <w:proofErr w:type="gramEnd"/>
-            <w:r>
-              <w:t xml:space="preserve"> }}</w:t>
+            <w:r>
+              <w:t>{{ backups }}</w:t>
             </w:r>
           </w:p>
         </w:tc>
@@ -7508,21 +5606,8 @@
             <w:hideMark/>
           </w:tcPr>
           <w:p>
-            <w:proofErr w:type="gramStart"/>
-            <w:r>
-              <w:t xml:space="preserve">{{ </w:t>
-            </w:r>
-            <w:proofErr w:type="spellStart"/>
-            <w:r>
-              <w:t>saas</w:t>
-            </w:r>
-            <w:proofErr w:type="gramEnd"/>
-            <w:r>
-              <w:t>_backup</w:t>
-            </w:r>
-            <w:proofErr w:type="spellEnd"/>
-            <w:r>
-              <w:t xml:space="preserve"> }}</w:t>
+            <w:r>
+              <w:t>{{ saas_backup }}</w:t>
             </w:r>
           </w:p>
         </w:tc>
@@ -7578,21 +5663,8 @@
             <w:hideMark/>
           </w:tcPr>
           <w:p>
-            <w:proofErr w:type="gramStart"/>
-            <w:r>
-              <w:t xml:space="preserve">{{ </w:t>
-            </w:r>
-            <w:proofErr w:type="spellStart"/>
-            <w:r>
-              <w:t>remote</w:t>
-            </w:r>
-            <w:proofErr w:type="gramEnd"/>
-            <w:r>
-              <w:t>_access</w:t>
-            </w:r>
-            <w:proofErr w:type="spellEnd"/>
-            <w:r>
-              <w:t xml:space="preserve"> }}</w:t>
+            <w:r>
+              <w:t>{{ remote_access }}</w:t>
             </w:r>
           </w:p>
         </w:tc>
@@ -7648,21 +5720,8 @@
             <w:hideMark/>
           </w:tcPr>
           <w:p>
-            <w:proofErr w:type="gramStart"/>
-            <w:r>
-              <w:t xml:space="preserve">{{ </w:t>
-            </w:r>
-            <w:proofErr w:type="spellStart"/>
-            <w:r>
-              <w:t>ir</w:t>
-            </w:r>
-            <w:proofErr w:type="gramEnd"/>
-            <w:r>
-              <w:t>_readiness</w:t>
-            </w:r>
-            <w:proofErr w:type="spellEnd"/>
-            <w:r>
-              <w:t xml:space="preserve"> }}</w:t>
+            <w:r>
+              <w:t>{{ ir_readiness }}</w:t>
             </w:r>
           </w:p>
         </w:tc>
@@ -7718,21 +5777,8 @@
             <w:hideMark/>
           </w:tcPr>
           <w:p>
-            <w:proofErr w:type="gramStart"/>
-            <w:r>
-              <w:t xml:space="preserve">{{ </w:t>
-            </w:r>
-            <w:proofErr w:type="spellStart"/>
-            <w:r>
-              <w:t>mfa</w:t>
-            </w:r>
-            <w:proofErr w:type="gramEnd"/>
-            <w:r>
-              <w:t>_status</w:t>
-            </w:r>
-            <w:proofErr w:type="spellEnd"/>
-            <w:r>
-              <w:t xml:space="preserve"> }}</w:t>
+            <w:r>
+              <w:t>{{ mfa_status }}</w:t>
             </w:r>
           </w:p>
         </w:tc>
@@ -7788,13 +5834,8 @@
             <w:hideMark/>
           </w:tcPr>
           <w:p>
-            <w:proofErr w:type="gramStart"/>
-            <w:r>
-              <w:t>{{ patching</w:t>
-            </w:r>
-            <w:proofErr w:type="gramEnd"/>
-            <w:r>
-              <w:t xml:space="preserve"> }}</w:t>
+            <w:r>
+              <w:t>{{ patching }}</w:t>
             </w:r>
           </w:p>
         </w:tc>
@@ -7850,13 +5891,8 @@
             <w:hideMark/>
           </w:tcPr>
           <w:p>
-            <w:proofErr w:type="gramStart"/>
-            <w:r>
-              <w:t>{{ insurance</w:t>
-            </w:r>
-            <w:proofErr w:type="gramEnd"/>
-            <w:r>
-              <w:t xml:space="preserve"> }}</w:t>
+            <w:r>
+              <w:t>{{ insurance }}</w:t>
             </w:r>
           </w:p>
         </w:tc>
@@ -7889,17 +5925,8 @@
                 <w:b/>
                 <w:bCs/>
               </w:rPr>
-              <w:t xml:space="preserve">Outage </w:t>
-            </w:r>
-            <w:proofErr w:type="spellStart"/>
-            <w:r>
-              <w:rPr>
-                <w:b/>
-                <w:bCs/>
-              </w:rPr>
-              <w:t>Tolerence</w:t>
-            </w:r>
-            <w:proofErr w:type="spellEnd"/>
+              <w:t>Outage Tolerence</w:t>
+            </w:r>
           </w:p>
         </w:tc>
         <w:tc>
@@ -7921,18 +5948,8 @@
             <w:hideMark/>
           </w:tcPr>
           <w:p>
-            <w:proofErr w:type="gramStart"/>
-            <w:r>
-              <w:t xml:space="preserve">{{ </w:t>
-            </w:r>
-            <w:proofErr w:type="spellStart"/>
-            <w:r>
-              <w:t>rto</w:t>
-            </w:r>
-            <w:proofErr w:type="spellEnd"/>
-            <w:proofErr w:type="gramEnd"/>
-            <w:r>
-              <w:t xml:space="preserve"> }}</w:t>
+            <w:r>
+              <w:t>{{ rto }}</w:t>
             </w:r>
           </w:p>
         </w:tc>
@@ -7972,29 +5989,8 @@
         </w:rPr>
         <w:t xml:space="preserve">Domain: </w:t>
       </w:r>
-      <w:proofErr w:type="gramStart"/>
-      <w:r>
-        <w:t xml:space="preserve">{{ </w:t>
-      </w:r>
-      <w:proofErr w:type="spellStart"/>
-      <w:r>
-        <w:t>d</w:t>
-      </w:r>
-      <w:proofErr w:type="gramEnd"/>
-      <w:r>
-        <w:t>.domain_</w:t>
-      </w:r>
-      <w:proofErr w:type="gramStart"/>
-      <w:r>
-        <w:t>name</w:t>
-      </w:r>
-      <w:proofErr w:type="spellEnd"/>
-      <w:r>
-        <w:t xml:space="preserve"> }</w:t>
-      </w:r>
-      <w:proofErr w:type="gramEnd"/>
-      <w:r>
-        <w:t>}</w:t>
+      <w:r>
+        <w:t>{{ d.domain_name }}</w:t>
       </w:r>
     </w:p>
     <w:p/>
@@ -8142,21 +6138,17 @@
             <w:hideMark/>
           </w:tcPr>
           <w:p>
-            <w:proofErr w:type="gramStart"/>
             <w:r>
               <w:t xml:space="preserve">{{ </w:t>
             </w:r>
-            <w:proofErr w:type="spellStart"/>
-            <w:r>
-              <w:t>d</w:t>
-            </w:r>
-            <w:proofErr w:type="gramEnd"/>
-            <w:r>
-              <w:t>.current_maturity_level</w:t>
-            </w:r>
-            <w:proofErr w:type="spellEnd"/>
-            <w:r>
-              <w:t xml:space="preserve"> }}</w:t>
+            <w:r>
+              <w:t>d.current_maturity_display</w:t>
+            </w:r>
+            <w:r>
+              <w:t xml:space="preserve"> </w:t>
+            </w:r>
+            <w:r>
+              <w:t>}}</w:t>
             </w:r>
           </w:p>
         </w:tc>
@@ -8212,21 +6204,8 @@
             <w:hideMark/>
           </w:tcPr>
           <w:p>
-            <w:proofErr w:type="gramStart"/>
-            <w:r>
-              <w:t xml:space="preserve">{{ </w:t>
-            </w:r>
-            <w:proofErr w:type="spellStart"/>
-            <w:r>
-              <w:t>d</w:t>
-            </w:r>
-            <w:proofErr w:type="gramEnd"/>
-            <w:r>
-              <w:t>.current_state_analysis</w:t>
-            </w:r>
-            <w:proofErr w:type="spellEnd"/>
-            <w:r>
-              <w:t xml:space="preserve"> }}</w:t>
+            <w:r>
+              <w:t>{{ d.current_state_analysis }}</w:t>
             </w:r>
           </w:p>
         </w:tc>
@@ -8282,21 +6261,8 @@
             <w:hideMark/>
           </w:tcPr>
           <w:p>
-            <w:proofErr w:type="gramStart"/>
-            <w:r>
-              <w:t xml:space="preserve">{{ </w:t>
-            </w:r>
-            <w:proofErr w:type="spellStart"/>
-            <w:r>
-              <w:t>d</w:t>
-            </w:r>
-            <w:proofErr w:type="gramEnd"/>
-            <w:r>
-              <w:t>.business_impact_narrative</w:t>
-            </w:r>
-            <w:proofErr w:type="spellEnd"/>
-            <w:r>
-              <w:t xml:space="preserve"> }}</w:t>
+            <w:r>
+              <w:t>{{ d.business_impact_narrative }}</w:t>
             </w:r>
           </w:p>
         </w:tc>
@@ -8353,74 +6319,11 @@
           </w:tcPr>
           <w:p>
             <w:r>
-              <w:t xml:space="preserve">{% for gap in </w:t>
-            </w:r>
-            <w:proofErr w:type="spellStart"/>
-            <w:proofErr w:type="gramStart"/>
-            <w:r>
-              <w:t>d.critical</w:t>
-            </w:r>
-            <w:proofErr w:type="gramEnd"/>
-            <w:r>
-              <w:t>_gaps</w:t>
-            </w:r>
-            <w:proofErr w:type="spellEnd"/>
-            <w:r>
-              <w:t xml:space="preserve"> </w:t>
-            </w:r>
-            <w:proofErr w:type="gramStart"/>
-            <w:r>
-              <w:t>%}•</w:t>
-            </w:r>
-            <w:proofErr w:type="gramEnd"/>
-            <w:r>
-              <w:t xml:space="preserve"> </w:t>
-            </w:r>
-            <w:proofErr w:type="gramStart"/>
-            <w:r>
-              <w:t>{{ gap</w:t>
-            </w:r>
-            <w:proofErr w:type="gramEnd"/>
-            <w:r>
-              <w:t xml:space="preserve"> </w:t>
-            </w:r>
-            <w:proofErr w:type="gramStart"/>
-            <w:r>
-              <w:t>}}{</w:t>
-            </w:r>
-            <w:proofErr w:type="gramEnd"/>
-            <w:r>
-              <w:t xml:space="preserve">% if not </w:t>
-            </w:r>
-            <w:proofErr w:type="spellStart"/>
-            <w:proofErr w:type="gramStart"/>
-            <w:r>
-              <w:t>loop.last</w:t>
-            </w:r>
-            <w:proofErr w:type="spellEnd"/>
-            <w:proofErr w:type="gramEnd"/>
-            <w:r>
-              <w:t xml:space="preserve"> %}</w:t>
+              <w:t>{% for gap in d.critical_gaps %}• {{ gap }}{% if not loop.last %}</w:t>
             </w:r>
             <w:r>
               <w:br/>
-              <w:t xml:space="preserve">{% endif </w:t>
-            </w:r>
-            <w:proofErr w:type="gramStart"/>
-            <w:r>
-              <w:t>%}{</w:t>
-            </w:r>
-            <w:proofErr w:type="gramEnd"/>
-            <w:r>
-              <w:t xml:space="preserve">% </w:t>
-            </w:r>
-            <w:proofErr w:type="spellStart"/>
-            <w:r>
-              <w:t>endfor</w:t>
-            </w:r>
-            <w:proofErr w:type="spellEnd"/>
-            <w:r>
-              <w:t xml:space="preserve"> %}</w:t>
+              <w:t>{% endif %}{% endfor %}</w:t>
             </w:r>
           </w:p>
         </w:tc>
@@ -8477,74 +6380,11 @@
           </w:tcPr>
           <w:p>
             <w:r>
-              <w:t xml:space="preserve">{% for win in </w:t>
-            </w:r>
-            <w:proofErr w:type="spellStart"/>
-            <w:proofErr w:type="gramStart"/>
-            <w:r>
-              <w:t>d.vendor</w:t>
-            </w:r>
-            <w:proofErr w:type="gramEnd"/>
-            <w:r>
-              <w:t>_agnostic_quick_wins</w:t>
-            </w:r>
-            <w:proofErr w:type="spellEnd"/>
-            <w:r>
-              <w:t xml:space="preserve"> </w:t>
-            </w:r>
-            <w:proofErr w:type="gramStart"/>
-            <w:r>
-              <w:t>%}•</w:t>
-            </w:r>
-            <w:proofErr w:type="gramEnd"/>
-            <w:r>
-              <w:t xml:space="preserve"> </w:t>
-            </w:r>
-            <w:proofErr w:type="gramStart"/>
-            <w:r>
-              <w:t>{{ win</w:t>
-            </w:r>
-            <w:proofErr w:type="gramEnd"/>
-            <w:r>
-              <w:t xml:space="preserve"> </w:t>
-            </w:r>
-            <w:proofErr w:type="gramStart"/>
-            <w:r>
-              <w:t>}}{</w:t>
-            </w:r>
-            <w:proofErr w:type="gramEnd"/>
-            <w:r>
-              <w:t xml:space="preserve">% if not </w:t>
-            </w:r>
-            <w:proofErr w:type="spellStart"/>
-            <w:proofErr w:type="gramStart"/>
-            <w:r>
-              <w:t>loop.last</w:t>
-            </w:r>
-            <w:proofErr w:type="spellEnd"/>
-            <w:proofErr w:type="gramEnd"/>
-            <w:r>
-              <w:t xml:space="preserve"> %}</w:t>
+              <w:t>{% for win in d.vendor_agnostic_quick_wins %}• {{ win }}{% if not loop.last %}</w:t>
             </w:r>
             <w:r>
               <w:br/>
-              <w:t xml:space="preserve">{% endif </w:t>
-            </w:r>
-            <w:proofErr w:type="gramStart"/>
-            <w:r>
-              <w:t>%}{</w:t>
-            </w:r>
-            <w:proofErr w:type="gramEnd"/>
-            <w:r>
-              <w:t xml:space="preserve">% </w:t>
-            </w:r>
-            <w:proofErr w:type="spellStart"/>
-            <w:r>
-              <w:t>endfor</w:t>
-            </w:r>
-            <w:proofErr w:type="spellEnd"/>
-            <w:r>
-              <w:t xml:space="preserve"> %}</w:t>
+              <w:t>{% endif %}{% endfor %}</w:t>
             </w:r>
           </w:p>
         </w:tc>
@@ -8601,74 +6441,11 @@
           </w:tcPr>
           <w:p>
             <w:r>
-              <w:t xml:space="preserve">{% for sol in </w:t>
-            </w:r>
-            <w:proofErr w:type="spellStart"/>
-            <w:proofErr w:type="gramStart"/>
-            <w:r>
-              <w:t>d.recommended</w:t>
-            </w:r>
-            <w:proofErr w:type="gramEnd"/>
-            <w:r>
-              <w:t>_solutions</w:t>
-            </w:r>
-            <w:proofErr w:type="spellEnd"/>
-            <w:r>
-              <w:t xml:space="preserve"> </w:t>
-            </w:r>
-            <w:proofErr w:type="gramStart"/>
-            <w:r>
-              <w:t>%}•</w:t>
-            </w:r>
-            <w:proofErr w:type="gramEnd"/>
-            <w:r>
-              <w:t xml:space="preserve"> </w:t>
-            </w:r>
-            <w:proofErr w:type="gramStart"/>
-            <w:r>
-              <w:t>{{ sol</w:t>
-            </w:r>
-            <w:proofErr w:type="gramEnd"/>
-            <w:r>
-              <w:t xml:space="preserve"> </w:t>
-            </w:r>
-            <w:proofErr w:type="gramStart"/>
-            <w:r>
-              <w:t>}}{</w:t>
-            </w:r>
-            <w:proofErr w:type="gramEnd"/>
-            <w:r>
-              <w:t xml:space="preserve">% if not </w:t>
-            </w:r>
-            <w:proofErr w:type="spellStart"/>
-            <w:proofErr w:type="gramStart"/>
-            <w:r>
-              <w:t>loop.last</w:t>
-            </w:r>
-            <w:proofErr w:type="spellEnd"/>
-            <w:proofErr w:type="gramEnd"/>
-            <w:r>
-              <w:t xml:space="preserve"> %}</w:t>
+              <w:t>{% for sol in d.recommended_solutions %}• {{ sol }}{% if not loop.last %}</w:t>
             </w:r>
             <w:r>
               <w:br/>
-              <w:t xml:space="preserve">{% endif </w:t>
-            </w:r>
-            <w:proofErr w:type="gramStart"/>
-            <w:r>
-              <w:t>%}{</w:t>
-            </w:r>
-            <w:proofErr w:type="gramEnd"/>
-            <w:r>
-              <w:t xml:space="preserve">% </w:t>
-            </w:r>
-            <w:proofErr w:type="spellStart"/>
-            <w:r>
-              <w:t>endfor</w:t>
-            </w:r>
-            <w:proofErr w:type="spellEnd"/>
-            <w:r>
-              <w:t xml:space="preserve"> %}</w:t>
+              <w:t>{% endif %}{% endfor %}</w:t>
             </w:r>
           </w:p>
         </w:tc>
@@ -8724,21 +6501,8 @@
             <w:hideMark/>
           </w:tcPr>
           <w:p>
-            <w:proofErr w:type="gramStart"/>
-            <w:r>
-              <w:t xml:space="preserve">{{ </w:t>
-            </w:r>
-            <w:proofErr w:type="spellStart"/>
-            <w:r>
-              <w:t>d</w:t>
-            </w:r>
-            <w:proofErr w:type="gramEnd"/>
-            <w:r>
-              <w:t>.remediation_rationale</w:t>
-            </w:r>
-            <w:proofErr w:type="spellEnd"/>
-            <w:r>
-              <w:t xml:space="preserve"> }}</w:t>
+            <w:r>
+              <w:t>{{ d.remediation_rationale }}</w:t>
             </w:r>
           </w:p>
         </w:tc>
@@ -8798,21 +6562,8 @@
             <w:vAlign w:val="center"/>
           </w:tcPr>
           <w:p>
-            <w:proofErr w:type="gramStart"/>
-            <w:r>
-              <w:t xml:space="preserve">{{ </w:t>
-            </w:r>
-            <w:proofErr w:type="spellStart"/>
-            <w:r>
-              <w:t>d</w:t>
-            </w:r>
-            <w:proofErr w:type="gramEnd"/>
-            <w:r>
-              <w:t>.shared_responsibility</w:t>
-            </w:r>
-            <w:proofErr w:type="spellEnd"/>
-            <w:r>
-              <w:t xml:space="preserve"> }}</w:t>
+            <w:r>
+              <w:t>{{ d.shared_responsibility }}</w:t>
             </w:r>
           </w:p>
         </w:tc>
@@ -8823,15 +6574,7 @@
         <w:pStyle w:val="BodyText"/>
       </w:pPr>
       <w:r>
-        <w:t xml:space="preserve">{% </w:t>
-      </w:r>
-      <w:proofErr w:type="spellStart"/>
-      <w:r>
-        <w:t>endfor</w:t>
-      </w:r>
-      <w:proofErr w:type="spellEnd"/>
-      <w:r>
-        <w:t xml:space="preserve"> %}</w:t>
+        <w:t>{% endfor %}</w:t>
       </w:r>
     </w:p>
     <w:p>
@@ -8852,29 +6595,8 @@
       </w:r>
     </w:p>
     <w:p>
-      <w:proofErr w:type="gramStart"/>
-      <w:r>
-        <w:t xml:space="preserve">{{ </w:t>
-      </w:r>
-      <w:proofErr w:type="spellStart"/>
-      <w:r>
-        <w:t>proactive</w:t>
-      </w:r>
-      <w:proofErr w:type="gramEnd"/>
-      <w:r>
-        <w:t>_testing_</w:t>
-      </w:r>
-      <w:proofErr w:type="gramStart"/>
-      <w:r>
-        <w:t>programme</w:t>
-      </w:r>
-      <w:proofErr w:type="spellEnd"/>
-      <w:r>
-        <w:t xml:space="preserve"> }</w:t>
-      </w:r>
-      <w:proofErr w:type="gramEnd"/>
-      <w:r>
-        <w:t>}</w:t>
+      <w:r>
+        <w:t>{{ proactive_testing_programme }}</w:t>
       </w:r>
     </w:p>
     <w:p/>
@@ -8887,29 +6609,8 @@
       </w:r>
     </w:p>
     <w:p>
-      <w:proofErr w:type="gramStart"/>
-      <w:r>
-        <w:t xml:space="preserve">{{ </w:t>
-      </w:r>
-      <w:proofErr w:type="spellStart"/>
-      <w:r>
-        <w:t>incident</w:t>
-      </w:r>
-      <w:proofErr w:type="gramEnd"/>
-      <w:r>
-        <w:t>_response_plan_</w:t>
-      </w:r>
-      <w:proofErr w:type="gramStart"/>
-      <w:r>
-        <w:t>outline</w:t>
-      </w:r>
-      <w:proofErr w:type="spellEnd"/>
-      <w:r>
-        <w:t xml:space="preserve"> }</w:t>
-      </w:r>
-      <w:proofErr w:type="gramEnd"/>
-      <w:r>
-        <w:t>}</w:t>
+      <w:r>
+        <w:t>{{ incident_response_plan_outline }}</w:t>
       </w:r>
     </w:p>
     <w:p/>
@@ -8922,29 +6623,8 @@
       </w:r>
     </w:p>
     <w:p>
-      <w:proofErr w:type="gramStart"/>
-      <w:r>
-        <w:t xml:space="preserve">{{ </w:t>
-      </w:r>
-      <w:proofErr w:type="spellStart"/>
-      <w:r>
-        <w:t>disaster</w:t>
-      </w:r>
-      <w:proofErr w:type="gramEnd"/>
-      <w:r>
-        <w:t>_recovery_plan_</w:t>
-      </w:r>
-      <w:proofErr w:type="gramStart"/>
-      <w:r>
-        <w:t>outline</w:t>
-      </w:r>
-      <w:proofErr w:type="spellEnd"/>
-      <w:r>
-        <w:t xml:space="preserve"> }</w:t>
-      </w:r>
-      <w:proofErr w:type="gramEnd"/>
-      <w:r>
-        <w:t>}</w:t>
+      <w:r>
+        <w:t>{{ disaster_recovery_plan_outline }}</w:t>
       </w:r>
     </w:p>
     <w:p/>
@@ -9030,39 +6710,7 @@
     <w:p/>
     <w:p>
       <w:r>
-        <w:t xml:space="preserve">These phases delineate the strategies required to implement a robust security, </w:t>
-      </w:r>
-      <w:proofErr w:type="spellStart"/>
-      <w:r>
-        <w:t>goveneance</w:t>
-      </w:r>
-      <w:proofErr w:type="spellEnd"/>
-      <w:r>
-        <w:t xml:space="preserve"> and compliance solution to effectively defend </w:t>
-      </w:r>
-      <w:proofErr w:type="gramStart"/>
-      <w:r>
-        <w:t xml:space="preserve">{{ </w:t>
-      </w:r>
-      <w:proofErr w:type="spellStart"/>
-      <w:r>
-        <w:t>customer</w:t>
-      </w:r>
-      <w:proofErr w:type="gramEnd"/>
-      <w:r>
-        <w:t>_</w:t>
-      </w:r>
-      <w:proofErr w:type="gramStart"/>
-      <w:r>
-        <w:t>name</w:t>
-      </w:r>
-      <w:proofErr w:type="spellEnd"/>
-      <w:r>
-        <w:t xml:space="preserve"> }</w:t>
-      </w:r>
-      <w:proofErr w:type="gramEnd"/>
-      <w:r>
-        <w:t>} moving forward.  The phases are made up as such:</w:t>
+        <w:t>These phases delineate the strategies required to implement a robust security, goveneance and compliance solution to effectively defend {{ customer_name }} moving forward.  The phases are made up as such:</w:t>
       </w:r>
     </w:p>
     <w:p/>
@@ -9462,59 +7110,13 @@
         </w:rPr>
         <w:t xml:space="preserve">Please find below a bespoke roadmap of suggested improvements tailored for </w:t>
       </w:r>
-      <w:proofErr w:type="gramStart"/>
       <w:r>
         <w:rPr>
           <w:rFonts w:ascii="Roboto" w:hAnsi="Roboto"/>
           <w:sz w:val="20"/>
           <w:szCs w:val="20"/>
         </w:rPr>
-        <w:t xml:space="preserve">{{ </w:t>
-      </w:r>
-      <w:proofErr w:type="spellStart"/>
-      <w:r>
-        <w:rPr>
-          <w:rFonts w:ascii="Roboto" w:hAnsi="Roboto"/>
-          <w:sz w:val="20"/>
-          <w:szCs w:val="20"/>
-        </w:rPr>
-        <w:t>customer</w:t>
-      </w:r>
-      <w:proofErr w:type="gramEnd"/>
-      <w:r>
-        <w:rPr>
-          <w:rFonts w:ascii="Roboto" w:hAnsi="Roboto"/>
-          <w:sz w:val="20"/>
-          <w:szCs w:val="20"/>
-        </w:rPr>
-        <w:t>_</w:t>
-      </w:r>
-      <w:proofErr w:type="gramStart"/>
-      <w:r>
-        <w:rPr>
-          <w:rFonts w:ascii="Roboto" w:hAnsi="Roboto"/>
-          <w:sz w:val="20"/>
-          <w:szCs w:val="20"/>
-        </w:rPr>
-        <w:t>name</w:t>
-      </w:r>
-      <w:proofErr w:type="spellEnd"/>
-      <w:r>
-        <w:rPr>
-          <w:rFonts w:ascii="Roboto" w:hAnsi="Roboto"/>
-          <w:sz w:val="20"/>
-          <w:szCs w:val="20"/>
-        </w:rPr>
-        <w:t xml:space="preserve"> }</w:t>
-      </w:r>
-      <w:proofErr w:type="gramEnd"/>
-      <w:r>
-        <w:rPr>
-          <w:rFonts w:ascii="Roboto" w:hAnsi="Roboto"/>
-          <w:sz w:val="20"/>
-          <w:szCs w:val="20"/>
-        </w:rPr>
-        <w:t>}</w:t>
+        <w:t>{{ customer_name }}</w:t>
       </w:r>
       <w:r>
         <w:rPr>
@@ -9535,32 +7137,14 @@
     </w:p>
     <w:p/>
     <w:p>
-      <w:proofErr w:type="gramStart"/>
       <w:r>
         <w:t>{{</w:t>
       </w:r>
       <w:r>
-        <w:t xml:space="preserve"> </w:t>
-      </w:r>
-      <w:proofErr w:type="spellStart"/>
-      <w:r>
-        <w:t>partnership</w:t>
-      </w:r>
-      <w:proofErr w:type="gramEnd"/>
-      <w:r>
-        <w:t>_</w:t>
-      </w:r>
-      <w:proofErr w:type="gramStart"/>
-      <w:r>
-        <w:t>details</w:t>
-      </w:r>
-      <w:proofErr w:type="spellEnd"/>
-      <w:r>
-        <w:t xml:space="preserve"> }</w:t>
-      </w:r>
-      <w:proofErr w:type="gramEnd"/>
-      <w:r>
-        <w:t>}</w:t>
+        <w:t xml:space="preserve"> partnership_details</w:t>
+      </w:r>
+      <w:r>
+        <w:t xml:space="preserve"> }}</w:t>
       </w:r>
     </w:p>
     <w:p>
@@ -9719,26 +7303,11 @@
             <w:hideMark/>
           </w:tcPr>
           <w:p>
-            <w:proofErr w:type="gramStart"/>
             <w:r>
               <w:rPr>
                 <w:rFonts w:cs="Courier New"/>
               </w:rPr>
-              <w:t xml:space="preserve">{{ </w:t>
-            </w:r>
-            <w:proofErr w:type="spellStart"/>
-            <w:r>
-              <w:rPr>
-                <w:rFonts w:cs="Courier New"/>
-              </w:rPr>
-              <w:t>r</w:t>
-            </w:r>
-            <w:proofErr w:type="gramEnd"/>
-            <w:r>
-              <w:rPr>
-                <w:rFonts w:cs="Courier New"/>
-              </w:rPr>
-              <w:t>.phase_</w:t>
+              <w:t>{{ r.phase_</w:t>
             </w:r>
             <w:r>
               <w:rPr>
@@ -9746,7 +7315,6 @@
               </w:rPr>
               <w:t>title</w:t>
             </w:r>
-            <w:proofErr w:type="spellEnd"/>
             <w:r>
               <w:rPr>
                 <w:rFonts w:cs="Courier New"/>
@@ -9816,33 +7384,11 @@
                 <w:rFonts w:cs="Courier New"/>
               </w:rPr>
             </w:pPr>
-            <w:proofErr w:type="gramStart"/>
             <w:r>
               <w:rPr>
                 <w:rFonts w:cs="Courier New"/>
               </w:rPr>
-              <w:t xml:space="preserve">{{ </w:t>
-            </w:r>
-            <w:proofErr w:type="spellStart"/>
-            <w:r>
-              <w:rPr>
-                <w:rFonts w:cs="Courier New"/>
-              </w:rPr>
-              <w:t>r</w:t>
-            </w:r>
-            <w:proofErr w:type="gramEnd"/>
-            <w:r>
-              <w:rPr>
-                <w:rFonts w:cs="Courier New"/>
-              </w:rPr>
-              <w:t>.timeline</w:t>
-            </w:r>
-            <w:proofErr w:type="spellEnd"/>
-            <w:r>
-              <w:rPr>
-                <w:rFonts w:cs="Courier New"/>
-              </w:rPr>
-              <w:t xml:space="preserve"> }}</w:t>
+              <w:t>{{ r.timeline }}</w:t>
             </w:r>
           </w:p>
         </w:tc>
@@ -9898,33 +7444,11 @@
             <w:hideMark/>
           </w:tcPr>
           <w:p>
-            <w:proofErr w:type="gramStart"/>
             <w:r>
               <w:rPr>
                 <w:rFonts w:cs="Courier New"/>
               </w:rPr>
-              <w:t xml:space="preserve">{{ </w:t>
-            </w:r>
-            <w:proofErr w:type="spellStart"/>
-            <w:r>
-              <w:rPr>
-                <w:rFonts w:cs="Courier New"/>
-              </w:rPr>
-              <w:t>r</w:t>
-            </w:r>
-            <w:proofErr w:type="gramEnd"/>
-            <w:r>
-              <w:rPr>
-                <w:rFonts w:cs="Courier New"/>
-              </w:rPr>
-              <w:t>.primary_objective</w:t>
-            </w:r>
-            <w:proofErr w:type="spellEnd"/>
-            <w:r>
-              <w:rPr>
-                <w:rFonts w:cs="Courier New"/>
-              </w:rPr>
-              <w:t xml:space="preserve"> }}</w:t>
+              <w:t>{{ r.primary_objective }}</w:t>
             </w:r>
           </w:p>
         </w:tc>
@@ -9989,33 +7513,11 @@
                 <w:rFonts w:cs="Courier New"/>
               </w:rPr>
             </w:pPr>
-            <w:proofErr w:type="gramStart"/>
             <w:r>
               <w:rPr>
                 <w:rFonts w:cs="Courier New"/>
               </w:rPr>
-              <w:t xml:space="preserve">{{ </w:t>
-            </w:r>
-            <w:proofErr w:type="spellStart"/>
-            <w:r>
-              <w:rPr>
-                <w:rFonts w:cs="Courier New"/>
-              </w:rPr>
-              <w:t>r.key</w:t>
-            </w:r>
-            <w:proofErr w:type="gramEnd"/>
-            <w:r>
-              <w:rPr>
-                <w:rFonts w:cs="Courier New"/>
-              </w:rPr>
-              <w:t>_deliverables</w:t>
-            </w:r>
-            <w:proofErr w:type="spellEnd"/>
-            <w:r>
-              <w:rPr>
-                <w:rFonts w:cs="Courier New"/>
-              </w:rPr>
-              <w:t xml:space="preserve"> }}</w:t>
+              <w:t>{{ r.key_deliverables }}</w:t>
             </w:r>
           </w:p>
         </w:tc>
@@ -10071,33 +7573,11 @@
             <w:hideMark/>
           </w:tcPr>
           <w:p>
-            <w:proofErr w:type="gramStart"/>
             <w:r>
               <w:rPr>
                 <w:rFonts w:cs="Courier New"/>
               </w:rPr>
-              <w:t xml:space="preserve">{{ </w:t>
-            </w:r>
-            <w:proofErr w:type="spellStart"/>
-            <w:r>
-              <w:rPr>
-                <w:rFonts w:cs="Courier New"/>
-              </w:rPr>
-              <w:t>r</w:t>
-            </w:r>
-            <w:proofErr w:type="gramEnd"/>
-            <w:r>
-              <w:rPr>
-                <w:rFonts w:cs="Courier New"/>
-              </w:rPr>
-              <w:t>.estimated_effort</w:t>
-            </w:r>
-            <w:proofErr w:type="spellEnd"/>
-            <w:r>
-              <w:rPr>
-                <w:rFonts w:cs="Courier New"/>
-              </w:rPr>
-              <w:t xml:space="preserve"> }}</w:t>
+              <w:t>{{ r.estimated_effort }}</w:t>
             </w:r>
           </w:p>
         </w:tc>
@@ -10157,37 +7637,7 @@
               <w:rPr>
                 <w:rFonts w:cs="Courier New"/>
               </w:rPr>
-              <w:t xml:space="preserve">{% </w:t>
-            </w:r>
-            <w:proofErr w:type="spellStart"/>
-            <w:r>
-              <w:rPr>
-                <w:rFonts w:cs="Courier New"/>
-              </w:rPr>
-              <w:t>for m</w:t>
-            </w:r>
-            <w:proofErr w:type="spellEnd"/>
-            <w:r>
-              <w:rPr>
-                <w:rFonts w:cs="Courier New"/>
-              </w:rPr>
-              <w:t xml:space="preserve"> in </w:t>
-            </w:r>
-            <w:proofErr w:type="spellStart"/>
-            <w:proofErr w:type="gramStart"/>
-            <w:r>
-              <w:rPr>
-                <w:rFonts w:cs="Courier New"/>
-              </w:rPr>
-              <w:t>r.milestones</w:t>
-            </w:r>
-            <w:proofErr w:type="spellEnd"/>
-            <w:proofErr w:type="gramEnd"/>
-            <w:r>
-              <w:rPr>
-                <w:rFonts w:cs="Courier New"/>
-              </w:rPr>
-              <w:t xml:space="preserve"> %}</w:t>
+              <w:t>{% for m in r.milestones %}</w:t>
             </w:r>
           </w:p>
           <w:p>
@@ -10196,21 +7646,7 @@
                 <w:rFonts w:cs="Courier New"/>
               </w:rPr>
               <w:lastRenderedPageBreak/>
-              <w:t xml:space="preserve">• </w:t>
-            </w:r>
-            <w:proofErr w:type="gramStart"/>
-            <w:r>
-              <w:rPr>
-                <w:rFonts w:cs="Courier New"/>
-              </w:rPr>
-              <w:t>{{ m</w:t>
-            </w:r>
-            <w:proofErr w:type="gramEnd"/>
-            <w:r>
-              <w:rPr>
-                <w:rFonts w:cs="Courier New"/>
-              </w:rPr>
-              <w:t xml:space="preserve"> }}</w:t>
+              <w:t>• {{ m }}</w:t>
             </w:r>
           </w:p>
           <w:p>
@@ -10224,21 +7660,7 @@
               <w:rPr>
                 <w:rFonts w:cs="Courier New"/>
               </w:rPr>
-              <w:t xml:space="preserve">{% </w:t>
-            </w:r>
-            <w:proofErr w:type="spellStart"/>
-            <w:r>
-              <w:rPr>
-                <w:rFonts w:cs="Courier New"/>
-              </w:rPr>
-              <w:t>endfor</w:t>
-            </w:r>
-            <w:proofErr w:type="spellEnd"/>
-            <w:r>
-              <w:rPr>
-                <w:rFonts w:cs="Courier New"/>
-              </w:rPr>
-              <w:t xml:space="preserve"> %}</w:t>
+              <w:t>{% endfor %}</w:t>
             </w:r>
           </w:p>
         </w:tc>
@@ -10295,33 +7717,11 @@
             <w:hideMark/>
           </w:tcPr>
           <w:p>
-            <w:proofErr w:type="gramStart"/>
             <w:r>
               <w:rPr>
                 <w:rFonts w:cs="Courier New"/>
               </w:rPr>
-              <w:t xml:space="preserve">{{ </w:t>
-            </w:r>
-            <w:proofErr w:type="spellStart"/>
-            <w:r>
-              <w:rPr>
-                <w:rFonts w:cs="Courier New"/>
-              </w:rPr>
-              <w:t>r</w:t>
-            </w:r>
-            <w:proofErr w:type="gramEnd"/>
-            <w:r>
-              <w:rPr>
-                <w:rFonts w:cs="Courier New"/>
-              </w:rPr>
-              <w:t>.business_value_delivered</w:t>
-            </w:r>
-            <w:proofErr w:type="spellEnd"/>
-            <w:r>
-              <w:rPr>
-                <w:rFonts w:cs="Courier New"/>
-              </w:rPr>
-              <w:t xml:space="preserve"> }}</w:t>
+              <w:t>{{ r.business_value_delivered }}</w:t>
             </w:r>
           </w:p>
         </w:tc>
@@ -10377,33 +7777,11 @@
             <w:hideMark/>
           </w:tcPr>
           <w:p>
-            <w:proofErr w:type="gramStart"/>
             <w:r>
               <w:rPr>
                 <w:rFonts w:cs="Courier New"/>
               </w:rPr>
-              <w:t xml:space="preserve">{{ </w:t>
-            </w:r>
-            <w:proofErr w:type="spellStart"/>
-            <w:r>
-              <w:rPr>
-                <w:rFonts w:cs="Courier New"/>
-              </w:rPr>
-              <w:t>r</w:t>
-            </w:r>
-            <w:proofErr w:type="gramEnd"/>
-            <w:r>
-              <w:rPr>
-                <w:rFonts w:cs="Courier New"/>
-              </w:rPr>
-              <w:t>.resource_requirements</w:t>
-            </w:r>
-            <w:proofErr w:type="spellEnd"/>
-            <w:r>
-              <w:rPr>
-                <w:rFonts w:cs="Courier New"/>
-              </w:rPr>
-              <w:t xml:space="preserve"> }}</w:t>
+              <w:t>{{ r.resource_requirements }}</w:t>
             </w:r>
           </w:p>
         </w:tc>
@@ -10421,21 +7799,7 @@
         <w:rPr>
           <w:rStyle w:val="HTMLCode"/>
         </w:rPr>
-        <w:t xml:space="preserve">{% </w:t>
-      </w:r>
-      <w:proofErr w:type="spellStart"/>
-      <w:r>
-        <w:rPr>
-          <w:rStyle w:val="HTMLCode"/>
-        </w:rPr>
-        <w:t>endfor</w:t>
-      </w:r>
-      <w:proofErr w:type="spellEnd"/>
-      <w:r>
-        <w:rPr>
-          <w:rStyle w:val="HTMLCode"/>
-        </w:rPr>
-        <w:t xml:space="preserve"> %}</w:t>
+        <w:t>{% endfor %}</w:t>
       </w:r>
     </w:p>
     <w:p/>
@@ -10828,15 +8192,7 @@
     <w:p/>
     <w:p>
       <w:r>
-        <w:t xml:space="preserve">Since the beginning, we have built our business on first-class customer service and employing the best people available. We continue that ethos today, constantly building and maintaining </w:t>
-      </w:r>
-      <w:proofErr w:type="gramStart"/>
-      <w:r>
-        <w:t>our</w:t>
-      </w:r>
-      <w:proofErr w:type="gramEnd"/>
-      <w:r>
-        <w:t xml:space="preserve"> </w:t>
+        <w:t xml:space="preserve">Since the beginning, we have built our business on first-class customer service and employing the best people available. We continue that ethos today, constantly building and maintaining our </w:t>
       </w:r>
     </w:p>
     <w:p>
@@ -11096,53 +8452,12 @@
         </w:rPr>
         <w:t>[</w:t>
       </w:r>
-      <w:proofErr w:type="gramStart"/>
       <w:r>
         <w:rPr>
           <w:sz w:val="13"/>
           <w:szCs w:val="18"/>
         </w:rPr>
-        <w:t xml:space="preserve">{{ </w:t>
-      </w:r>
-      <w:proofErr w:type="spellStart"/>
-      <w:r>
-        <w:rPr>
-          <w:sz w:val="13"/>
-          <w:szCs w:val="18"/>
-        </w:rPr>
-        <w:t>customer</w:t>
-      </w:r>
-      <w:proofErr w:type="gramEnd"/>
-      <w:r>
-        <w:rPr>
-          <w:sz w:val="13"/>
-          <w:szCs w:val="18"/>
-        </w:rPr>
-        <w:t>_</w:t>
-      </w:r>
-      <w:proofErr w:type="gramStart"/>
-      <w:r>
-        <w:rPr>
-          <w:sz w:val="13"/>
-          <w:szCs w:val="18"/>
-        </w:rPr>
-        <w:t>name</w:t>
-      </w:r>
-      <w:proofErr w:type="spellEnd"/>
-      <w:r>
-        <w:rPr>
-          <w:sz w:val="13"/>
-          <w:szCs w:val="18"/>
-        </w:rPr>
-        <w:t xml:space="preserve"> }</w:t>
-      </w:r>
-      <w:proofErr w:type="gramEnd"/>
-      <w:r>
-        <w:rPr>
-          <w:sz w:val="13"/>
-          <w:szCs w:val="18"/>
-        </w:rPr>
-        <w:t>}</w:t>
+        <w:t>{{ customer_name }}</w:t>
       </w:r>
       <w:r>
         <w:rPr>
@@ -11376,21 +8691,12 @@
                                 <w:szCs w:val="18"/>
                               </w:rPr>
                             </w:pPr>
-                            <w:proofErr w:type="gramStart"/>
                             <w:r>
                               <w:rPr>
                                 <w:sz w:val="13"/>
                                 <w:szCs w:val="18"/>
                               </w:rPr>
-                              <w:t>In order to</w:t>
-                            </w:r>
-                            <w:proofErr w:type="gramEnd"/>
-                            <w:r>
-                              <w:rPr>
-                                <w:sz w:val="13"/>
-                                <w:szCs w:val="18"/>
-                              </w:rPr>
-                              <w:t xml:space="preserve"> avoid delays to the project, </w:t>
+                              <w:t xml:space="preserve">In order to avoid delays to the project, </w:t>
                             </w:r>
                             <w:r>
                               <w:rPr>
@@ -11917,23 +9223,7 @@
                                 <w:sz w:val="13"/>
                                 <w:szCs w:val="18"/>
                               </w:rPr>
-                              <w:t xml:space="preserve"> projects </w:t>
-                            </w:r>
-                            <w:proofErr w:type="gramStart"/>
-                            <w:r>
-                              <w:rPr>
-                                <w:sz w:val="13"/>
-                                <w:szCs w:val="18"/>
-                              </w:rPr>
-                              <w:t>is</w:t>
-                            </w:r>
-                            <w:proofErr w:type="gramEnd"/>
-                            <w:r>
-                              <w:rPr>
-                                <w:sz w:val="13"/>
-                                <w:szCs w:val="18"/>
-                              </w:rPr>
-                              <w:t xml:space="preserve"> planned and met.</w:t>
+                              <w:t xml:space="preserve"> projects is planned and met.</w:t>
                             </w:r>
                           </w:p>
                           <w:p>
@@ -14733,21 +12023,8 @@
             <w:r>
               <w:t xml:space="preserve"> </w:t>
             </w:r>
-            <w:proofErr w:type="gramStart"/>
-            <w:r>
-              <w:t xml:space="preserve">{{ </w:t>
-            </w:r>
-            <w:proofErr w:type="spellStart"/>
-            <w:r>
-              <w:t>consultant</w:t>
-            </w:r>
-            <w:proofErr w:type="gramEnd"/>
-            <w:r>
-              <w:t>_name</w:t>
-            </w:r>
-            <w:proofErr w:type="spellEnd"/>
-            <w:r>
-              <w:t xml:space="preserve"> }}</w:t>
+            <w:r>
+              <w:t>{{ consultant_name }}</w:t>
             </w:r>
           </w:p>
         </w:tc>
@@ -15468,38 +12745,11 @@
             <w:tcW w:w="2173" w:type="dxa"/>
           </w:tcPr>
           <w:p>
-            <w:proofErr w:type="spellStart"/>
-            <w:proofErr w:type="gramStart"/>
-            <w:r>
-              <w:t>J.Dell</w:t>
-            </w:r>
-            <w:proofErr w:type="spellEnd"/>
-            <w:proofErr w:type="gramEnd"/>
-            <w:r>
-              <w:t xml:space="preserve"> / </w:t>
-            </w:r>
-            <w:proofErr w:type="spellStart"/>
-            <w:proofErr w:type="gramStart"/>
-            <w:r>
-              <w:t>A.</w:t>
-            </w:r>
-            <w:r>
-              <w:t>Sweeney</w:t>
-            </w:r>
-            <w:proofErr w:type="spellEnd"/>
-            <w:proofErr w:type="gramEnd"/>
-            <w:r>
-              <w:t xml:space="preserve"> / </w:t>
-            </w:r>
-            <w:proofErr w:type="spellStart"/>
-            <w:proofErr w:type="gramStart"/>
-            <w:r>
-              <w:t>J.Towle</w:t>
-            </w:r>
-            <w:proofErr w:type="spellEnd"/>
-            <w:proofErr w:type="gramEnd"/>
-            <w:r>
-              <w:t xml:space="preserve"> / R. McClafferty</w:t>
+            <w:r>
+              <w:t>J.Dell / A.</w:t>
+            </w:r>
+            <w:r>
+              <w:t>Sweeney / J.Towle / R. McClafferty</w:t>
             </w:r>
           </w:p>
         </w:tc>
@@ -15540,21 +12790,8 @@
             <w:tcW w:w="2173" w:type="dxa"/>
           </w:tcPr>
           <w:p>
-            <w:proofErr w:type="gramStart"/>
-            <w:r>
-              <w:t xml:space="preserve">{{ </w:t>
-            </w:r>
-            <w:proofErr w:type="spellStart"/>
-            <w:r>
-              <w:t>consultant</w:t>
-            </w:r>
-            <w:proofErr w:type="gramEnd"/>
-            <w:r>
-              <w:t>_name</w:t>
-            </w:r>
-            <w:proofErr w:type="spellEnd"/>
-            <w:r>
-              <w:t xml:space="preserve"> }}</w:t>
+            <w:r>
+              <w:t>{{ consultant_name }}</w:t>
             </w:r>
           </w:p>
         </w:tc>
@@ -15748,29 +12985,8 @@
             </w:tcBorders>
           </w:tcPr>
           <w:p>
-            <w:proofErr w:type="gramStart"/>
-            <w:r>
-              <w:t xml:space="preserve">{{ </w:t>
-            </w:r>
-            <w:proofErr w:type="spellStart"/>
-            <w:r>
-              <w:t>customer</w:t>
-            </w:r>
-            <w:proofErr w:type="gramEnd"/>
-            <w:r>
-              <w:t>_</w:t>
-            </w:r>
-            <w:proofErr w:type="gramStart"/>
-            <w:r>
-              <w:t>name</w:t>
-            </w:r>
-            <w:proofErr w:type="spellEnd"/>
-            <w:r>
-              <w:t xml:space="preserve"> }</w:t>
-            </w:r>
-            <w:proofErr w:type="gramEnd"/>
-            <w:r>
-              <w:t>}</w:t>
+            <w:r>
+              <w:t>{{ customer_name }}</w:t>
             </w:r>
           </w:p>
           <w:p/>
@@ -19824,6 +17040,55 @@
 </file>
 
 <file path=customXml/item1.xml><?xml version="1.0" encoding="utf-8"?>
+<?mso-contentType ?>
+<FormTemplates xmlns="http://schemas.microsoft.com/sharepoint/v3/contenttype/forms">
+  <Display>DocumentLibraryForm</Display>
+  <Edit>DocumentLibraryForm</Edit>
+  <New>DocumentLibraryForm</New>
+</FormTemplates>
+</file>
+
+<file path=customXml/item2.xml><?xml version="1.0" encoding="utf-8"?>
+<p:properties xmlns:p="http://schemas.microsoft.com/office/2006/metadata/properties" xmlns:xsi="http://www.w3.org/2001/XMLSchema-instance" xmlns:pc="http://schemas.microsoft.com/office/infopath/2007/PartnerControls">
+  <documentManagement>
+    <_ip_UnifiedCompliancePolicyUIAction xmlns="http://schemas.microsoft.com/sharepoint/v3" xsi:nil="true"/>
+    <_ip_UnifiedCompliancePolicyProperties xmlns="http://schemas.microsoft.com/sharepoint/v3" xsi:nil="true"/>
+    <lcf76f155ced4ddcb4097134ff3c332f xmlns="bc555557-3e8b-4e67-83dc-4a843c87bf48">
+      <Terms xmlns="http://schemas.microsoft.com/office/infopath/2007/PartnerControls"/>
+    </lcf76f155ced4ddcb4097134ff3c332f>
+    <TaxCatchAll xmlns="13e5e634-19bb-4da3-8eb1-d732f895062a" xsi:nil="true"/>
+    <SharedWithUsers xmlns="13e5e634-19bb-4da3-8eb1-d732f895062a">
+      <UserInfo>
+        <DisplayName>James Dell</DisplayName>
+        <AccountId>10</AccountId>
+        <AccountType/>
+      </UserInfo>
+      <UserInfo>
+        <DisplayName>Luke Finch</DisplayName>
+        <AccountId>44</AccountId>
+        <AccountType/>
+      </UserInfo>
+      <UserInfo>
+        <DisplayName>Sam Wray</DisplayName>
+        <AccountId>39</AccountId>
+        <AccountType/>
+      </UserInfo>
+      <UserInfo>
+        <DisplayName>Nick Johns</DisplayName>
+        <AccountId>18</AccountId>
+        <AccountType/>
+      </UserInfo>
+      <UserInfo>
+        <DisplayName>Justin Towle</DisplayName>
+        <AccountId>70</AccountId>
+        <AccountType/>
+      </UserInfo>
+    </SharedWithUsers>
+  </documentManagement>
+</p:properties>
+</file>
+
+<file path=customXml/item3.xml><?xml version="1.0" encoding="utf-8"?>
 <ct:contentTypeSchema xmlns:ct="http://schemas.microsoft.com/office/2006/metadata/contentType" xmlns:ma="http://schemas.microsoft.com/office/2006/metadata/properties/metaAttributes" ct:_="" ma:_="" ma:contentTypeName="Document" ma:contentTypeID="0x01010035785702D987474A98E5EB52BEDD3AA6" ma:contentTypeVersion="19" ma:contentTypeDescription="Create a new document." ma:contentTypeScope="" ma:versionID="7475e8a14b23e3b44613142ca3702c71">
   <xsd:schema xmlns:xsd="http://www.w3.org/2001/XMLSchema" xmlns:xs="http://www.w3.org/2001/XMLSchema" xmlns:p="http://schemas.microsoft.com/office/2006/metadata/properties" xmlns:ns1="http://schemas.microsoft.com/sharepoint/v3" xmlns:ns2="bc555557-3e8b-4e67-83dc-4a843c87bf48" xmlns:ns3="13e5e634-19bb-4da3-8eb1-d732f895062a" targetNamespace="http://schemas.microsoft.com/office/2006/metadata/properties" ma:root="true" ma:fieldsID="a0e591cb8f16aef1e2d445ad70521c76" ns1:_="" ns2:_="" ns3:_="">
     <xsd:import namespace="http://schemas.microsoft.com/sharepoint/v3"/>
@@ -20081,60 +17346,31 @@
 </ct:contentTypeSchema>
 </file>
 
-<file path=customXml/item2.xml><?xml version="1.0" encoding="utf-8"?>
+<file path=customXml/item4.xml><?xml version="1.0" encoding="utf-8"?>
 <b:Sources xmlns:b="http://schemas.openxmlformats.org/officeDocument/2006/bibliography" xmlns="http://schemas.openxmlformats.org/officeDocument/2006/bibliography" SelectedStyle="\APASixthEditionOfficeOnline.xsl" StyleName="APA" Version="6"/>
 </file>
 
-<file path=customXml/item3.xml><?xml version="1.0" encoding="utf-8"?>
-<p:properties xmlns:p="http://schemas.microsoft.com/office/2006/metadata/properties" xmlns:xsi="http://www.w3.org/2001/XMLSchema-instance" xmlns:pc="http://schemas.microsoft.com/office/infopath/2007/PartnerControls">
-  <documentManagement>
-    <_ip_UnifiedCompliancePolicyUIAction xmlns="http://schemas.microsoft.com/sharepoint/v3" xsi:nil="true"/>
-    <_ip_UnifiedCompliancePolicyProperties xmlns="http://schemas.microsoft.com/sharepoint/v3" xsi:nil="true"/>
-    <lcf76f155ced4ddcb4097134ff3c332f xmlns="bc555557-3e8b-4e67-83dc-4a843c87bf48">
-      <Terms xmlns="http://schemas.microsoft.com/office/infopath/2007/PartnerControls"/>
-    </lcf76f155ced4ddcb4097134ff3c332f>
-    <TaxCatchAll xmlns="13e5e634-19bb-4da3-8eb1-d732f895062a" xsi:nil="true"/>
-    <SharedWithUsers xmlns="13e5e634-19bb-4da3-8eb1-d732f895062a">
-      <UserInfo>
-        <DisplayName>James Dell</DisplayName>
-        <AccountId>10</AccountId>
-        <AccountType/>
-      </UserInfo>
-      <UserInfo>
-        <DisplayName>Luke Finch</DisplayName>
-        <AccountId>44</AccountId>
-        <AccountType/>
-      </UserInfo>
-      <UserInfo>
-        <DisplayName>Sam Wray</DisplayName>
-        <AccountId>39</AccountId>
-        <AccountType/>
-      </UserInfo>
-      <UserInfo>
-        <DisplayName>Nick Johns</DisplayName>
-        <AccountId>18</AccountId>
-        <AccountType/>
-      </UserInfo>
-      <UserInfo>
-        <DisplayName>Justin Towle</DisplayName>
-        <AccountId>70</AccountId>
-        <AccountType/>
-      </UserInfo>
-    </SharedWithUsers>
-  </documentManagement>
-</p:properties>
+<file path=customXml/itemProps1.xml><?xml version="1.0" encoding="utf-8"?>
+<ds:datastoreItem xmlns:ds="http://schemas.openxmlformats.org/officeDocument/2006/customXml" ds:itemID="{02C30E68-946A-4504-B925-FF5230B8A4C3}">
+  <ds:schemaRefs>
+    <ds:schemaRef ds:uri="http://schemas.microsoft.com/sharepoint/v3/contenttype/forms"/>
+  </ds:schemaRefs>
+</ds:datastoreItem>
 </file>
 
-<file path=customXml/item4.xml><?xml version="1.0" encoding="utf-8"?>
-<?mso-contentType ?>
-<FormTemplates xmlns="http://schemas.microsoft.com/sharepoint/v3/contenttype/forms">
-  <Display>DocumentLibraryForm</Display>
-  <Edit>DocumentLibraryForm</Edit>
-  <New>DocumentLibraryForm</New>
-</FormTemplates>
+<file path=customXml/itemProps2.xml><?xml version="1.0" encoding="utf-8"?>
+<ds:datastoreItem xmlns:ds="http://schemas.openxmlformats.org/officeDocument/2006/customXml" ds:itemID="{EDF12601-A8A7-4B7A-9481-1111248E774A}">
+  <ds:schemaRefs>
+    <ds:schemaRef ds:uri="http://schemas.microsoft.com/office/2006/metadata/properties"/>
+    <ds:schemaRef ds:uri="http://schemas.microsoft.com/office/infopath/2007/PartnerControls"/>
+    <ds:schemaRef ds:uri="http://schemas.microsoft.com/sharepoint/v3"/>
+    <ds:schemaRef ds:uri="bc555557-3e8b-4e67-83dc-4a843c87bf48"/>
+    <ds:schemaRef ds:uri="13e5e634-19bb-4da3-8eb1-d732f895062a"/>
+  </ds:schemaRefs>
+</ds:datastoreItem>
 </file>
 
-<file path=customXml/itemProps1.xml><?xml version="1.0" encoding="utf-8"?>
+<file path=customXml/itemProps3.xml><?xml version="1.0" encoding="utf-8"?>
 <ds:datastoreItem xmlns:ds="http://schemas.openxmlformats.org/officeDocument/2006/customXml" ds:itemID="{7F9D1B01-7FEE-4553-9877-3B31209422E5}">
   <ds:schemaRefs>
     <ds:schemaRef ds:uri="http://schemas.microsoft.com/office/2006/metadata/contentType"/>
@@ -20154,30 +17390,10 @@
 </ds:datastoreItem>
 </file>
 
-<file path=customXml/itemProps2.xml><?xml version="1.0" encoding="utf-8"?>
+<file path=customXml/itemProps4.xml><?xml version="1.0" encoding="utf-8"?>
 <ds:datastoreItem xmlns:ds="http://schemas.openxmlformats.org/officeDocument/2006/customXml" ds:itemID="{41B34B53-803B-4600-951E-8C7B6ABDE6A5}">
   <ds:schemaRefs>
     <ds:schemaRef ds:uri="http://schemas.openxmlformats.org/officeDocument/2006/bibliography"/>
   </ds:schemaRefs>
 </ds:datastoreItem>
-</file>
-
-<file path=customXml/itemProps3.xml><?xml version="1.0" encoding="utf-8"?>
-<ds:datastoreItem xmlns:ds="http://schemas.openxmlformats.org/officeDocument/2006/customXml" ds:itemID="{EDF12601-A8A7-4B7A-9481-1111248E774A}">
-  <ds:schemaRefs>
-    <ds:schemaRef ds:uri="http://schemas.microsoft.com/office/2006/metadata/properties"/>
-    <ds:schemaRef ds:uri="http://schemas.microsoft.com/office/infopath/2007/PartnerControls"/>
-    <ds:schemaRef ds:uri="http://schemas.microsoft.com/sharepoint/v3"/>
-    <ds:schemaRef ds:uri="bc555557-3e8b-4e67-83dc-4a843c87bf48"/>
-    <ds:schemaRef ds:uri="13e5e634-19bb-4da3-8eb1-d732f895062a"/>
-  </ds:schemaRefs>
-</ds:datastoreItem>
-</file>
-
-<file path=customXml/itemProps4.xml><?xml version="1.0" encoding="utf-8"?>
-<ds:datastoreItem xmlns:ds="http://schemas.openxmlformats.org/officeDocument/2006/customXml" ds:itemID="{02C30E68-946A-4504-B925-FF5230B8A4C3}">
-  <ds:schemaRefs>
-    <ds:schemaRef ds:uri="http://schemas.microsoft.com/sharepoint/v3/contenttype/forms"/>
-  </ds:schemaRefs>
-</ds:datastoreItem>
 </file>
</xml_diff>

<commit_message>
V4.0.0 - BETA 1 - signficantly enhanced automation of report writing
</commit_message>
<xml_diff>
--- a/planet_it_maturity_assessment_template.docx
+++ b/planet_it_maturity_assessment_template.docx
@@ -611,6 +611,7 @@
                                 <w:szCs w:val="80"/>
                               </w:rPr>
                             </w:pPr>
+                            <w:proofErr w:type="gramStart"/>
                             <w:r>
                               <w:rPr>
                                 <w:rFonts w:cs="Consolas"/>
@@ -618,7 +619,57 @@
                                 <w:sz w:val="80"/>
                                 <w:szCs w:val="80"/>
                               </w:rPr>
-                              <w:t>{{ customer_name }}</w:t>
+                              <w:t xml:space="preserve">{{ </w:t>
+                            </w:r>
+                            <w:proofErr w:type="spellStart"/>
+                            <w:r>
+                              <w:rPr>
+                                <w:rFonts w:cs="Consolas"/>
+                                <w:color w:val="FFFFFF" w:themeColor="background1"/>
+                                <w:sz w:val="80"/>
+                                <w:szCs w:val="80"/>
+                              </w:rPr>
+                              <w:t>customer</w:t>
+                            </w:r>
+                            <w:proofErr w:type="gramEnd"/>
+                            <w:r>
+                              <w:rPr>
+                                <w:rFonts w:cs="Consolas"/>
+                                <w:color w:val="FFFFFF" w:themeColor="background1"/>
+                                <w:sz w:val="80"/>
+                                <w:szCs w:val="80"/>
+                              </w:rPr>
+                              <w:t>_</w:t>
+                            </w:r>
+                            <w:proofErr w:type="gramStart"/>
+                            <w:r>
+                              <w:rPr>
+                                <w:rFonts w:cs="Consolas"/>
+                                <w:color w:val="FFFFFF" w:themeColor="background1"/>
+                                <w:sz w:val="80"/>
+                                <w:szCs w:val="80"/>
+                              </w:rPr>
+                              <w:t>name</w:t>
+                            </w:r>
+                            <w:proofErr w:type="spellEnd"/>
+                            <w:r>
+                              <w:rPr>
+                                <w:rFonts w:cs="Consolas"/>
+                                <w:color w:val="FFFFFF" w:themeColor="background1"/>
+                                <w:sz w:val="80"/>
+                                <w:szCs w:val="80"/>
+                              </w:rPr>
+                              <w:t xml:space="preserve"> }</w:t>
+                            </w:r>
+                            <w:proofErr w:type="gramEnd"/>
+                            <w:r>
+                              <w:rPr>
+                                <w:rFonts w:cs="Consolas"/>
+                                <w:color w:val="FFFFFF" w:themeColor="background1"/>
+                                <w:sz w:val="80"/>
+                                <w:szCs w:val="80"/>
+                              </w:rPr>
+                              <w:t>}</w:t>
                             </w:r>
                           </w:p>
                           <w:p>
@@ -658,6 +709,7 @@
                               </w:rPr>
                               <w:t xml:space="preserve"> </w:t>
                             </w:r>
+                            <w:proofErr w:type="gramStart"/>
                             <w:r>
                               <w:rPr>
                                 <w:rFonts w:cs="Consolas"/>
@@ -665,7 +717,37 @@
                                 <w:sz w:val="80"/>
                                 <w:szCs w:val="80"/>
                               </w:rPr>
-                              <w:t>{{ consultant_name }}</w:t>
+                              <w:t>{{ consultant</w:t>
+                            </w:r>
+                            <w:proofErr w:type="gramEnd"/>
+                            <w:r>
+                              <w:rPr>
+                                <w:rFonts w:cs="Consolas"/>
+                                <w:color w:val="FFFFFF" w:themeColor="background1"/>
+                                <w:sz w:val="80"/>
+                                <w:szCs w:val="80"/>
+                              </w:rPr>
+                              <w:t>_</w:t>
+                            </w:r>
+                            <w:proofErr w:type="gramStart"/>
+                            <w:r>
+                              <w:rPr>
+                                <w:rFonts w:cs="Consolas"/>
+                                <w:color w:val="FFFFFF" w:themeColor="background1"/>
+                                <w:sz w:val="80"/>
+                                <w:szCs w:val="80"/>
+                              </w:rPr>
+                              <w:t>name }</w:t>
+                            </w:r>
+                            <w:proofErr w:type="gramEnd"/>
+                            <w:r>
+                              <w:rPr>
+                                <w:rFonts w:cs="Consolas"/>
+                                <w:color w:val="FFFFFF" w:themeColor="background1"/>
+                                <w:sz w:val="80"/>
+                                <w:szCs w:val="80"/>
+                              </w:rPr>
+                              <w:t>}</w:t>
                             </w:r>
                           </w:p>
                           <w:p>
@@ -1026,7 +1108,99 @@
           <w:bCs/>
           <w:color w:val="EE0000"/>
         </w:rPr>
-        <w:t>{% for guide in consultant_discovery_guide %}• {{ guide }}{% if not loop.last %}</w:t>
+        <w:t xml:space="preserve">{% for guide in </w:t>
+      </w:r>
+      <w:proofErr w:type="spellStart"/>
+      <w:r>
+        <w:rPr>
+          <w:b/>
+          <w:bCs/>
+          <w:color w:val="EE0000"/>
+        </w:rPr>
+        <w:t>consultant_discovery_guide</w:t>
+      </w:r>
+      <w:proofErr w:type="spellEnd"/>
+      <w:r>
+        <w:rPr>
+          <w:b/>
+          <w:bCs/>
+          <w:color w:val="EE0000"/>
+        </w:rPr>
+        <w:t xml:space="preserve"> </w:t>
+      </w:r>
+      <w:proofErr w:type="gramStart"/>
+      <w:r>
+        <w:rPr>
+          <w:b/>
+          <w:bCs/>
+          <w:color w:val="EE0000"/>
+        </w:rPr>
+        <w:t>%}•</w:t>
+      </w:r>
+      <w:proofErr w:type="gramEnd"/>
+      <w:r>
+        <w:rPr>
+          <w:b/>
+          <w:bCs/>
+          <w:color w:val="EE0000"/>
+        </w:rPr>
+        <w:t xml:space="preserve"> </w:t>
+      </w:r>
+      <w:proofErr w:type="gramStart"/>
+      <w:r>
+        <w:rPr>
+          <w:b/>
+          <w:bCs/>
+          <w:color w:val="EE0000"/>
+        </w:rPr>
+        <w:t>{{ guide</w:t>
+      </w:r>
+      <w:proofErr w:type="gramEnd"/>
+      <w:r>
+        <w:rPr>
+          <w:b/>
+          <w:bCs/>
+          <w:color w:val="EE0000"/>
+        </w:rPr>
+        <w:t xml:space="preserve"> </w:t>
+      </w:r>
+      <w:proofErr w:type="gramStart"/>
+      <w:r>
+        <w:rPr>
+          <w:b/>
+          <w:bCs/>
+          <w:color w:val="EE0000"/>
+        </w:rPr>
+        <w:t>}}{</w:t>
+      </w:r>
+      <w:proofErr w:type="gramEnd"/>
+      <w:r>
+        <w:rPr>
+          <w:b/>
+          <w:bCs/>
+          <w:color w:val="EE0000"/>
+        </w:rPr>
+        <w:t xml:space="preserve">% if not </w:t>
+      </w:r>
+      <w:proofErr w:type="spellStart"/>
+      <w:proofErr w:type="gramStart"/>
+      <w:r>
+        <w:rPr>
+          <w:b/>
+          <w:bCs/>
+          <w:color w:val="EE0000"/>
+        </w:rPr>
+        <w:t>loop.last</w:t>
+      </w:r>
+      <w:proofErr w:type="spellEnd"/>
+      <w:proofErr w:type="gramEnd"/>
+      <w:r>
+        <w:rPr>
+          <w:b/>
+          <w:bCs/>
+          <w:color w:val="EE0000"/>
+        </w:rPr>
+        <w:t xml:space="preserve"> %}</w:t>
       </w:r>
       <w:r>
         <w:rPr>
@@ -1035,7 +1209,43 @@
           <w:color w:val="EE0000"/>
         </w:rPr>
         <w:br/>
-        <w:t>{% endif %}{% endfor %}</w:t>
+        <w:t xml:space="preserve">{% endif </w:t>
+      </w:r>
+      <w:proofErr w:type="gramStart"/>
+      <w:r>
+        <w:rPr>
+          <w:b/>
+          <w:bCs/>
+          <w:color w:val="EE0000"/>
+        </w:rPr>
+        <w:t>%}{</w:t>
+      </w:r>
+      <w:proofErr w:type="gramEnd"/>
+      <w:r>
+        <w:rPr>
+          <w:b/>
+          <w:bCs/>
+          <w:color w:val="EE0000"/>
+        </w:rPr>
+        <w:t xml:space="preserve">% </w:t>
+      </w:r>
+      <w:proofErr w:type="spellStart"/>
+      <w:r>
+        <w:rPr>
+          <w:b/>
+          <w:bCs/>
+          <w:color w:val="EE0000"/>
+        </w:rPr>
+        <w:t>endfor</w:t>
+      </w:r>
+      <w:proofErr w:type="spellEnd"/>
+      <w:r>
+        <w:rPr>
+          <w:b/>
+          <w:bCs/>
+          <w:color w:val="EE0000"/>
+        </w:rPr>
+        <w:t xml:space="preserve"> %}</w:t>
       </w:r>
     </w:p>
     <w:p/>
@@ -1046,8 +1256,29 @@
         <w:pStyle w:val="Heading1"/>
         <w:spacing w:after="240"/>
       </w:pPr>
-      <w:r>
-        <w:t>{{ customer_name }}</w:t>
+      <w:proofErr w:type="gramStart"/>
+      <w:r>
+        <w:t xml:space="preserve">{{ </w:t>
+      </w:r>
+      <w:proofErr w:type="spellStart"/>
+      <w:r>
+        <w:t>customer</w:t>
+      </w:r>
+      <w:proofErr w:type="gramEnd"/>
+      <w:r>
+        <w:t>_</w:t>
+      </w:r>
+      <w:proofErr w:type="gramStart"/>
+      <w:r>
+        <w:t>name</w:t>
+      </w:r>
+      <w:proofErr w:type="spellEnd"/>
+      <w:r>
+        <w:t xml:space="preserve"> }</w:t>
+      </w:r>
+      <w:proofErr w:type="gramEnd"/>
+      <w:r>
+        <w:t>}</w:t>
       </w:r>
       <w:r>
         <w:t xml:space="preserve"> </w:t>
@@ -1064,8 +1295,29 @@
     </w:p>
     <w:p/>
     <w:p>
-      <w:r>
-        <w:t>{{ customer_name }}</w:t>
+      <w:proofErr w:type="gramStart"/>
+      <w:r>
+        <w:t xml:space="preserve">{{ </w:t>
+      </w:r>
+      <w:proofErr w:type="spellStart"/>
+      <w:r>
+        <w:t>customer</w:t>
+      </w:r>
+      <w:proofErr w:type="gramEnd"/>
+      <w:r>
+        <w:t>_</w:t>
+      </w:r>
+      <w:proofErr w:type="gramStart"/>
+      <w:r>
+        <w:t>name</w:t>
+      </w:r>
+      <w:proofErr w:type="spellEnd"/>
+      <w:r>
+        <w:t xml:space="preserve"> }</w:t>
+      </w:r>
+      <w:proofErr w:type="gramEnd"/>
+      <w:r>
+        <w:t>}</w:t>
       </w:r>
       <w:r>
         <w:t xml:space="preserve"> have undergone a Security Maturity Assessment completed by Planet IT.  This comprehensive assessment of the </w:t>
@@ -1073,8 +1325,29 @@
       <w:r>
         <w:t xml:space="preserve">current security implementation of </w:t>
       </w:r>
-      <w:r>
-        <w:t>{{ customer_name }}</w:t>
+      <w:proofErr w:type="gramStart"/>
+      <w:r>
+        <w:t xml:space="preserve">{{ </w:t>
+      </w:r>
+      <w:proofErr w:type="spellStart"/>
+      <w:r>
+        <w:t>customer</w:t>
+      </w:r>
+      <w:proofErr w:type="gramEnd"/>
+      <w:r>
+        <w:t>_</w:t>
+      </w:r>
+      <w:proofErr w:type="gramStart"/>
+      <w:r>
+        <w:t>name</w:t>
+      </w:r>
+      <w:proofErr w:type="spellEnd"/>
+      <w:r>
+        <w:t xml:space="preserve"> }</w:t>
+      </w:r>
+      <w:proofErr w:type="gramEnd"/>
+      <w:r>
+        <w:t>}</w:t>
       </w:r>
       <w:r>
         <w:t xml:space="preserve"> focused on assessing the security maturity </w:t>
@@ -1082,8 +1355,29 @@
       <w:r>
         <w:t xml:space="preserve">of the systems, solutions and culture in place at </w:t>
       </w:r>
-      <w:r>
-        <w:t>{{ customer_name }}</w:t>
+      <w:proofErr w:type="gramStart"/>
+      <w:r>
+        <w:t xml:space="preserve">{{ </w:t>
+      </w:r>
+      <w:proofErr w:type="spellStart"/>
+      <w:r>
+        <w:t>customer</w:t>
+      </w:r>
+      <w:proofErr w:type="gramEnd"/>
+      <w:r>
+        <w:t>_</w:t>
+      </w:r>
+      <w:proofErr w:type="gramStart"/>
+      <w:r>
+        <w:t>name</w:t>
+      </w:r>
+      <w:proofErr w:type="spellEnd"/>
+      <w:r>
+        <w:t xml:space="preserve"> }</w:t>
+      </w:r>
+      <w:proofErr w:type="gramEnd"/>
+      <w:r>
+        <w:t>}</w:t>
       </w:r>
       <w:r>
         <w:t>.</w:t>
@@ -1300,8 +1594,29 @@
       <w:r>
         <w:t xml:space="preserve">estimated security maturity in place at </w:t>
       </w:r>
-      <w:r>
-        <w:t>{{ customer_name }}</w:t>
+      <w:proofErr w:type="gramStart"/>
+      <w:r>
+        <w:t xml:space="preserve">{{ </w:t>
+      </w:r>
+      <w:proofErr w:type="spellStart"/>
+      <w:r>
+        <w:t>customer</w:t>
+      </w:r>
+      <w:proofErr w:type="gramEnd"/>
+      <w:r>
+        <w:t>_</w:t>
+      </w:r>
+      <w:proofErr w:type="gramStart"/>
+      <w:r>
+        <w:t>name</w:t>
+      </w:r>
+      <w:proofErr w:type="spellEnd"/>
+      <w:r>
+        <w:t xml:space="preserve"> }</w:t>
+      </w:r>
+      <w:proofErr w:type="gramEnd"/>
+      <w:r>
+        <w:t>}</w:t>
       </w:r>
       <w:r>
         <w:t xml:space="preserve">, </w:t>
@@ -1315,8 +1630,29 @@
       <w:r>
         <w:t xml:space="preserve">and culture at </w:t>
       </w:r>
-      <w:r>
-        <w:t>{{ customer_name }}</w:t>
+      <w:proofErr w:type="gramStart"/>
+      <w:r>
+        <w:t xml:space="preserve">{{ </w:t>
+      </w:r>
+      <w:proofErr w:type="spellStart"/>
+      <w:r>
+        <w:t>customer</w:t>
+      </w:r>
+      <w:proofErr w:type="gramEnd"/>
+      <w:r>
+        <w:t>_</w:t>
+      </w:r>
+      <w:proofErr w:type="gramStart"/>
+      <w:r>
+        <w:t>name</w:t>
+      </w:r>
+      <w:proofErr w:type="spellEnd"/>
+      <w:r>
+        <w:t xml:space="preserve"> }</w:t>
+      </w:r>
+      <w:proofErr w:type="gramEnd"/>
+      <w:r>
+        <w:t>}</w:t>
       </w:r>
       <w:r>
         <w:t>.</w:t>
@@ -1526,7 +1862,15 @@
           </w:tcPr>
           <w:p>
             <w:r>
-              <w:t>{%tr for ki in adjudicated_known_issues %}</w:t>
+              <w:t xml:space="preserve">{%tr for ki in </w:t>
+            </w:r>
+            <w:proofErr w:type="spellStart"/>
+            <w:r>
+              <w:t>adjudicated_known_issues</w:t>
+            </w:r>
+            <w:proofErr w:type="spellEnd"/>
+            <w:r>
+              <w:t xml:space="preserve"> %}</w:t>
             </w:r>
           </w:p>
         </w:tc>
@@ -1582,9 +1926,46 @@
             <w:hideMark/>
           </w:tcPr>
           <w:p>
+            <w:proofErr w:type="gramStart"/>
             <w:r>
               <w:lastRenderedPageBreak/>
-              <w:t>{{ loop.index }}. {{ ki.issue_text }}</w:t>
+              <w:t xml:space="preserve">{{ </w:t>
+            </w:r>
+            <w:proofErr w:type="spellStart"/>
+            <w:r>
+              <w:t>loop</w:t>
+            </w:r>
+            <w:proofErr w:type="gramEnd"/>
+            <w:r>
+              <w:t>.</w:t>
+            </w:r>
+            <w:proofErr w:type="gramStart"/>
+            <w:r>
+              <w:t>index</w:t>
+            </w:r>
+            <w:proofErr w:type="spellEnd"/>
+            <w:r>
+              <w:t xml:space="preserve"> }</w:t>
+            </w:r>
+            <w:proofErr w:type="gramEnd"/>
+            <w:r>
+              <w:t xml:space="preserve">}. </w:t>
+            </w:r>
+            <w:proofErr w:type="gramStart"/>
+            <w:r>
+              <w:t xml:space="preserve">{{ </w:t>
+            </w:r>
+            <w:proofErr w:type="spellStart"/>
+            <w:r>
+              <w:t>ki</w:t>
+            </w:r>
+            <w:proofErr w:type="gramEnd"/>
+            <w:r>
+              <w:t>.issue_text</w:t>
+            </w:r>
+            <w:proofErr w:type="spellEnd"/>
+            <w:r>
+              <w:t xml:space="preserve"> }}</w:t>
             </w:r>
           </w:p>
         </w:tc>
@@ -1606,8 +1987,21 @@
             <w:hideMark/>
           </w:tcPr>
           <w:p>
-            <w:r>
-              <w:t>{{ ki.our_ruling }}</w:t>
+            <w:proofErr w:type="gramStart"/>
+            <w:r>
+              <w:t xml:space="preserve">{{ </w:t>
+            </w:r>
+            <w:proofErr w:type="spellStart"/>
+            <w:r>
+              <w:t>ki.our</w:t>
+            </w:r>
+            <w:proofErr w:type="gramEnd"/>
+            <w:r>
+              <w:t>_ruling</w:t>
+            </w:r>
+            <w:proofErr w:type="spellEnd"/>
+            <w:r>
+              <w:t xml:space="preserve"> }}</w:t>
             </w:r>
           </w:p>
         </w:tc>
@@ -1629,8 +2023,21 @@
             <w:hideMark/>
           </w:tcPr>
           <w:p>
-            <w:r>
-              <w:t>{{ ki.rationale }}</w:t>
+            <w:proofErr w:type="gramStart"/>
+            <w:r>
+              <w:t xml:space="preserve">{{ </w:t>
+            </w:r>
+            <w:proofErr w:type="spellStart"/>
+            <w:r>
+              <w:t>ki</w:t>
+            </w:r>
+            <w:proofErr w:type="gramEnd"/>
+            <w:r>
+              <w:t>.rationale</w:t>
+            </w:r>
+            <w:proofErr w:type="spellEnd"/>
+            <w:r>
+              <w:t xml:space="preserve"> }}</w:t>
             </w:r>
           </w:p>
         </w:tc>
@@ -1653,11 +2060,74 @@
           </w:tcPr>
           <w:p>
             <w:r>
-              <w:t>{% for a in ki.suggested_remediations %}• {{ a }}{% if not loop.last %}</w:t>
+              <w:t xml:space="preserve">{% for a in </w:t>
+            </w:r>
+            <w:proofErr w:type="spellStart"/>
+            <w:proofErr w:type="gramStart"/>
+            <w:r>
+              <w:t>ki.suggested</w:t>
+            </w:r>
+            <w:proofErr w:type="gramEnd"/>
+            <w:r>
+              <w:t>_remediations</w:t>
+            </w:r>
+            <w:proofErr w:type="spellEnd"/>
+            <w:r>
+              <w:t xml:space="preserve"> </w:t>
+            </w:r>
+            <w:proofErr w:type="gramStart"/>
+            <w:r>
+              <w:t>%}•</w:t>
+            </w:r>
+            <w:proofErr w:type="gramEnd"/>
+            <w:r>
+              <w:t xml:space="preserve"> </w:t>
+            </w:r>
+            <w:proofErr w:type="gramStart"/>
+            <w:r>
+              <w:t>{{ a</w:t>
+            </w:r>
+            <w:proofErr w:type="gramEnd"/>
+            <w:r>
+              <w:t xml:space="preserve"> </w:t>
+            </w:r>
+            <w:proofErr w:type="gramStart"/>
+            <w:r>
+              <w:t>}}{</w:t>
+            </w:r>
+            <w:proofErr w:type="gramEnd"/>
+            <w:r>
+              <w:t xml:space="preserve">% if not </w:t>
+            </w:r>
+            <w:proofErr w:type="spellStart"/>
+            <w:proofErr w:type="gramStart"/>
+            <w:r>
+              <w:t>loop.last</w:t>
+            </w:r>
+            <w:proofErr w:type="spellEnd"/>
+            <w:proofErr w:type="gramEnd"/>
+            <w:r>
+              <w:t xml:space="preserve"> %}</w:t>
             </w:r>
             <w:r>
               <w:br/>
-              <w:t>{% endif %}{% endfor %}</w:t>
+              <w:t xml:space="preserve">{% endif </w:t>
+            </w:r>
+            <w:proofErr w:type="gramStart"/>
+            <w:r>
+              <w:t>%}{</w:t>
+            </w:r>
+            <w:proofErr w:type="gramEnd"/>
+            <w:r>
+              <w:t xml:space="preserve">% </w:t>
+            </w:r>
+            <w:proofErr w:type="spellStart"/>
+            <w:r>
+              <w:t>endfor</w:t>
+            </w:r>
+            <w:proofErr w:type="spellEnd"/>
+            <w:r>
+              <w:t xml:space="preserve"> %}</w:t>
             </w:r>
           </w:p>
         </w:tc>
@@ -1680,11 +2150,74 @@
           </w:tcPr>
           <w:p>
             <w:r>
-              <w:t>{% for s in ki.aligned_solutions %}• {{ s }}{% if not loop.last %}</w:t>
+              <w:t xml:space="preserve">{% for s in </w:t>
+            </w:r>
+            <w:proofErr w:type="spellStart"/>
+            <w:proofErr w:type="gramStart"/>
+            <w:r>
+              <w:t>ki.aligned</w:t>
+            </w:r>
+            <w:proofErr w:type="gramEnd"/>
+            <w:r>
+              <w:t>_solutions</w:t>
+            </w:r>
+            <w:proofErr w:type="spellEnd"/>
+            <w:r>
+              <w:t xml:space="preserve"> </w:t>
+            </w:r>
+            <w:proofErr w:type="gramStart"/>
+            <w:r>
+              <w:t>%}•</w:t>
+            </w:r>
+            <w:proofErr w:type="gramEnd"/>
+            <w:r>
+              <w:t xml:space="preserve"> </w:t>
+            </w:r>
+            <w:proofErr w:type="gramStart"/>
+            <w:r>
+              <w:t>{{ s</w:t>
+            </w:r>
+            <w:proofErr w:type="gramEnd"/>
+            <w:r>
+              <w:t xml:space="preserve"> </w:t>
+            </w:r>
+            <w:proofErr w:type="gramStart"/>
+            <w:r>
+              <w:t>}}{</w:t>
+            </w:r>
+            <w:proofErr w:type="gramEnd"/>
+            <w:r>
+              <w:t xml:space="preserve">% if not </w:t>
+            </w:r>
+            <w:proofErr w:type="spellStart"/>
+            <w:proofErr w:type="gramStart"/>
+            <w:r>
+              <w:t>loop.last</w:t>
+            </w:r>
+            <w:proofErr w:type="spellEnd"/>
+            <w:proofErr w:type="gramEnd"/>
+            <w:r>
+              <w:t xml:space="preserve"> %}</w:t>
             </w:r>
             <w:r>
               <w:br/>
-              <w:t>{% endif %}{% endfor %}</w:t>
+              <w:t xml:space="preserve">{% endif </w:t>
+            </w:r>
+            <w:proofErr w:type="gramStart"/>
+            <w:r>
+              <w:t>%}{</w:t>
+            </w:r>
+            <w:proofErr w:type="gramEnd"/>
+            <w:r>
+              <w:t xml:space="preserve">% </w:t>
+            </w:r>
+            <w:proofErr w:type="spellStart"/>
+            <w:r>
+              <w:t>endfor</w:t>
+            </w:r>
+            <w:proofErr w:type="spellEnd"/>
+            <w:r>
+              <w:t xml:space="preserve"> %}</w:t>
             </w:r>
           </w:p>
         </w:tc>
@@ -1698,7 +2231,15 @@
           </w:tcPr>
           <w:p>
             <w:r>
-              <w:t>{%tr endfor %}</w:t>
+              <w:t xml:space="preserve">{%tr </w:t>
+            </w:r>
+            <w:proofErr w:type="spellStart"/>
+            <w:r>
+              <w:t>endfor</w:t>
+            </w:r>
+            <w:proofErr w:type="spellEnd"/>
+            <w:r>
+              <w:t xml:space="preserve"> %}</w:t>
             </w:r>
           </w:p>
         </w:tc>
@@ -1750,24 +2291,113 @@
       <w:pPr>
         <w:pStyle w:val="Heading2"/>
       </w:pPr>
-      <w:r>
-        <w:t>{{ security_rating.score_statement }}</w:t>
+      <w:proofErr w:type="gramStart"/>
+      <w:r>
+        <w:t xml:space="preserve">{{ </w:t>
+      </w:r>
+      <w:proofErr w:type="spellStart"/>
+      <w:r>
+        <w:t>security</w:t>
+      </w:r>
+      <w:proofErr w:type="gramEnd"/>
+      <w:r>
+        <w:t>_</w:t>
+      </w:r>
+      <w:proofErr w:type="gramStart"/>
+      <w:r>
+        <w:t>rating.score</w:t>
+      </w:r>
+      <w:proofErr w:type="gramEnd"/>
+      <w:r>
+        <w:t>_</w:t>
+      </w:r>
+      <w:proofErr w:type="gramStart"/>
+      <w:r>
+        <w:t>statement</w:t>
+      </w:r>
+      <w:proofErr w:type="spellEnd"/>
+      <w:r>
+        <w:t xml:space="preserve"> }</w:t>
+      </w:r>
+      <w:proofErr w:type="gramEnd"/>
+      <w:r>
+        <w:t>}</w:t>
       </w:r>
     </w:p>
     <w:p>
-      <w:r>
-        <w:t>{{ security_rating.caveat }}</w:t>
+      <w:proofErr w:type="gramStart"/>
+      <w:r>
+        <w:t xml:space="preserve">{{ </w:t>
+      </w:r>
+      <w:proofErr w:type="spellStart"/>
+      <w:r>
+        <w:t>security</w:t>
+      </w:r>
+      <w:proofErr w:type="gramEnd"/>
+      <w:r>
+        <w:t>_</w:t>
+      </w:r>
+      <w:proofErr w:type="gramStart"/>
+      <w:r>
+        <w:t>rating.caveat</w:t>
+      </w:r>
+      <w:proofErr w:type="spellEnd"/>
+      <w:proofErr w:type="gramEnd"/>
+      <w:r>
+        <w:t xml:space="preserve"> }}</w:t>
       </w:r>
     </w:p>
     <w:p/>
     <w:p>
-      <w:r>
-        <w:t>{{ maturity_gauge }}</w:t>
+      <w:proofErr w:type="gramStart"/>
+      <w:r>
+        <w:t xml:space="preserve">{{ </w:t>
+      </w:r>
+      <w:proofErr w:type="spellStart"/>
+      <w:r>
+        <w:t>maturity</w:t>
+      </w:r>
+      <w:proofErr w:type="gramEnd"/>
+      <w:r>
+        <w:t>_</w:t>
+      </w:r>
+      <w:proofErr w:type="gramStart"/>
+      <w:r>
+        <w:t>gauge</w:t>
+      </w:r>
+      <w:proofErr w:type="spellEnd"/>
+      <w:r>
+        <w:t xml:space="preserve"> }</w:t>
+      </w:r>
+      <w:proofErr w:type="gramEnd"/>
+      <w:r>
+        <w:t>}</w:t>
       </w:r>
     </w:p>
     <w:p>
-      <w:r>
-        <w:t>{{ maturity_gauge_caption }}</w:t>
+      <w:proofErr w:type="gramStart"/>
+      <w:r>
+        <w:t xml:space="preserve">{{ </w:t>
+      </w:r>
+      <w:proofErr w:type="spellStart"/>
+      <w:r>
+        <w:t>maturity</w:t>
+      </w:r>
+      <w:proofErr w:type="gramEnd"/>
+      <w:r>
+        <w:t>_gauge_</w:t>
+      </w:r>
+      <w:proofErr w:type="gramStart"/>
+      <w:r>
+        <w:t>caption</w:t>
+      </w:r>
+      <w:proofErr w:type="spellEnd"/>
+      <w:r>
+        <w:t xml:space="preserve"> }</w:t>
+      </w:r>
+      <w:proofErr w:type="gramEnd"/>
+      <w:r>
+        <w:t>}</w:t>
       </w:r>
     </w:p>
     <w:p/>
@@ -1913,8 +2543,37 @@
             <w:hideMark/>
           </w:tcPr>
           <w:p>
-            <w:r>
-              <w:t>{{ security_rating.snapshot.overall_score }}/100</w:t>
+            <w:proofErr w:type="gramStart"/>
+            <w:r>
+              <w:t xml:space="preserve">{{ </w:t>
+            </w:r>
+            <w:proofErr w:type="spellStart"/>
+            <w:r>
+              <w:t>security</w:t>
+            </w:r>
+            <w:proofErr w:type="gramEnd"/>
+            <w:r>
+              <w:t>_</w:t>
+            </w:r>
+            <w:proofErr w:type="gramStart"/>
+            <w:r>
+              <w:t>rating.snapshot</w:t>
+            </w:r>
+            <w:proofErr w:type="gramEnd"/>
+            <w:r>
+              <w:t>.overall_</w:t>
+            </w:r>
+            <w:proofErr w:type="gramStart"/>
+            <w:r>
+              <w:t>score</w:t>
+            </w:r>
+            <w:proofErr w:type="spellEnd"/>
+            <w:r>
+              <w:t xml:space="preserve"> }}/</w:t>
+            </w:r>
+            <w:proofErr w:type="gramEnd"/>
+            <w:r>
+              <w:t>100</w:t>
             </w:r>
           </w:p>
         </w:tc>
@@ -1967,8 +2626,29 @@
             <w:hideMark/>
           </w:tcPr>
           <w:p>
-            <w:r>
-              <w:t>{{ security_rating.snapshot.maturity_rating }}</w:t>
+            <w:proofErr w:type="gramStart"/>
+            <w:r>
+              <w:t xml:space="preserve">{{ </w:t>
+            </w:r>
+            <w:proofErr w:type="spellStart"/>
+            <w:r>
+              <w:t>security</w:t>
+            </w:r>
+            <w:proofErr w:type="gramEnd"/>
+            <w:r>
+              <w:t>_</w:t>
+            </w:r>
+            <w:proofErr w:type="gramStart"/>
+            <w:r>
+              <w:t>rating.snapshot</w:t>
+            </w:r>
+            <w:proofErr w:type="gramEnd"/>
+            <w:r>
+              <w:t>.maturity_rating</w:t>
+            </w:r>
+            <w:proofErr w:type="spellEnd"/>
+            <w:r>
+              <w:t xml:space="preserve"> }}</w:t>
             </w:r>
           </w:p>
         </w:tc>
@@ -2021,8 +2701,29 @@
             <w:hideMark/>
           </w:tcPr>
           <w:p>
-            <w:r>
-              <w:t>{{ security_rating.snapshot.direction_of_travel }}</w:t>
+            <w:proofErr w:type="gramStart"/>
+            <w:r>
+              <w:t xml:space="preserve">{{ </w:t>
+            </w:r>
+            <w:proofErr w:type="spellStart"/>
+            <w:r>
+              <w:t>security</w:t>
+            </w:r>
+            <w:proofErr w:type="gramEnd"/>
+            <w:r>
+              <w:t>_</w:t>
+            </w:r>
+            <w:proofErr w:type="gramStart"/>
+            <w:r>
+              <w:t>rating.snapshot</w:t>
+            </w:r>
+            <w:proofErr w:type="gramEnd"/>
+            <w:r>
+              <w:t>.direction_of_travel</w:t>
+            </w:r>
+            <w:proofErr w:type="spellEnd"/>
+            <w:r>
+              <w:t xml:space="preserve"> }}</w:t>
             </w:r>
           </w:p>
         </w:tc>
@@ -2075,8 +2776,37 @@
             <w:hideMark/>
           </w:tcPr>
           <w:p>
-            <w:r>
-              <w:t>{{ security_rating.snapshot.primary_strengths|join(', ') }}</w:t>
+            <w:proofErr w:type="gramStart"/>
+            <w:r>
+              <w:t xml:space="preserve">{{ </w:t>
+            </w:r>
+            <w:proofErr w:type="spellStart"/>
+            <w:r>
+              <w:t>security</w:t>
+            </w:r>
+            <w:proofErr w:type="gramEnd"/>
+            <w:r>
+              <w:t>_</w:t>
+            </w:r>
+            <w:proofErr w:type="gramStart"/>
+            <w:r>
+              <w:t>rating.snapshot</w:t>
+            </w:r>
+            <w:proofErr w:type="gramEnd"/>
+            <w:r>
+              <w:t>.primary_strengths|</w:t>
+            </w:r>
+            <w:proofErr w:type="gramStart"/>
+            <w:r>
+              <w:t>join</w:t>
+            </w:r>
+            <w:proofErr w:type="spellEnd"/>
+            <w:r>
+              <w:t>(</w:t>
+            </w:r>
+            <w:proofErr w:type="gramEnd"/>
+            <w:r>
+              <w:t>', ') }}</w:t>
             </w:r>
           </w:p>
         </w:tc>
@@ -2129,8 +2859,37 @@
             <w:hideMark/>
           </w:tcPr>
           <w:p>
-            <w:r>
-              <w:t>{{ security_rating.snapshot.primary_gaps|join(', ') }}</w:t>
+            <w:proofErr w:type="gramStart"/>
+            <w:r>
+              <w:t xml:space="preserve">{{ </w:t>
+            </w:r>
+            <w:proofErr w:type="spellStart"/>
+            <w:r>
+              <w:t>security</w:t>
+            </w:r>
+            <w:proofErr w:type="gramEnd"/>
+            <w:r>
+              <w:t>_</w:t>
+            </w:r>
+            <w:proofErr w:type="gramStart"/>
+            <w:r>
+              <w:t>rating.snapshot</w:t>
+            </w:r>
+            <w:proofErr w:type="gramEnd"/>
+            <w:r>
+              <w:t>.primary_gaps|</w:t>
+            </w:r>
+            <w:proofErr w:type="gramStart"/>
+            <w:r>
+              <w:t>join</w:t>
+            </w:r>
+            <w:proofErr w:type="spellEnd"/>
+            <w:r>
+              <w:t>(</w:t>
+            </w:r>
+            <w:proofErr w:type="gramEnd"/>
+            <w:r>
+              <w:t>', ') }}</w:t>
             </w:r>
           </w:p>
         </w:tc>
@@ -2183,8 +2942,29 @@
             <w:hideMark/>
           </w:tcPr>
           <w:p>
-            <w:r>
-              <w:t>{{ security_rating.snapshot.board_level_takeaway }}</w:t>
+            <w:proofErr w:type="gramStart"/>
+            <w:r>
+              <w:t xml:space="preserve">{{ </w:t>
+            </w:r>
+            <w:proofErr w:type="spellStart"/>
+            <w:r>
+              <w:t>security</w:t>
+            </w:r>
+            <w:proofErr w:type="gramEnd"/>
+            <w:r>
+              <w:t>_</w:t>
+            </w:r>
+            <w:proofErr w:type="gramStart"/>
+            <w:r>
+              <w:t>rating.snapshot</w:t>
+            </w:r>
+            <w:proofErr w:type="gramEnd"/>
+            <w:r>
+              <w:t>.board_level_takeaway</w:t>
+            </w:r>
+            <w:proofErr w:type="spellEnd"/>
+            <w:r>
+              <w:t xml:space="preserve"> }}</w:t>
             </w:r>
           </w:p>
         </w:tc>
@@ -2429,7 +3209,23 @@
           </w:tcPr>
           <w:p>
             <w:r>
-              <w:t>{%tr for it in security_rating.weighted_areas %}</w:t>
+              <w:t xml:space="preserve">{%tr for it in </w:t>
+            </w:r>
+            <w:proofErr w:type="spellStart"/>
+            <w:r>
+              <w:t>security_</w:t>
+            </w:r>
+            <w:proofErr w:type="gramStart"/>
+            <w:r>
+              <w:t>rating.weighted</w:t>
+            </w:r>
+            <w:proofErr w:type="gramEnd"/>
+            <w:r>
+              <w:t>_areas</w:t>
+            </w:r>
+            <w:proofErr w:type="spellEnd"/>
+            <w:r>
+              <w:t xml:space="preserve"> %}</w:t>
             </w:r>
           </w:p>
         </w:tc>
@@ -2485,8 +3281,21 @@
             <w:hideMark/>
           </w:tcPr>
           <w:p>
-            <w:r>
-              <w:t>{{ it.area }}</w:t>
+            <w:proofErr w:type="gramStart"/>
+            <w:r>
+              <w:t xml:space="preserve">{{ </w:t>
+            </w:r>
+            <w:proofErr w:type="spellStart"/>
+            <w:r>
+              <w:t>it</w:t>
+            </w:r>
+            <w:proofErr w:type="gramEnd"/>
+            <w:r>
+              <w:t>.area</w:t>
+            </w:r>
+            <w:proofErr w:type="spellEnd"/>
+            <w:r>
+              <w:t xml:space="preserve"> }}</w:t>
             </w:r>
           </w:p>
         </w:tc>
@@ -2508,9 +3317,27 @@
             <w:hideMark/>
           </w:tcPr>
           <w:p>
-            <w:r>
-              <w:t>{{ it.weight_percent }}%</w:t>
-            </w:r>
+            <w:proofErr w:type="gramStart"/>
+            <w:r>
+              <w:t xml:space="preserve">{{ </w:t>
+            </w:r>
+            <w:proofErr w:type="spellStart"/>
+            <w:r>
+              <w:t>it</w:t>
+            </w:r>
+            <w:proofErr w:type="gramEnd"/>
+            <w:r>
+              <w:t>.weight_</w:t>
+            </w:r>
+            <w:proofErr w:type="gramStart"/>
+            <w:r>
+              <w:t>percent</w:t>
+            </w:r>
+            <w:proofErr w:type="spellEnd"/>
+            <w:r>
+              <w:t xml:space="preserve"> }}%</w:t>
+            </w:r>
+            <w:proofErr w:type="gramEnd"/>
           </w:p>
         </w:tc>
         <w:tc>
@@ -2531,8 +3358,21 @@
             <w:hideMark/>
           </w:tcPr>
           <w:p>
-            <w:r>
-              <w:t>{{ it.indicative_score }}</w:t>
+            <w:proofErr w:type="gramStart"/>
+            <w:r>
+              <w:t xml:space="preserve">{{ </w:t>
+            </w:r>
+            <w:proofErr w:type="spellStart"/>
+            <w:r>
+              <w:t>it</w:t>
+            </w:r>
+            <w:proofErr w:type="gramEnd"/>
+            <w:r>
+              <w:t>.indicative_score</w:t>
+            </w:r>
+            <w:proofErr w:type="spellEnd"/>
+            <w:r>
+              <w:t xml:space="preserve"> }}</w:t>
             </w:r>
           </w:p>
         </w:tc>
@@ -2554,9 +3394,27 @@
             <w:hideMark/>
           </w:tcPr>
           <w:p>
-            <w:r>
-              <w:t>{{ it.weighted_contribution }}%</w:t>
-            </w:r>
+            <w:proofErr w:type="gramStart"/>
+            <w:r>
+              <w:t xml:space="preserve">{{ </w:t>
+            </w:r>
+            <w:proofErr w:type="spellStart"/>
+            <w:r>
+              <w:t>it</w:t>
+            </w:r>
+            <w:proofErr w:type="gramEnd"/>
+            <w:r>
+              <w:t>.weighted_</w:t>
+            </w:r>
+            <w:proofErr w:type="gramStart"/>
+            <w:r>
+              <w:t>contribution</w:t>
+            </w:r>
+            <w:proofErr w:type="spellEnd"/>
+            <w:r>
+              <w:t xml:space="preserve"> }}%</w:t>
+            </w:r>
+            <w:proofErr w:type="gramEnd"/>
           </w:p>
         </w:tc>
         <w:tc>
@@ -2577,8 +3435,21 @@
             <w:hideMark/>
           </w:tcPr>
           <w:p>
-            <w:r>
-              <w:t>{{ it.rationale }}</w:t>
+            <w:proofErr w:type="gramStart"/>
+            <w:r>
+              <w:t xml:space="preserve">{{ </w:t>
+            </w:r>
+            <w:proofErr w:type="spellStart"/>
+            <w:r>
+              <w:t>it</w:t>
+            </w:r>
+            <w:proofErr w:type="gramEnd"/>
+            <w:r>
+              <w:t>.rationale</w:t>
+            </w:r>
+            <w:proofErr w:type="spellEnd"/>
+            <w:r>
+              <w:t xml:space="preserve"> }}</w:t>
             </w:r>
           </w:p>
         </w:tc>
@@ -2592,7 +3463,15 @@
           </w:tcPr>
           <w:p>
             <w:r>
-              <w:t>{%tr endfor %}</w:t>
+              <w:t xml:space="preserve">{%tr </w:t>
+            </w:r>
+            <w:proofErr w:type="spellStart"/>
+            <w:r>
+              <w:t>endfor</w:t>
+            </w:r>
+            <w:proofErr w:type="spellEnd"/>
+            <w:r>
+              <w:t xml:space="preserve"> %}</w:t>
             </w:r>
           </w:p>
         </w:tc>
@@ -2773,7 +3652,23 @@
           </w:tcPr>
           <w:p>
             <w:r>
-              <w:t>{%tr for b in security_rating.maturity_bands %}</w:t>
+              <w:t xml:space="preserve">{%tr for b in </w:t>
+            </w:r>
+            <w:proofErr w:type="spellStart"/>
+            <w:r>
+              <w:t>security_</w:t>
+            </w:r>
+            <w:proofErr w:type="gramStart"/>
+            <w:r>
+              <w:t>rating.maturity</w:t>
+            </w:r>
+            <w:proofErr w:type="gramEnd"/>
+            <w:r>
+              <w:t>_bands</w:t>
+            </w:r>
+            <w:proofErr w:type="spellEnd"/>
+            <w:r>
+              <w:t xml:space="preserve"> %}</w:t>
             </w:r>
           </w:p>
         </w:tc>
@@ -2813,8 +3708,21 @@
             <w:hideMark/>
           </w:tcPr>
           <w:p>
-            <w:r>
-              <w:t>{{ b.score_range }}</w:t>
+            <w:proofErr w:type="gramStart"/>
+            <w:r>
+              <w:t xml:space="preserve">{{ </w:t>
+            </w:r>
+            <w:proofErr w:type="spellStart"/>
+            <w:r>
+              <w:t>b</w:t>
+            </w:r>
+            <w:proofErr w:type="gramEnd"/>
+            <w:r>
+              <w:t>.score_range</w:t>
+            </w:r>
+            <w:proofErr w:type="spellEnd"/>
+            <w:r>
+              <w:t xml:space="preserve"> }}</w:t>
             </w:r>
           </w:p>
         </w:tc>
@@ -2836,8 +3744,21 @@
             <w:hideMark/>
           </w:tcPr>
           <w:p>
-            <w:r>
-              <w:t>{{ b.rating }}</w:t>
+            <w:proofErr w:type="gramStart"/>
+            <w:r>
+              <w:t xml:space="preserve">{{ </w:t>
+            </w:r>
+            <w:proofErr w:type="spellStart"/>
+            <w:r>
+              <w:t>b</w:t>
+            </w:r>
+            <w:proofErr w:type="gramEnd"/>
+            <w:r>
+              <w:t>.rating</w:t>
+            </w:r>
+            <w:proofErr w:type="spellEnd"/>
+            <w:r>
+              <w:t xml:space="preserve"> }}</w:t>
             </w:r>
           </w:p>
         </w:tc>
@@ -2859,8 +3780,21 @@
             <w:hideMark/>
           </w:tcPr>
           <w:p>
-            <w:r>
-              <w:t>{{ b.meaning }}</w:t>
+            <w:proofErr w:type="gramStart"/>
+            <w:r>
+              <w:t xml:space="preserve">{{ </w:t>
+            </w:r>
+            <w:proofErr w:type="spellStart"/>
+            <w:r>
+              <w:t>b</w:t>
+            </w:r>
+            <w:proofErr w:type="gramEnd"/>
+            <w:r>
+              <w:t>.meaning</w:t>
+            </w:r>
+            <w:proofErr w:type="spellEnd"/>
+            <w:r>
+              <w:t xml:space="preserve"> }}</w:t>
             </w:r>
           </w:p>
         </w:tc>
@@ -2874,7 +3808,15 @@
           </w:tcPr>
           <w:p>
             <w:r>
-              <w:t>{%tr endfor %}</w:t>
+              <w:t xml:space="preserve">{%tr </w:t>
+            </w:r>
+            <w:proofErr w:type="spellStart"/>
+            <w:r>
+              <w:t>endfor</w:t>
+            </w:r>
+            <w:proofErr w:type="spellEnd"/>
+            <w:r>
+              <w:t xml:space="preserve"> %}</w:t>
             </w:r>
           </w:p>
         </w:tc>
@@ -2898,8 +3840,37 @@
     </w:tbl>
     <w:p/>
     <w:p>
-      <w:r>
-        <w:t>{{ security_rating.executive_interpretation }}</w:t>
+      <w:proofErr w:type="gramStart"/>
+      <w:r>
+        <w:t xml:space="preserve">{{ </w:t>
+      </w:r>
+      <w:proofErr w:type="spellStart"/>
+      <w:r>
+        <w:t>security</w:t>
+      </w:r>
+      <w:proofErr w:type="gramEnd"/>
+      <w:r>
+        <w:t>_</w:t>
+      </w:r>
+      <w:proofErr w:type="gramStart"/>
+      <w:r>
+        <w:t>rating.executive</w:t>
+      </w:r>
+      <w:proofErr w:type="gramEnd"/>
+      <w:r>
+        <w:t>_</w:t>
+      </w:r>
+      <w:proofErr w:type="gramStart"/>
+      <w:r>
+        <w:t>interpretation</w:t>
+      </w:r>
+      <w:proofErr w:type="spellEnd"/>
+      <w:r>
+        <w:t xml:space="preserve"> }</w:t>
+      </w:r>
+      <w:proofErr w:type="gramEnd"/>
+      <w:r>
+        <w:t>}</w:t>
       </w:r>
     </w:p>
     <w:p>
@@ -2920,8 +3891,55 @@
       </w:r>
     </w:p>
     <w:p>
-      <w:r>
-        <w:t>{{ board_summary }}</w:t>
+      <w:proofErr w:type="gramStart"/>
+      <w:r>
+        <w:t xml:space="preserve">{{ </w:t>
+      </w:r>
+      <w:proofErr w:type="spellStart"/>
+      <w:r>
+        <w:t>board</w:t>
+      </w:r>
+      <w:proofErr w:type="gramEnd"/>
+      <w:r>
+        <w:t>_</w:t>
+      </w:r>
+      <w:proofErr w:type="gramStart"/>
+      <w:r>
+        <w:t>summary</w:t>
+      </w:r>
+      <w:proofErr w:type="spellEnd"/>
+      <w:r>
+        <w:t xml:space="preserve"> }</w:t>
+      </w:r>
+      <w:proofErr w:type="gramEnd"/>
+      <w:r>
+        <w:t>}</w:t>
+      </w:r>
+    </w:p>
+    <w:p>
+      <w:proofErr w:type="gramStart"/>
+      <w:r>
+        <w:t xml:space="preserve">{{ </w:t>
+      </w:r>
+      <w:proofErr w:type="spellStart"/>
+      <w:r>
+        <w:t>executive</w:t>
+      </w:r>
+      <w:proofErr w:type="gramEnd"/>
+      <w:r>
+        <w:t>_summary_actions_</w:t>
+      </w:r>
+      <w:proofErr w:type="gramStart"/>
+      <w:r>
+        <w:t>bullets</w:t>
+      </w:r>
+      <w:proofErr w:type="spellEnd"/>
+      <w:r>
+        <w:t xml:space="preserve"> }</w:t>
+      </w:r>
+      <w:proofErr w:type="gramEnd"/>
+      <w:r>
+        <w:t>}</w:t>
       </w:r>
     </w:p>
     <w:p>
@@ -2931,8 +3949,29 @@
           <w:lang w:eastAsia="en-GB"/>
         </w:rPr>
       </w:pPr>
-      <w:r>
-        <w:t>{{ executive_summary_actions_bullets }}</w:t>
+      <w:proofErr w:type="gramStart"/>
+      <w:r>
+        <w:t xml:space="preserve">{{ </w:t>
+      </w:r>
+      <w:proofErr w:type="spellStart"/>
+      <w:r>
+        <w:t>exec</w:t>
+      </w:r>
+      <w:proofErr w:type="gramEnd"/>
+      <w:r>
+        <w:t>_</w:t>
+      </w:r>
+      <w:proofErr w:type="gramStart"/>
+      <w:r>
+        <w:t>summary</w:t>
+      </w:r>
+      <w:proofErr w:type="spellEnd"/>
+      <w:r>
+        <w:t xml:space="preserve"> }</w:t>
+      </w:r>
+      <w:proofErr w:type="gramEnd"/>
+      <w:r>
+        <w:t>}</w:t>
       </w:r>
     </w:p>
     <w:p/>
@@ -3097,7 +4136,15 @@
           </w:tcPr>
           <w:p>
             <w:r>
-              <w:t>{%tr for r in rag_summary %}</w:t>
+              <w:t xml:space="preserve">{%tr for r in </w:t>
+            </w:r>
+            <w:proofErr w:type="spellStart"/>
+            <w:r>
+              <w:t>rag_summary</w:t>
+            </w:r>
+            <w:proofErr w:type="spellEnd"/>
+            <w:r>
+              <w:t xml:space="preserve"> %}</w:t>
             </w:r>
           </w:p>
         </w:tc>
@@ -3145,9 +4192,51 @@
             <w:hideMark/>
           </w:tcPr>
           <w:p>
-            <w:r>
-              <w:t>{{ r.severity_label }} {{ r.severity_pct }}%</w:t>
-            </w:r>
+            <w:proofErr w:type="gramStart"/>
+            <w:r>
+              <w:t xml:space="preserve">{{ </w:t>
+            </w:r>
+            <w:proofErr w:type="spellStart"/>
+            <w:r>
+              <w:t>r</w:t>
+            </w:r>
+            <w:proofErr w:type="gramEnd"/>
+            <w:r>
+              <w:t>.severity_</w:t>
+            </w:r>
+            <w:proofErr w:type="gramStart"/>
+            <w:r>
+              <w:t>label</w:t>
+            </w:r>
+            <w:proofErr w:type="spellEnd"/>
+            <w:r>
+              <w:t xml:space="preserve"> }</w:t>
+            </w:r>
+            <w:proofErr w:type="gramEnd"/>
+            <w:r>
+              <w:t xml:space="preserve">} </w:t>
+            </w:r>
+            <w:proofErr w:type="gramStart"/>
+            <w:r>
+              <w:t xml:space="preserve">{{ </w:t>
+            </w:r>
+            <w:proofErr w:type="spellStart"/>
+            <w:r>
+              <w:t>r</w:t>
+            </w:r>
+            <w:proofErr w:type="gramEnd"/>
+            <w:r>
+              <w:t>.severity_</w:t>
+            </w:r>
+            <w:proofErr w:type="gramStart"/>
+            <w:r>
+              <w:t>pct</w:t>
+            </w:r>
+            <w:proofErr w:type="spellEnd"/>
+            <w:r>
+              <w:t xml:space="preserve"> }}%</w:t>
+            </w:r>
+            <w:proofErr w:type="gramEnd"/>
           </w:p>
         </w:tc>
         <w:tc>
@@ -3168,8 +4257,21 @@
             <w:hideMark/>
           </w:tcPr>
           <w:p>
-            <w:r>
-              <w:t>{{ r.issue_title }}</w:t>
+            <w:proofErr w:type="gramStart"/>
+            <w:r>
+              <w:t xml:space="preserve">{{ </w:t>
+            </w:r>
+            <w:proofErr w:type="spellStart"/>
+            <w:r>
+              <w:t>r</w:t>
+            </w:r>
+            <w:proofErr w:type="gramEnd"/>
+            <w:r>
+              <w:t>.issue_title</w:t>
+            </w:r>
+            <w:proofErr w:type="spellEnd"/>
+            <w:r>
+              <w:t xml:space="preserve"> }}</w:t>
             </w:r>
           </w:p>
         </w:tc>
@@ -3191,8 +4293,21 @@
             <w:hideMark/>
           </w:tcPr>
           <w:p>
-            <w:r>
-              <w:t>{{ r.business_exposure }}</w:t>
+            <w:proofErr w:type="gramStart"/>
+            <w:r>
+              <w:t xml:space="preserve">{{ </w:t>
+            </w:r>
+            <w:proofErr w:type="spellStart"/>
+            <w:r>
+              <w:t>r</w:t>
+            </w:r>
+            <w:proofErr w:type="gramEnd"/>
+            <w:r>
+              <w:t>.business_exposure</w:t>
+            </w:r>
+            <w:proofErr w:type="spellEnd"/>
+            <w:r>
+              <w:t xml:space="preserve"> }}</w:t>
             </w:r>
           </w:p>
         </w:tc>
@@ -3214,8 +4329,21 @@
             <w:hideMark/>
           </w:tcPr>
           <w:p>
-            <w:r>
-              <w:t>{{ r.priority_action }}</w:t>
+            <w:proofErr w:type="gramStart"/>
+            <w:r>
+              <w:t xml:space="preserve">{{ </w:t>
+            </w:r>
+            <w:proofErr w:type="spellStart"/>
+            <w:r>
+              <w:t>r</w:t>
+            </w:r>
+            <w:proofErr w:type="gramEnd"/>
+            <w:r>
+              <w:t>.priority_action</w:t>
+            </w:r>
+            <w:proofErr w:type="spellEnd"/>
+            <w:r>
+              <w:t xml:space="preserve"> }}</w:t>
             </w:r>
           </w:p>
         </w:tc>
@@ -3229,7 +4357,15 @@
           </w:tcPr>
           <w:p>
             <w:r>
-              <w:t>{%tr endfor %}</w:t>
+              <w:t xml:space="preserve">{%tr </w:t>
+            </w:r>
+            <w:proofErr w:type="spellStart"/>
+            <w:r>
+              <w:t>endfor</w:t>
+            </w:r>
+            <w:proofErr w:type="spellEnd"/>
+            <w:r>
+              <w:t xml:space="preserve"> %}</w:t>
             </w:r>
           </w:p>
         </w:tc>
@@ -3351,7 +4487,51 @@
                 <w:sz w:val="22"/>
                 <w:szCs w:val="22"/>
               </w:rPr>
-              <w:t>Why this fits {{ customer_name }}</w:t>
+              <w:t xml:space="preserve">Why this fits </w:t>
+            </w:r>
+            <w:proofErr w:type="gramStart"/>
+            <w:r>
+              <w:rPr>
+                <w:b/>
+                <w:bCs/>
+                <w:color w:val="FFFFFF"/>
+                <w:sz w:val="22"/>
+                <w:szCs w:val="22"/>
+              </w:rPr>
+              <w:t xml:space="preserve">{{ </w:t>
+            </w:r>
+            <w:proofErr w:type="spellStart"/>
+            <w:r>
+              <w:rPr>
+                <w:b/>
+                <w:bCs/>
+                <w:color w:val="FFFFFF"/>
+                <w:sz w:val="22"/>
+                <w:szCs w:val="22"/>
+              </w:rPr>
+              <w:t>customer</w:t>
+            </w:r>
+            <w:proofErr w:type="gramEnd"/>
+            <w:r>
+              <w:rPr>
+                <w:b/>
+                <w:bCs/>
+                <w:color w:val="FFFFFF"/>
+                <w:sz w:val="22"/>
+                <w:szCs w:val="22"/>
+              </w:rPr>
+              <w:t>_name</w:t>
+            </w:r>
+            <w:proofErr w:type="spellEnd"/>
+            <w:r>
+              <w:rPr>
+                <w:b/>
+                <w:bCs/>
+                <w:color w:val="FFFFFF"/>
+                <w:sz w:val="22"/>
+                <w:szCs w:val="22"/>
+              </w:rPr>
+              <w:t xml:space="preserve"> }}</w:t>
             </w:r>
           </w:p>
         </w:tc>
@@ -3397,7 +4577,15 @@
           </w:tcPr>
           <w:p>
             <w:r>
-              <w:t>{%tr for opt in programme_options %}</w:t>
+              <w:t xml:space="preserve">{%tr for opt in </w:t>
+            </w:r>
+            <w:proofErr w:type="spellStart"/>
+            <w:r>
+              <w:t>programme_options</w:t>
+            </w:r>
+            <w:proofErr w:type="spellEnd"/>
+            <w:r>
+              <w:t xml:space="preserve"> %}</w:t>
             </w:r>
           </w:p>
         </w:tc>
@@ -3437,8 +4625,21 @@
             <w:hideMark/>
           </w:tcPr>
           <w:p>
-            <w:r>
-              <w:t>{{ opt.solution }}</w:t>
+            <w:proofErr w:type="gramStart"/>
+            <w:r>
+              <w:t xml:space="preserve">{{ </w:t>
+            </w:r>
+            <w:proofErr w:type="spellStart"/>
+            <w:r>
+              <w:t>opt</w:t>
+            </w:r>
+            <w:proofErr w:type="gramEnd"/>
+            <w:r>
+              <w:t>.solution</w:t>
+            </w:r>
+            <w:proofErr w:type="spellEnd"/>
+            <w:r>
+              <w:t xml:space="preserve"> }}</w:t>
             </w:r>
           </w:p>
         </w:tc>
@@ -3460,8 +4661,21 @@
             <w:hideMark/>
           </w:tcPr>
           <w:p>
-            <w:r>
-              <w:t>{{ opt.why_this_fits }}</w:t>
+            <w:proofErr w:type="gramStart"/>
+            <w:r>
+              <w:t xml:space="preserve">{{ </w:t>
+            </w:r>
+            <w:proofErr w:type="spellStart"/>
+            <w:r>
+              <w:t>opt.why</w:t>
+            </w:r>
+            <w:proofErr w:type="gramEnd"/>
+            <w:r>
+              <w:t>_this_fits</w:t>
+            </w:r>
+            <w:proofErr w:type="spellEnd"/>
+            <w:r>
+              <w:t xml:space="preserve"> }}</w:t>
             </w:r>
           </w:p>
         </w:tc>
@@ -3483,8 +4697,21 @@
             <w:hideMark/>
           </w:tcPr>
           <w:p>
-            <w:r>
-              <w:t>{{ opt.cost_band }}</w:t>
+            <w:proofErr w:type="gramStart"/>
+            <w:r>
+              <w:t xml:space="preserve">{{ </w:t>
+            </w:r>
+            <w:proofErr w:type="spellStart"/>
+            <w:r>
+              <w:t>opt</w:t>
+            </w:r>
+            <w:proofErr w:type="gramEnd"/>
+            <w:r>
+              <w:t>.cost_band</w:t>
+            </w:r>
+            <w:proofErr w:type="spellEnd"/>
+            <w:r>
+              <w:t xml:space="preserve"> }}</w:t>
             </w:r>
           </w:p>
         </w:tc>
@@ -3498,7 +4725,15 @@
           </w:tcPr>
           <w:p>
             <w:r>
-              <w:t>{%tr endfor %}</w:t>
+              <w:t xml:space="preserve">{%tr </w:t>
+            </w:r>
+            <w:proofErr w:type="spellStart"/>
+            <w:r>
+              <w:t>endfor</w:t>
+            </w:r>
+            <w:proofErr w:type="spellEnd"/>
+            <w:r>
+              <w:t xml:space="preserve"> %}</w:t>
             </w:r>
           </w:p>
         </w:tc>
@@ -3555,6 +4790,7 @@
         </w:rPr>
         <w:t xml:space="preserve">Disclaimer: this is a fictional breach scenario leveraging threat intelligence and known threat actor activity mapped to the current technology stack and perceived security maturity of </w:t>
       </w:r>
+      <w:proofErr w:type="gramStart"/>
       <w:r>
         <w:rPr>
           <w:bCs/>
@@ -3563,8 +4799,53 @@
           <w:sz w:val="12"/>
           <w:szCs w:val="12"/>
         </w:rPr>
-        <w:t>{{ customer_name }</w:t>
-      </w:r>
+        <w:t xml:space="preserve">{{ </w:t>
+      </w:r>
+      <w:proofErr w:type="spellStart"/>
+      <w:r>
+        <w:rPr>
+          <w:bCs/>
+          <w:i/>
+          <w:iCs/>
+          <w:sz w:val="12"/>
+          <w:szCs w:val="12"/>
+        </w:rPr>
+        <w:t>customer</w:t>
+      </w:r>
+      <w:proofErr w:type="gramEnd"/>
+      <w:r>
+        <w:rPr>
+          <w:bCs/>
+          <w:i/>
+          <w:iCs/>
+          <w:sz w:val="12"/>
+          <w:szCs w:val="12"/>
+        </w:rPr>
+        <w:t>_</w:t>
+      </w:r>
+      <w:proofErr w:type="gramStart"/>
+      <w:r>
+        <w:rPr>
+          <w:bCs/>
+          <w:i/>
+          <w:iCs/>
+          <w:sz w:val="12"/>
+          <w:szCs w:val="12"/>
+        </w:rPr>
+        <w:t>name</w:t>
+      </w:r>
+      <w:proofErr w:type="spellEnd"/>
+      <w:r>
+        <w:rPr>
+          <w:bCs/>
+          <w:i/>
+          <w:iCs/>
+          <w:sz w:val="12"/>
+          <w:szCs w:val="12"/>
+        </w:rPr>
+        <w:t xml:space="preserve"> }</w:t>
+      </w:r>
+      <w:proofErr w:type="gramEnd"/>
       <w:r>
         <w:rPr>
           <w:bCs/>
@@ -3601,8 +4882,29 @@
           <w:lang w:eastAsia="en-GB"/>
         </w:rPr>
       </w:pPr>
-      <w:r>
-        <w:t>{{ threat_scenarios }}</w:t>
+      <w:proofErr w:type="gramStart"/>
+      <w:r>
+        <w:t xml:space="preserve">{{ </w:t>
+      </w:r>
+      <w:proofErr w:type="spellStart"/>
+      <w:r>
+        <w:t>threat</w:t>
+      </w:r>
+      <w:proofErr w:type="gramEnd"/>
+      <w:r>
+        <w:t>_</w:t>
+      </w:r>
+      <w:proofErr w:type="gramStart"/>
+      <w:r>
+        <w:t>scenarios</w:t>
+      </w:r>
+      <w:proofErr w:type="spellEnd"/>
+      <w:r>
+        <w:t xml:space="preserve"> }</w:t>
+      </w:r>
+      <w:proofErr w:type="gramEnd"/>
+      <w:r>
+        <w:t>}</w:t>
       </w:r>
     </w:p>
     <w:p/>
@@ -3624,8 +4926,29 @@
           <w:lang w:eastAsia="en-GB"/>
         </w:rPr>
       </w:pPr>
-      <w:r>
-        <w:t>{{ radar_chart }}</w:t>
+      <w:proofErr w:type="gramStart"/>
+      <w:r>
+        <w:t xml:space="preserve">{{ </w:t>
+      </w:r>
+      <w:proofErr w:type="spellStart"/>
+      <w:r>
+        <w:t>radar</w:t>
+      </w:r>
+      <w:proofErr w:type="gramEnd"/>
+      <w:r>
+        <w:t>_</w:t>
+      </w:r>
+      <w:proofErr w:type="gramStart"/>
+      <w:r>
+        <w:t>chart</w:t>
+      </w:r>
+      <w:proofErr w:type="spellEnd"/>
+      <w:r>
+        <w:t xml:space="preserve"> }</w:t>
+      </w:r>
+      <w:proofErr w:type="gramEnd"/>
+      <w:r>
+        <w:t>}</w:t>
       </w:r>
     </w:p>
     <w:p/>
@@ -3653,8 +4976,29 @@
       </w:r>
     </w:p>
     <w:p>
-      <w:r>
-        <w:t>{{ matrix_mapping }}</w:t>
+      <w:proofErr w:type="gramStart"/>
+      <w:r>
+        <w:t xml:space="preserve">{{ </w:t>
+      </w:r>
+      <w:proofErr w:type="spellStart"/>
+      <w:r>
+        <w:t>matrix</w:t>
+      </w:r>
+      <w:proofErr w:type="gramEnd"/>
+      <w:r>
+        <w:t>_</w:t>
+      </w:r>
+      <w:proofErr w:type="gramStart"/>
+      <w:r>
+        <w:t>mapping</w:t>
+      </w:r>
+      <w:proofErr w:type="spellEnd"/>
+      <w:r>
+        <w:t xml:space="preserve"> }</w:t>
+      </w:r>
+      <w:proofErr w:type="gramEnd"/>
+      <w:r>
+        <w:t>}</w:t>
       </w:r>
     </w:p>
     <w:p/>
@@ -3928,17 +5272,71 @@
         </w:rPr>
       </w:pPr>
       <w:r>
-        <w:t>{% for comp in compliance_alignment %}</w:t>
+        <w:t xml:space="preserve">{% for comp in </w:t>
+      </w:r>
+      <w:proofErr w:type="spellStart"/>
+      <w:r>
+        <w:t>compliance_alignment</w:t>
+      </w:r>
+      <w:proofErr w:type="spellEnd"/>
+      <w:r>
+        <w:t xml:space="preserve"> </w:t>
+      </w:r>
+      <w:proofErr w:type="gramStart"/>
+      <w:r>
+        <w:t>%}</w:t>
       </w:r>
       <w:r>
         <w:rPr>
           <w:b/>
           <w:bCs/>
         </w:rPr>
-        <w:t>Standard:</w:t>
-      </w:r>
-      <w:r>
-        <w:t xml:space="preserve"> {{ comp.standard }}{% if comp.gaps %} </w:t>
+        <w:t>Standard</w:t>
+      </w:r>
+      <w:proofErr w:type="gramEnd"/>
+      <w:r>
+        <w:rPr>
+          <w:b/>
+          <w:bCs/>
+        </w:rPr>
+        <w:t>:</w:t>
+      </w:r>
+      <w:r>
+        <w:t xml:space="preserve"> </w:t>
+      </w:r>
+      <w:proofErr w:type="gramStart"/>
+      <w:r>
+        <w:t xml:space="preserve">{{ </w:t>
+      </w:r>
+      <w:proofErr w:type="spellStart"/>
+      <w:r>
+        <w:t>comp</w:t>
+      </w:r>
+      <w:proofErr w:type="gramEnd"/>
+      <w:r>
+        <w:t>.</w:t>
+      </w:r>
+      <w:proofErr w:type="gramStart"/>
+      <w:r>
+        <w:t>standard</w:t>
+      </w:r>
+      <w:proofErr w:type="spellEnd"/>
+      <w:r>
+        <w:t xml:space="preserve"> }}{</w:t>
+      </w:r>
+      <w:proofErr w:type="gramEnd"/>
+      <w:r>
+        <w:t xml:space="preserve">% if </w:t>
+      </w:r>
+      <w:proofErr w:type="spellStart"/>
+      <w:proofErr w:type="gramStart"/>
+      <w:r>
+        <w:t>comp.gaps</w:t>
+      </w:r>
+      <w:proofErr w:type="spellEnd"/>
+      <w:proofErr w:type="gramEnd"/>
+      <w:r>
+        <w:t xml:space="preserve"> %} </w:t>
       </w:r>
       <w:r>
         <w:rPr>
@@ -3948,7 +5346,70 @@
         <w:t>Gaps:</w:t>
       </w:r>
       <w:r>
-        <w:t xml:space="preserve"> {% for gap in comp.gaps %}• {{ gap }} {% endfor %}{% endif %}{% if comp.fill_plan %} </w:t>
+        <w:t xml:space="preserve"> {% for gap in </w:t>
+      </w:r>
+      <w:proofErr w:type="spellStart"/>
+      <w:proofErr w:type="gramStart"/>
+      <w:r>
+        <w:t>comp.gaps</w:t>
+      </w:r>
+      <w:proofErr w:type="spellEnd"/>
+      <w:proofErr w:type="gramEnd"/>
+      <w:r>
+        <w:t xml:space="preserve"> </w:t>
+      </w:r>
+      <w:proofErr w:type="gramStart"/>
+      <w:r>
+        <w:t>%}•</w:t>
+      </w:r>
+      <w:proofErr w:type="gramEnd"/>
+      <w:r>
+        <w:t xml:space="preserve"> </w:t>
+      </w:r>
+      <w:proofErr w:type="gramStart"/>
+      <w:r>
+        <w:t>{{ gap</w:t>
+      </w:r>
+      <w:proofErr w:type="gramEnd"/>
+      <w:r>
+        <w:t xml:space="preserve"> }} {% </w:t>
+      </w:r>
+      <w:proofErr w:type="spellStart"/>
+      <w:r>
+        <w:t>endfor</w:t>
+      </w:r>
+      <w:proofErr w:type="spellEnd"/>
+      <w:r>
+        <w:t xml:space="preserve"> </w:t>
+      </w:r>
+      <w:proofErr w:type="gramStart"/>
+      <w:r>
+        <w:t>%}{</w:t>
+      </w:r>
+      <w:proofErr w:type="gramEnd"/>
+      <w:r>
+        <w:t xml:space="preserve">% endif </w:t>
+      </w:r>
+      <w:proofErr w:type="gramStart"/>
+      <w:r>
+        <w:t>%}{</w:t>
+      </w:r>
+      <w:proofErr w:type="gramEnd"/>
+      <w:r>
+        <w:t xml:space="preserve">% if </w:t>
+      </w:r>
+      <w:proofErr w:type="spellStart"/>
+      <w:proofErr w:type="gramStart"/>
+      <w:r>
+        <w:t>comp.fill</w:t>
+      </w:r>
+      <w:proofErr w:type="gramEnd"/>
+      <w:r>
+        <w:t>_plan</w:t>
+      </w:r>
+      <w:proofErr w:type="spellEnd"/>
+      <w:r>
+        <w:t xml:space="preserve"> %} </w:t>
       </w:r>
       <w:r>
         <w:rPr>
@@ -3958,17 +5419,74 @@
         <w:t>Remediation Plans:</w:t>
       </w:r>
       <w:r>
-        <w:t xml:space="preserve"> {% for gp in comp.fill_plan %}</w:t>
+        <w:t xml:space="preserve"> {% for </w:t>
+      </w:r>
+      <w:proofErr w:type="spellStart"/>
+      <w:r>
+        <w:t>gp</w:t>
+      </w:r>
+      <w:proofErr w:type="spellEnd"/>
+      <w:r>
+        <w:t xml:space="preserve"> in </w:t>
+      </w:r>
+      <w:proofErr w:type="spellStart"/>
+      <w:proofErr w:type="gramStart"/>
+      <w:r>
+        <w:t>comp.fill</w:t>
+      </w:r>
+      <w:proofErr w:type="gramEnd"/>
+      <w:r>
+        <w:t>_plan</w:t>
+      </w:r>
+      <w:proofErr w:type="spellEnd"/>
+      <w:r>
+        <w:t xml:space="preserve"> </w:t>
+      </w:r>
+      <w:proofErr w:type="gramStart"/>
+      <w:r>
+        <w:t>%}</w:t>
       </w:r>
       <w:r>
         <w:rPr>
           <w:b/>
           <w:bCs/>
         </w:rPr>
-        <w:t>Gap:</w:t>
-      </w:r>
-      <w:r>
-        <w:t xml:space="preserve"> {{ gp.gap_description }} </w:t>
+        <w:t>Gap</w:t>
+      </w:r>
+      <w:proofErr w:type="gramEnd"/>
+      <w:r>
+        <w:rPr>
+          <w:b/>
+          <w:bCs/>
+        </w:rPr>
+        <w:t>:</w:t>
+      </w:r>
+      <w:r>
+        <w:t xml:space="preserve"> </w:t>
+      </w:r>
+      <w:proofErr w:type="gramStart"/>
+      <w:r>
+        <w:t xml:space="preserve">{{ </w:t>
+      </w:r>
+      <w:proofErr w:type="spellStart"/>
+      <w:r>
+        <w:t>gp.gap</w:t>
+      </w:r>
+      <w:proofErr w:type="gramEnd"/>
+      <w:r>
+        <w:t>_</w:t>
+      </w:r>
+      <w:proofErr w:type="gramStart"/>
+      <w:r>
+        <w:t>description</w:t>
+      </w:r>
+      <w:proofErr w:type="spellEnd"/>
+      <w:r>
+        <w:t xml:space="preserve"> }</w:t>
+      </w:r>
+      <w:proofErr w:type="gramEnd"/>
+      <w:r>
+        <w:t xml:space="preserve">} </w:t>
       </w:r>
       <w:r>
         <w:rPr>
@@ -3978,17 +5496,90 @@
         <w:t>Actions:</w:t>
       </w:r>
       <w:r>
-        <w:t xml:space="preserve"> {% for action in gp.recommended_actions %}• {{ action }} {% endfor %}</w:t>
+        <w:t xml:space="preserve"> {% for action in </w:t>
+      </w:r>
+      <w:proofErr w:type="spellStart"/>
+      <w:proofErr w:type="gramStart"/>
+      <w:r>
+        <w:t>gp.recommended</w:t>
+      </w:r>
+      <w:proofErr w:type="gramEnd"/>
+      <w:r>
+        <w:t>_actions</w:t>
+      </w:r>
+      <w:proofErr w:type="spellEnd"/>
+      <w:r>
+        <w:t xml:space="preserve"> </w:t>
+      </w:r>
+      <w:proofErr w:type="gramStart"/>
+      <w:r>
+        <w:t>%}•</w:t>
+      </w:r>
+      <w:proofErr w:type="gramEnd"/>
+      <w:r>
+        <w:t xml:space="preserve"> </w:t>
+      </w:r>
+      <w:proofErr w:type="gramStart"/>
+      <w:r>
+        <w:t>{{ action</w:t>
+      </w:r>
+      <w:proofErr w:type="gramEnd"/>
+      <w:r>
+        <w:t xml:space="preserve"> }} {% </w:t>
+      </w:r>
+      <w:proofErr w:type="spellStart"/>
+      <w:r>
+        <w:t>endfor</w:t>
+      </w:r>
+      <w:proofErr w:type="spellEnd"/>
+      <w:r>
+        <w:t xml:space="preserve"> </w:t>
+      </w:r>
+      <w:proofErr w:type="gramStart"/>
+      <w:r>
+        <w:t>%}</w:t>
       </w:r>
       <w:r>
         <w:rPr>
           <w:b/>
           <w:bCs/>
         </w:rPr>
-        <w:t>Owner:</w:t>
-      </w:r>
-      <w:r>
-        <w:t xml:space="preserve"> {{ gp.owner }} </w:t>
+        <w:t>Owner</w:t>
+      </w:r>
+      <w:proofErr w:type="gramEnd"/>
+      <w:r>
+        <w:rPr>
+          <w:b/>
+          <w:bCs/>
+        </w:rPr>
+        <w:t>:</w:t>
+      </w:r>
+      <w:r>
+        <w:t xml:space="preserve"> </w:t>
+      </w:r>
+      <w:proofErr w:type="gramStart"/>
+      <w:r>
+        <w:t xml:space="preserve">{{ </w:t>
+      </w:r>
+      <w:proofErr w:type="spellStart"/>
+      <w:r>
+        <w:t>gp</w:t>
+      </w:r>
+      <w:proofErr w:type="gramEnd"/>
+      <w:r>
+        <w:t>.</w:t>
+      </w:r>
+      <w:proofErr w:type="gramStart"/>
+      <w:r>
+        <w:t>owner</w:t>
+      </w:r>
+      <w:proofErr w:type="spellEnd"/>
+      <w:r>
+        <w:t xml:space="preserve"> }</w:t>
+      </w:r>
+      <w:proofErr w:type="gramEnd"/>
+      <w:r>
+        <w:t xml:space="preserve">} </w:t>
       </w:r>
       <w:r>
         <w:rPr>
@@ -3998,14 +5589,88 @@
         <w:t>Due By:</w:t>
       </w:r>
       <w:r>
-        <w:t xml:space="preserve"> {{ gp.due_by }} {% endfor %}{% endif %}{% if not loop.last %}</w:t>
+        <w:t xml:space="preserve"> </w:t>
+      </w:r>
+      <w:proofErr w:type="gramStart"/>
+      <w:r>
+        <w:t xml:space="preserve">{{ </w:t>
+      </w:r>
+      <w:proofErr w:type="spellStart"/>
+      <w:r>
+        <w:t>gp.due</w:t>
+      </w:r>
+      <w:proofErr w:type="gramEnd"/>
+      <w:r>
+        <w:t>_</w:t>
+      </w:r>
+      <w:proofErr w:type="gramStart"/>
+      <w:r>
+        <w:t>by</w:t>
+      </w:r>
+      <w:proofErr w:type="spellEnd"/>
+      <w:r>
+        <w:t xml:space="preserve"> }</w:t>
+      </w:r>
+      <w:proofErr w:type="gramEnd"/>
+      <w:r>
+        <w:t xml:space="preserve">} {% </w:t>
+      </w:r>
+      <w:proofErr w:type="spellStart"/>
+      <w:r>
+        <w:t>endfor</w:t>
+      </w:r>
+      <w:proofErr w:type="spellEnd"/>
+      <w:r>
+        <w:t xml:space="preserve"> </w:t>
+      </w:r>
+      <w:proofErr w:type="gramStart"/>
+      <w:r>
+        <w:t>%}{</w:t>
+      </w:r>
+      <w:proofErr w:type="gramEnd"/>
+      <w:r>
+        <w:t xml:space="preserve">% endif </w:t>
+      </w:r>
+      <w:proofErr w:type="gramStart"/>
+      <w:r>
+        <w:t>%}{</w:t>
+      </w:r>
+      <w:proofErr w:type="gramEnd"/>
+      <w:r>
+        <w:t xml:space="preserve">% if not </w:t>
+      </w:r>
+      <w:proofErr w:type="spellStart"/>
+      <w:proofErr w:type="gramStart"/>
+      <w:r>
+        <w:t>loop.last</w:t>
+      </w:r>
+      <w:proofErr w:type="spellEnd"/>
+      <w:proofErr w:type="gramEnd"/>
+      <w:r>
+        <w:t xml:space="preserve"> %}</w:t>
       </w:r>
       <w:r>
         <w:br/>
       </w:r>
       <w:r>
         <w:br/>
-        <w:t>{% endif %}{% endfor %}</w:t>
+        <w:t xml:space="preserve">{% endif </w:t>
+      </w:r>
+      <w:proofErr w:type="gramStart"/>
+      <w:r>
+        <w:t>%}{</w:t>
+      </w:r>
+      <w:proofErr w:type="gramEnd"/>
+      <w:r>
+        <w:t xml:space="preserve">% </w:t>
+      </w:r>
+      <w:proofErr w:type="spellStart"/>
+      <w:r>
+        <w:t>endfor</w:t>
+      </w:r>
+      <w:proofErr w:type="spellEnd"/>
+      <w:r>
+        <w:t xml:space="preserve"> %}</w:t>
       </w:r>
     </w:p>
     <w:p>
@@ -4034,23 +5699,86 @@
       </w:r>
     </w:p>
     <w:p>
-      <w:r>
-        <w:t>{{ cost_of_inaction }}</w:t>
+      <w:proofErr w:type="gramStart"/>
+      <w:r>
+        <w:t xml:space="preserve">{{ </w:t>
+      </w:r>
+      <w:proofErr w:type="spellStart"/>
+      <w:r>
+        <w:t>cost</w:t>
+      </w:r>
+      <w:proofErr w:type="gramEnd"/>
+      <w:r>
+        <w:t>_of_</w:t>
+      </w:r>
+      <w:proofErr w:type="gramStart"/>
+      <w:r>
+        <w:t>inaction</w:t>
+      </w:r>
+      <w:proofErr w:type="spellEnd"/>
+      <w:r>
+        <w:t xml:space="preserve"> }</w:t>
+      </w:r>
+      <w:proofErr w:type="gramEnd"/>
+      <w:r>
+        <w:t>}</w:t>
       </w:r>
     </w:p>
     <w:p/>
     <w:p>
+      <w:proofErr w:type="gramStart"/>
       <w:r>
         <w:t>{</w:t>
       </w:r>
       <w:r>
-        <w:t>{ cost_of_inaction_summary }}</w:t>
+        <w:t xml:space="preserve">{ </w:t>
+      </w:r>
+      <w:proofErr w:type="spellStart"/>
+      <w:r>
+        <w:t>cost</w:t>
+      </w:r>
+      <w:proofErr w:type="gramEnd"/>
+      <w:r>
+        <w:t>_of_inaction_</w:t>
+      </w:r>
+      <w:proofErr w:type="gramStart"/>
+      <w:r>
+        <w:t>summary</w:t>
+      </w:r>
+      <w:proofErr w:type="spellEnd"/>
+      <w:r>
+        <w:t xml:space="preserve"> }</w:t>
+      </w:r>
+      <w:proofErr w:type="gramEnd"/>
+      <w:r>
+        <w:t>}</w:t>
       </w:r>
     </w:p>
     <w:p/>
     <w:p>
-      <w:r>
-        <w:t>{{ threat_intelligence_context }}</w:t>
+      <w:proofErr w:type="gramStart"/>
+      <w:r>
+        <w:t xml:space="preserve">{{ </w:t>
+      </w:r>
+      <w:proofErr w:type="spellStart"/>
+      <w:r>
+        <w:t>threat</w:t>
+      </w:r>
+      <w:proofErr w:type="gramEnd"/>
+      <w:r>
+        <w:t>_intelligence_</w:t>
+      </w:r>
+      <w:proofErr w:type="gramStart"/>
+      <w:r>
+        <w:t>context</w:t>
+      </w:r>
+      <w:proofErr w:type="spellEnd"/>
+      <w:r>
+        <w:t xml:space="preserve"> }</w:t>
+      </w:r>
+      <w:proofErr w:type="gramEnd"/>
+      <w:r>
+        <w:t>}</w:t>
       </w:r>
     </w:p>
     <w:p/>
@@ -4252,8 +5980,13 @@
             <w:hideMark/>
           </w:tcPr>
           <w:p>
-            <w:r>
-              <w:t>{{ industry }}</w:t>
+            <w:proofErr w:type="gramStart"/>
+            <w:r>
+              <w:t>{{ industry</w:t>
+            </w:r>
+            <w:proofErr w:type="gramEnd"/>
+            <w:r>
+              <w:t xml:space="preserve"> }}</w:t>
             </w:r>
           </w:p>
         </w:tc>
@@ -4309,8 +6042,13 @@
             <w:hideMark/>
           </w:tcPr>
           <w:p>
-            <w:r>
-              <w:t>{{ users }}</w:t>
+            <w:proofErr w:type="gramStart"/>
+            <w:r>
+              <w:t>{{ users</w:t>
+            </w:r>
+            <w:proofErr w:type="gramEnd"/>
+            <w:r>
+              <w:t xml:space="preserve"> }}</w:t>
             </w:r>
           </w:p>
         </w:tc>
@@ -4366,8 +6104,21 @@
             <w:hideMark/>
           </w:tcPr>
           <w:p>
-            <w:r>
-              <w:t>{{ endpoints }} / {{ servers }}</w:t>
+            <w:proofErr w:type="gramStart"/>
+            <w:r>
+              <w:t>{{ endpoints</w:t>
+            </w:r>
+            <w:proofErr w:type="gramEnd"/>
+            <w:r>
+              <w:t xml:space="preserve"> }} / </w:t>
+            </w:r>
+            <w:proofErr w:type="gramStart"/>
+            <w:r>
+              <w:t>{{ servers</w:t>
+            </w:r>
+            <w:proofErr w:type="gramEnd"/>
+            <w:r>
+              <w:t xml:space="preserve"> }}</w:t>
             </w:r>
           </w:p>
         </w:tc>
@@ -4423,8 +6174,21 @@
             <w:hideMark/>
           </w:tcPr>
           <w:p>
-            <w:r>
-              <w:t>{{ operating_systems }}</w:t>
+            <w:proofErr w:type="gramStart"/>
+            <w:r>
+              <w:t xml:space="preserve">{{ </w:t>
+            </w:r>
+            <w:proofErr w:type="spellStart"/>
+            <w:r>
+              <w:t>operating</w:t>
+            </w:r>
+            <w:proofErr w:type="gramEnd"/>
+            <w:r>
+              <w:t>_systems</w:t>
+            </w:r>
+            <w:proofErr w:type="spellEnd"/>
+            <w:r>
+              <w:t xml:space="preserve"> }}</w:t>
             </w:r>
           </w:p>
         </w:tc>
@@ -4480,8 +6244,21 @@
             <w:hideMark/>
           </w:tcPr>
           <w:p>
-            <w:r>
-              <w:t>{{ cloud_env }}</w:t>
+            <w:proofErr w:type="gramStart"/>
+            <w:r>
+              <w:t xml:space="preserve">{{ </w:t>
+            </w:r>
+            <w:proofErr w:type="spellStart"/>
+            <w:r>
+              <w:t>cloud</w:t>
+            </w:r>
+            <w:proofErr w:type="gramEnd"/>
+            <w:r>
+              <w:t>_env</w:t>
+            </w:r>
+            <w:proofErr w:type="spellEnd"/>
+            <w:r>
+              <w:t xml:space="preserve"> }}</w:t>
             </w:r>
           </w:p>
         </w:tc>
@@ -4541,8 +6318,13 @@
             <w:vAlign w:val="center"/>
           </w:tcPr>
           <w:p>
-            <w:r>
-              <w:t>{{ m365_license }}</w:t>
+            <w:proofErr w:type="gramStart"/>
+            <w:r>
+              <w:t>{{ m</w:t>
+            </w:r>
+            <w:proofErr w:type="gramEnd"/>
+            <w:r>
+              <w:t>365_license }}</w:t>
             </w:r>
           </w:p>
         </w:tc>
@@ -4598,8 +6380,21 @@
             <w:hideMark/>
           </w:tcPr>
           <w:p>
-            <w:r>
-              <w:t>{{ in_house_team }}</w:t>
+            <w:proofErr w:type="gramStart"/>
+            <w:r>
+              <w:t xml:space="preserve">{{ </w:t>
+            </w:r>
+            <w:proofErr w:type="spellStart"/>
+            <w:r>
+              <w:t>in</w:t>
+            </w:r>
+            <w:proofErr w:type="gramEnd"/>
+            <w:r>
+              <w:t>_house_team</w:t>
+            </w:r>
+            <w:proofErr w:type="spellEnd"/>
+            <w:r>
+              <w:t xml:space="preserve"> }}</w:t>
             </w:r>
           </w:p>
         </w:tc>
@@ -4655,8 +6450,13 @@
             <w:hideMark/>
           </w:tcPr>
           <w:p>
-            <w:r>
-              <w:t>{{ compliance }}</w:t>
+            <w:proofErr w:type="gramStart"/>
+            <w:r>
+              <w:t>{{ compliance</w:t>
+            </w:r>
+            <w:proofErr w:type="gramEnd"/>
+            <w:r>
+              <w:t xml:space="preserve"> }}</w:t>
             </w:r>
           </w:p>
         </w:tc>
@@ -4712,8 +6512,21 @@
             <w:hideMark/>
           </w:tcPr>
           <w:p>
-            <w:r>
-              <w:t>{{ cap_summary }}</w:t>
+            <w:proofErr w:type="gramStart"/>
+            <w:r>
+              <w:t xml:space="preserve">{{ </w:t>
+            </w:r>
+            <w:proofErr w:type="spellStart"/>
+            <w:r>
+              <w:t>cap</w:t>
+            </w:r>
+            <w:proofErr w:type="gramEnd"/>
+            <w:r>
+              <w:t>_summary</w:t>
+            </w:r>
+            <w:proofErr w:type="spellEnd"/>
+            <w:r>
+              <w:t xml:space="preserve"> }}</w:t>
             </w:r>
           </w:p>
         </w:tc>
@@ -4880,8 +6693,21 @@
             <w:hideMark/>
           </w:tcPr>
           <w:p>
-            <w:r>
-              <w:t>{{ mdr_provider }}</w:t>
+            <w:proofErr w:type="gramStart"/>
+            <w:r>
+              <w:t xml:space="preserve">{{ </w:t>
+            </w:r>
+            <w:proofErr w:type="spellStart"/>
+            <w:r>
+              <w:t>mdr</w:t>
+            </w:r>
+            <w:proofErr w:type="gramEnd"/>
+            <w:r>
+              <w:t>_provider</w:t>
+            </w:r>
+            <w:proofErr w:type="spellEnd"/>
+            <w:r>
+              <w:t xml:space="preserve"> }}</w:t>
             </w:r>
           </w:p>
         </w:tc>
@@ -4937,8 +6763,13 @@
             <w:hideMark/>
           </w:tcPr>
           <w:p>
-            <w:r>
-              <w:t>{{ endpoint }}</w:t>
+            <w:proofErr w:type="gramStart"/>
+            <w:r>
+              <w:t>{{ endpoint</w:t>
+            </w:r>
+            <w:proofErr w:type="gramEnd"/>
+            <w:r>
+              <w:t xml:space="preserve"> }}</w:t>
             </w:r>
           </w:p>
         </w:tc>
@@ -4998,8 +6829,21 @@
             <w:vAlign w:val="center"/>
           </w:tcPr>
           <w:p>
-            <w:r>
-              <w:t>{{ endpoint_posture }}</w:t>
+            <w:proofErr w:type="gramStart"/>
+            <w:r>
+              <w:t xml:space="preserve">{{ </w:t>
+            </w:r>
+            <w:proofErr w:type="spellStart"/>
+            <w:r>
+              <w:t>endpoint</w:t>
+            </w:r>
+            <w:proofErr w:type="gramEnd"/>
+            <w:r>
+              <w:t>_posture</w:t>
+            </w:r>
+            <w:proofErr w:type="spellEnd"/>
+            <w:r>
+              <w:t xml:space="preserve"> }}</w:t>
             </w:r>
           </w:p>
         </w:tc>
@@ -5055,8 +6899,13 @@
             <w:hideMark/>
           </w:tcPr>
           <w:p>
-            <w:r>
-              <w:t>{{ firewall }}</w:t>
+            <w:proofErr w:type="gramStart"/>
+            <w:r>
+              <w:t>{{ firewall</w:t>
+            </w:r>
+            <w:proofErr w:type="gramEnd"/>
+            <w:r>
+              <w:t xml:space="preserve"> }}</w:t>
             </w:r>
           </w:p>
         </w:tc>
@@ -5112,8 +6961,13 @@
             <w:hideMark/>
           </w:tcPr>
           <w:p>
-            <w:r>
-              <w:t>{{ identity }}</w:t>
+            <w:proofErr w:type="gramStart"/>
+            <w:r>
+              <w:t>{{ identity</w:t>
+            </w:r>
+            <w:proofErr w:type="gramEnd"/>
+            <w:r>
+              <w:t xml:space="preserve"> }}</w:t>
             </w:r>
           </w:p>
         </w:tc>
@@ -5169,8 +7023,13 @@
             <w:hideMark/>
           </w:tcPr>
           <w:p>
-            <w:r>
-              <w:t>{{ email }}</w:t>
+            <w:proofErr w:type="gramStart"/>
+            <w:r>
+              <w:t>{{ email</w:t>
+            </w:r>
+            <w:proofErr w:type="gramEnd"/>
+            <w:r>
+              <w:t xml:space="preserve"> }}</w:t>
             </w:r>
           </w:p>
         </w:tc>
@@ -5226,8 +7085,13 @@
             <w:hideMark/>
           </w:tcPr>
           <w:p>
-            <w:r>
-              <w:t>{{ savviness }}</w:t>
+            <w:proofErr w:type="gramStart"/>
+            <w:r>
+              <w:t>{{ savviness</w:t>
+            </w:r>
+            <w:proofErr w:type="gramEnd"/>
+            <w:r>
+              <w:t xml:space="preserve"> }}</w:t>
             </w:r>
           </w:p>
         </w:tc>
@@ -5283,8 +7147,21 @@
             <w:hideMark/>
           </w:tcPr>
           <w:p>
-            <w:r>
-              <w:t>{{ in_house_team }}</w:t>
+            <w:proofErr w:type="gramStart"/>
+            <w:r>
+              <w:t xml:space="preserve">{{ </w:t>
+            </w:r>
+            <w:proofErr w:type="spellStart"/>
+            <w:r>
+              <w:t>in</w:t>
+            </w:r>
+            <w:proofErr w:type="gramEnd"/>
+            <w:r>
+              <w:t>_house_team</w:t>
+            </w:r>
+            <w:proofErr w:type="spellEnd"/>
+            <w:r>
+              <w:t xml:space="preserve"> }}</w:t>
             </w:r>
           </w:p>
         </w:tc>
@@ -5340,8 +7217,21 @@
             <w:hideMark/>
           </w:tcPr>
           <w:p>
-            <w:r>
-              <w:t>{{ pentest_status }}</w:t>
+            <w:proofErr w:type="gramStart"/>
+            <w:r>
+              <w:t xml:space="preserve">{{ </w:t>
+            </w:r>
+            <w:proofErr w:type="spellStart"/>
+            <w:r>
+              <w:t>pentest</w:t>
+            </w:r>
+            <w:proofErr w:type="gramEnd"/>
+            <w:r>
+              <w:t>_status</w:t>
+            </w:r>
+            <w:proofErr w:type="spellEnd"/>
+            <w:r>
+              <w:t xml:space="preserve"> }}</w:t>
             </w:r>
           </w:p>
         </w:tc>
@@ -5397,8 +7287,21 @@
             <w:hideMark/>
           </w:tcPr>
           <w:p>
-            <w:r>
-              <w:t>{{ vuln_scanning }}</w:t>
+            <w:proofErr w:type="gramStart"/>
+            <w:r>
+              <w:t xml:space="preserve">{{ </w:t>
+            </w:r>
+            <w:proofErr w:type="spellStart"/>
+            <w:r>
+              <w:t>vuln</w:t>
+            </w:r>
+            <w:proofErr w:type="gramEnd"/>
+            <w:r>
+              <w:t>_scanning</w:t>
+            </w:r>
+            <w:proofErr w:type="spellEnd"/>
+            <w:r>
+              <w:t xml:space="preserve"> }}</w:t>
             </w:r>
           </w:p>
         </w:tc>
@@ -5549,8 +7452,13 @@
             <w:hideMark/>
           </w:tcPr>
           <w:p>
-            <w:r>
-              <w:t>{{ backups }}</w:t>
+            <w:proofErr w:type="gramStart"/>
+            <w:r>
+              <w:t>{{ backups</w:t>
+            </w:r>
+            <w:proofErr w:type="gramEnd"/>
+            <w:r>
+              <w:t xml:space="preserve"> }}</w:t>
             </w:r>
           </w:p>
         </w:tc>
@@ -5606,8 +7514,21 @@
             <w:hideMark/>
           </w:tcPr>
           <w:p>
-            <w:r>
-              <w:t>{{ saas_backup }}</w:t>
+            <w:proofErr w:type="gramStart"/>
+            <w:r>
+              <w:t xml:space="preserve">{{ </w:t>
+            </w:r>
+            <w:proofErr w:type="spellStart"/>
+            <w:r>
+              <w:t>saas</w:t>
+            </w:r>
+            <w:proofErr w:type="gramEnd"/>
+            <w:r>
+              <w:t>_backup</w:t>
+            </w:r>
+            <w:proofErr w:type="spellEnd"/>
+            <w:r>
+              <w:t xml:space="preserve"> }}</w:t>
             </w:r>
           </w:p>
         </w:tc>
@@ -5663,8 +7584,21 @@
             <w:hideMark/>
           </w:tcPr>
           <w:p>
-            <w:r>
-              <w:t>{{ remote_access }}</w:t>
+            <w:proofErr w:type="gramStart"/>
+            <w:r>
+              <w:t xml:space="preserve">{{ </w:t>
+            </w:r>
+            <w:proofErr w:type="spellStart"/>
+            <w:r>
+              <w:t>remote</w:t>
+            </w:r>
+            <w:proofErr w:type="gramEnd"/>
+            <w:r>
+              <w:t>_access</w:t>
+            </w:r>
+            <w:proofErr w:type="spellEnd"/>
+            <w:r>
+              <w:t xml:space="preserve"> }}</w:t>
             </w:r>
           </w:p>
         </w:tc>
@@ -5720,8 +7654,21 @@
             <w:hideMark/>
           </w:tcPr>
           <w:p>
-            <w:r>
-              <w:t>{{ ir_readiness }}</w:t>
+            <w:proofErr w:type="gramStart"/>
+            <w:r>
+              <w:t xml:space="preserve">{{ </w:t>
+            </w:r>
+            <w:proofErr w:type="spellStart"/>
+            <w:r>
+              <w:t>ir</w:t>
+            </w:r>
+            <w:proofErr w:type="gramEnd"/>
+            <w:r>
+              <w:t>_readiness</w:t>
+            </w:r>
+            <w:proofErr w:type="spellEnd"/>
+            <w:r>
+              <w:t xml:space="preserve"> }}</w:t>
             </w:r>
           </w:p>
         </w:tc>
@@ -5777,8 +7724,21 @@
             <w:hideMark/>
           </w:tcPr>
           <w:p>
-            <w:r>
-              <w:t>{{ mfa_status }}</w:t>
+            <w:proofErr w:type="gramStart"/>
+            <w:r>
+              <w:t xml:space="preserve">{{ </w:t>
+            </w:r>
+            <w:proofErr w:type="spellStart"/>
+            <w:r>
+              <w:t>mfa</w:t>
+            </w:r>
+            <w:proofErr w:type="gramEnd"/>
+            <w:r>
+              <w:t>_status</w:t>
+            </w:r>
+            <w:proofErr w:type="spellEnd"/>
+            <w:r>
+              <w:t xml:space="preserve"> }}</w:t>
             </w:r>
           </w:p>
         </w:tc>
@@ -5834,8 +7794,13 @@
             <w:hideMark/>
           </w:tcPr>
           <w:p>
-            <w:r>
-              <w:t>{{ patching }}</w:t>
+            <w:proofErr w:type="gramStart"/>
+            <w:r>
+              <w:t>{{ patching</w:t>
+            </w:r>
+            <w:proofErr w:type="gramEnd"/>
+            <w:r>
+              <w:t xml:space="preserve"> }}</w:t>
             </w:r>
           </w:p>
         </w:tc>
@@ -5891,8 +7856,13 @@
             <w:hideMark/>
           </w:tcPr>
           <w:p>
-            <w:r>
-              <w:t>{{ insurance }}</w:t>
+            <w:proofErr w:type="gramStart"/>
+            <w:r>
+              <w:t>{{ insurance</w:t>
+            </w:r>
+            <w:proofErr w:type="gramEnd"/>
+            <w:r>
+              <w:t xml:space="preserve"> }}</w:t>
             </w:r>
           </w:p>
         </w:tc>
@@ -5925,8 +7895,17 @@
                 <w:b/>
                 <w:bCs/>
               </w:rPr>
-              <w:t>Outage Tolerence</w:t>
-            </w:r>
+              <w:t xml:space="preserve">Outage </w:t>
+            </w:r>
+            <w:proofErr w:type="spellStart"/>
+            <w:r>
+              <w:rPr>
+                <w:b/>
+                <w:bCs/>
+              </w:rPr>
+              <w:t>Tolerence</w:t>
+            </w:r>
+            <w:proofErr w:type="spellEnd"/>
           </w:p>
         </w:tc>
         <w:tc>
@@ -5948,8 +7927,18 @@
             <w:hideMark/>
           </w:tcPr>
           <w:p>
-            <w:r>
-              <w:t>{{ rto }}</w:t>
+            <w:proofErr w:type="gramStart"/>
+            <w:r>
+              <w:t xml:space="preserve">{{ </w:t>
+            </w:r>
+            <w:proofErr w:type="spellStart"/>
+            <w:r>
+              <w:t>rto</w:t>
+            </w:r>
+            <w:proofErr w:type="spellEnd"/>
+            <w:proofErr w:type="gramEnd"/>
+            <w:r>
+              <w:t xml:space="preserve"> }}</w:t>
             </w:r>
           </w:p>
         </w:tc>
@@ -5989,8 +7978,29 @@
         </w:rPr>
         <w:t xml:space="preserve">Domain: </w:t>
       </w:r>
-      <w:r>
-        <w:t>{{ d.domain_name }}</w:t>
+      <w:proofErr w:type="gramStart"/>
+      <w:r>
+        <w:t xml:space="preserve">{{ </w:t>
+      </w:r>
+      <w:proofErr w:type="spellStart"/>
+      <w:r>
+        <w:t>d</w:t>
+      </w:r>
+      <w:proofErr w:type="gramEnd"/>
+      <w:r>
+        <w:t>.domain_</w:t>
+      </w:r>
+      <w:proofErr w:type="gramStart"/>
+      <w:r>
+        <w:t>name</w:t>
+      </w:r>
+      <w:proofErr w:type="spellEnd"/>
+      <w:r>
+        <w:t xml:space="preserve"> }</w:t>
+      </w:r>
+      <w:proofErr w:type="gramEnd"/>
+      <w:r>
+        <w:t>}</w:t>
       </w:r>
     </w:p>
     <w:p/>
@@ -6138,12 +8148,19 @@
             <w:hideMark/>
           </w:tcPr>
           <w:p>
+            <w:proofErr w:type="gramStart"/>
             <w:r>
               <w:t xml:space="preserve">{{ </w:t>
             </w:r>
-            <w:r>
-              <w:t>d.current_maturity_display</w:t>
-            </w:r>
+            <w:proofErr w:type="spellStart"/>
+            <w:r>
+              <w:t>d</w:t>
+            </w:r>
+            <w:proofErr w:type="gramEnd"/>
+            <w:r>
+              <w:t>.current_maturity_display</w:t>
+            </w:r>
+            <w:proofErr w:type="spellEnd"/>
             <w:r>
               <w:t xml:space="preserve"> </w:t>
             </w:r>
@@ -6204,8 +8221,21 @@
             <w:hideMark/>
           </w:tcPr>
           <w:p>
-            <w:r>
-              <w:t>{{ d.current_state_analysis }}</w:t>
+            <w:proofErr w:type="gramStart"/>
+            <w:r>
+              <w:t xml:space="preserve">{{ </w:t>
+            </w:r>
+            <w:proofErr w:type="spellStart"/>
+            <w:r>
+              <w:t>d</w:t>
+            </w:r>
+            <w:proofErr w:type="gramEnd"/>
+            <w:r>
+              <w:t>.current_state_analysis</w:t>
+            </w:r>
+            <w:proofErr w:type="spellEnd"/>
+            <w:r>
+              <w:t xml:space="preserve"> }}</w:t>
             </w:r>
           </w:p>
         </w:tc>
@@ -6261,8 +8291,21 @@
             <w:hideMark/>
           </w:tcPr>
           <w:p>
-            <w:r>
-              <w:t>{{ d.business_impact_narrative }}</w:t>
+            <w:proofErr w:type="gramStart"/>
+            <w:r>
+              <w:t xml:space="preserve">{{ </w:t>
+            </w:r>
+            <w:proofErr w:type="spellStart"/>
+            <w:r>
+              <w:t>d</w:t>
+            </w:r>
+            <w:proofErr w:type="gramEnd"/>
+            <w:r>
+              <w:t>.business_impact_narrative</w:t>
+            </w:r>
+            <w:proofErr w:type="spellEnd"/>
+            <w:r>
+              <w:t xml:space="preserve"> }}</w:t>
             </w:r>
           </w:p>
         </w:tc>
@@ -6319,11 +8362,74 @@
           </w:tcPr>
           <w:p>
             <w:r>
-              <w:t>{% for gap in d.critical_gaps %}• {{ gap }}{% if not loop.last %}</w:t>
+              <w:t xml:space="preserve">{% for gap in </w:t>
+            </w:r>
+            <w:proofErr w:type="spellStart"/>
+            <w:proofErr w:type="gramStart"/>
+            <w:r>
+              <w:t>d.critical</w:t>
+            </w:r>
+            <w:proofErr w:type="gramEnd"/>
+            <w:r>
+              <w:t>_gaps</w:t>
+            </w:r>
+            <w:proofErr w:type="spellEnd"/>
+            <w:r>
+              <w:t xml:space="preserve"> </w:t>
+            </w:r>
+            <w:proofErr w:type="gramStart"/>
+            <w:r>
+              <w:t>%}•</w:t>
+            </w:r>
+            <w:proofErr w:type="gramEnd"/>
+            <w:r>
+              <w:t xml:space="preserve"> </w:t>
+            </w:r>
+            <w:proofErr w:type="gramStart"/>
+            <w:r>
+              <w:t>{{ gap</w:t>
+            </w:r>
+            <w:proofErr w:type="gramEnd"/>
+            <w:r>
+              <w:t xml:space="preserve"> </w:t>
+            </w:r>
+            <w:proofErr w:type="gramStart"/>
+            <w:r>
+              <w:t>}}{</w:t>
+            </w:r>
+            <w:proofErr w:type="gramEnd"/>
+            <w:r>
+              <w:t xml:space="preserve">% if not </w:t>
+            </w:r>
+            <w:proofErr w:type="spellStart"/>
+            <w:proofErr w:type="gramStart"/>
+            <w:r>
+              <w:t>loop.last</w:t>
+            </w:r>
+            <w:proofErr w:type="spellEnd"/>
+            <w:proofErr w:type="gramEnd"/>
+            <w:r>
+              <w:t xml:space="preserve"> %}</w:t>
             </w:r>
             <w:r>
               <w:br/>
-              <w:t>{% endif %}{% endfor %}</w:t>
+              <w:t xml:space="preserve">{% endif </w:t>
+            </w:r>
+            <w:proofErr w:type="gramStart"/>
+            <w:r>
+              <w:t>%}{</w:t>
+            </w:r>
+            <w:proofErr w:type="gramEnd"/>
+            <w:r>
+              <w:t xml:space="preserve">% </w:t>
+            </w:r>
+            <w:proofErr w:type="spellStart"/>
+            <w:r>
+              <w:t>endfor</w:t>
+            </w:r>
+            <w:proofErr w:type="spellEnd"/>
+            <w:r>
+              <w:t xml:space="preserve"> %}</w:t>
             </w:r>
           </w:p>
         </w:tc>
@@ -6380,11 +8486,74 @@
           </w:tcPr>
           <w:p>
             <w:r>
-              <w:t>{% for win in d.vendor_agnostic_quick_wins %}• {{ win }}{% if not loop.last %}</w:t>
+              <w:t xml:space="preserve">{% for win in </w:t>
+            </w:r>
+            <w:proofErr w:type="spellStart"/>
+            <w:proofErr w:type="gramStart"/>
+            <w:r>
+              <w:t>d.vendor</w:t>
+            </w:r>
+            <w:proofErr w:type="gramEnd"/>
+            <w:r>
+              <w:t>_agnostic_quick_wins</w:t>
+            </w:r>
+            <w:proofErr w:type="spellEnd"/>
+            <w:r>
+              <w:t xml:space="preserve"> </w:t>
+            </w:r>
+            <w:proofErr w:type="gramStart"/>
+            <w:r>
+              <w:t>%}•</w:t>
+            </w:r>
+            <w:proofErr w:type="gramEnd"/>
+            <w:r>
+              <w:t xml:space="preserve"> </w:t>
+            </w:r>
+            <w:proofErr w:type="gramStart"/>
+            <w:r>
+              <w:t>{{ win</w:t>
+            </w:r>
+            <w:proofErr w:type="gramEnd"/>
+            <w:r>
+              <w:t xml:space="preserve"> </w:t>
+            </w:r>
+            <w:proofErr w:type="gramStart"/>
+            <w:r>
+              <w:t>}}{</w:t>
+            </w:r>
+            <w:proofErr w:type="gramEnd"/>
+            <w:r>
+              <w:t xml:space="preserve">% if not </w:t>
+            </w:r>
+            <w:proofErr w:type="spellStart"/>
+            <w:proofErr w:type="gramStart"/>
+            <w:r>
+              <w:t>loop.last</w:t>
+            </w:r>
+            <w:proofErr w:type="spellEnd"/>
+            <w:proofErr w:type="gramEnd"/>
+            <w:r>
+              <w:t xml:space="preserve"> %}</w:t>
             </w:r>
             <w:r>
               <w:br/>
-              <w:t>{% endif %}{% endfor %}</w:t>
+              <w:t xml:space="preserve">{% endif </w:t>
+            </w:r>
+            <w:proofErr w:type="gramStart"/>
+            <w:r>
+              <w:t>%}{</w:t>
+            </w:r>
+            <w:proofErr w:type="gramEnd"/>
+            <w:r>
+              <w:t xml:space="preserve">% </w:t>
+            </w:r>
+            <w:proofErr w:type="spellStart"/>
+            <w:r>
+              <w:t>endfor</w:t>
+            </w:r>
+            <w:proofErr w:type="spellEnd"/>
+            <w:r>
+              <w:t xml:space="preserve"> %}</w:t>
             </w:r>
           </w:p>
         </w:tc>
@@ -6441,11 +8610,74 @@
           </w:tcPr>
           <w:p>
             <w:r>
-              <w:t>{% for sol in d.recommended_solutions %}• {{ sol }}{% if not loop.last %}</w:t>
+              <w:t xml:space="preserve">{% for sol in </w:t>
+            </w:r>
+            <w:proofErr w:type="spellStart"/>
+            <w:proofErr w:type="gramStart"/>
+            <w:r>
+              <w:t>d.recommended</w:t>
+            </w:r>
+            <w:proofErr w:type="gramEnd"/>
+            <w:r>
+              <w:t>_solutions</w:t>
+            </w:r>
+            <w:proofErr w:type="spellEnd"/>
+            <w:r>
+              <w:t xml:space="preserve"> </w:t>
+            </w:r>
+            <w:proofErr w:type="gramStart"/>
+            <w:r>
+              <w:t>%}•</w:t>
+            </w:r>
+            <w:proofErr w:type="gramEnd"/>
+            <w:r>
+              <w:t xml:space="preserve"> </w:t>
+            </w:r>
+            <w:proofErr w:type="gramStart"/>
+            <w:r>
+              <w:t>{{ sol</w:t>
+            </w:r>
+            <w:proofErr w:type="gramEnd"/>
+            <w:r>
+              <w:t xml:space="preserve"> </w:t>
+            </w:r>
+            <w:proofErr w:type="gramStart"/>
+            <w:r>
+              <w:t>}}{</w:t>
+            </w:r>
+            <w:proofErr w:type="gramEnd"/>
+            <w:r>
+              <w:t xml:space="preserve">% if not </w:t>
+            </w:r>
+            <w:proofErr w:type="spellStart"/>
+            <w:proofErr w:type="gramStart"/>
+            <w:r>
+              <w:t>loop.last</w:t>
+            </w:r>
+            <w:proofErr w:type="spellEnd"/>
+            <w:proofErr w:type="gramEnd"/>
+            <w:r>
+              <w:t xml:space="preserve"> %}</w:t>
             </w:r>
             <w:r>
               <w:br/>
-              <w:t>{% endif %}{% endfor %}</w:t>
+              <w:t xml:space="preserve">{% endif </w:t>
+            </w:r>
+            <w:proofErr w:type="gramStart"/>
+            <w:r>
+              <w:t>%}{</w:t>
+            </w:r>
+            <w:proofErr w:type="gramEnd"/>
+            <w:r>
+              <w:t xml:space="preserve">% </w:t>
+            </w:r>
+            <w:proofErr w:type="spellStart"/>
+            <w:r>
+              <w:t>endfor</w:t>
+            </w:r>
+            <w:proofErr w:type="spellEnd"/>
+            <w:r>
+              <w:t xml:space="preserve"> %}</w:t>
             </w:r>
           </w:p>
         </w:tc>
@@ -6501,8 +8733,21 @@
             <w:hideMark/>
           </w:tcPr>
           <w:p>
-            <w:r>
-              <w:t>{{ d.remediation_rationale }}</w:t>
+            <w:proofErr w:type="gramStart"/>
+            <w:r>
+              <w:t xml:space="preserve">{{ </w:t>
+            </w:r>
+            <w:proofErr w:type="spellStart"/>
+            <w:r>
+              <w:t>d</w:t>
+            </w:r>
+            <w:proofErr w:type="gramEnd"/>
+            <w:r>
+              <w:t>.remediation_rationale</w:t>
+            </w:r>
+            <w:proofErr w:type="spellEnd"/>
+            <w:r>
+              <w:t xml:space="preserve"> }}</w:t>
             </w:r>
           </w:p>
         </w:tc>
@@ -6562,8 +8807,21 @@
             <w:vAlign w:val="center"/>
           </w:tcPr>
           <w:p>
-            <w:r>
-              <w:t>{{ d.shared_responsibility }}</w:t>
+            <w:proofErr w:type="gramStart"/>
+            <w:r>
+              <w:t xml:space="preserve">{{ </w:t>
+            </w:r>
+            <w:proofErr w:type="spellStart"/>
+            <w:r>
+              <w:t>d</w:t>
+            </w:r>
+            <w:proofErr w:type="gramEnd"/>
+            <w:r>
+              <w:t>.shared_responsibility</w:t>
+            </w:r>
+            <w:proofErr w:type="spellEnd"/>
+            <w:r>
+              <w:t xml:space="preserve"> }}</w:t>
             </w:r>
           </w:p>
         </w:tc>
@@ -6574,7 +8832,15 @@
         <w:pStyle w:val="BodyText"/>
       </w:pPr>
       <w:r>
-        <w:t>{% endfor %}</w:t>
+        <w:t xml:space="preserve">{% </w:t>
+      </w:r>
+      <w:proofErr w:type="spellStart"/>
+      <w:r>
+        <w:t>endfor</w:t>
+      </w:r>
+      <w:proofErr w:type="spellEnd"/>
+      <w:r>
+        <w:t xml:space="preserve"> %}</w:t>
       </w:r>
     </w:p>
     <w:p>
@@ -6595,8 +8861,29 @@
       </w:r>
     </w:p>
     <w:p>
-      <w:r>
-        <w:t>{{ proactive_testing_programme }}</w:t>
+      <w:proofErr w:type="gramStart"/>
+      <w:r>
+        <w:t xml:space="preserve">{{ </w:t>
+      </w:r>
+      <w:proofErr w:type="spellStart"/>
+      <w:r>
+        <w:t>proactive</w:t>
+      </w:r>
+      <w:proofErr w:type="gramEnd"/>
+      <w:r>
+        <w:t>_testing_</w:t>
+      </w:r>
+      <w:proofErr w:type="gramStart"/>
+      <w:r>
+        <w:t>programme</w:t>
+      </w:r>
+      <w:proofErr w:type="spellEnd"/>
+      <w:r>
+        <w:t xml:space="preserve"> }</w:t>
+      </w:r>
+      <w:proofErr w:type="gramEnd"/>
+      <w:r>
+        <w:t>}</w:t>
       </w:r>
     </w:p>
     <w:p/>
@@ -6609,8 +8896,29 @@
       </w:r>
     </w:p>
     <w:p>
-      <w:r>
-        <w:t>{{ incident_response_plan_outline }}</w:t>
+      <w:proofErr w:type="gramStart"/>
+      <w:r>
+        <w:t xml:space="preserve">{{ </w:t>
+      </w:r>
+      <w:proofErr w:type="spellStart"/>
+      <w:r>
+        <w:t>incident</w:t>
+      </w:r>
+      <w:proofErr w:type="gramEnd"/>
+      <w:r>
+        <w:t>_response_plan_</w:t>
+      </w:r>
+      <w:proofErr w:type="gramStart"/>
+      <w:r>
+        <w:t>outline</w:t>
+      </w:r>
+      <w:proofErr w:type="spellEnd"/>
+      <w:r>
+        <w:t xml:space="preserve"> }</w:t>
+      </w:r>
+      <w:proofErr w:type="gramEnd"/>
+      <w:r>
+        <w:t>}</w:t>
       </w:r>
     </w:p>
     <w:p/>
@@ -6623,8 +8931,29 @@
       </w:r>
     </w:p>
     <w:p>
-      <w:r>
-        <w:t>{{ disaster_recovery_plan_outline }}</w:t>
+      <w:proofErr w:type="gramStart"/>
+      <w:r>
+        <w:t xml:space="preserve">{{ </w:t>
+      </w:r>
+      <w:proofErr w:type="spellStart"/>
+      <w:r>
+        <w:t>disaster</w:t>
+      </w:r>
+      <w:proofErr w:type="gramEnd"/>
+      <w:r>
+        <w:t>_recovery_plan_</w:t>
+      </w:r>
+      <w:proofErr w:type="gramStart"/>
+      <w:r>
+        <w:t>outline</w:t>
+      </w:r>
+      <w:proofErr w:type="spellEnd"/>
+      <w:r>
+        <w:t xml:space="preserve"> }</w:t>
+      </w:r>
+      <w:proofErr w:type="gramEnd"/>
+      <w:r>
+        <w:t>}</w:t>
       </w:r>
     </w:p>
     <w:p/>
@@ -6710,7 +9039,39 @@
     <w:p/>
     <w:p>
       <w:r>
-        <w:t>These phases delineate the strategies required to implement a robust security, goveneance and compliance solution to effectively defend {{ customer_name }} moving forward.  The phases are made up as such:</w:t>
+        <w:t xml:space="preserve">These phases delineate the strategies required to implement a robust security, </w:t>
+      </w:r>
+      <w:proofErr w:type="spellStart"/>
+      <w:r>
+        <w:t>goveneance</w:t>
+      </w:r>
+      <w:proofErr w:type="spellEnd"/>
+      <w:r>
+        <w:t xml:space="preserve"> and compliance solution to effectively defend </w:t>
+      </w:r>
+      <w:proofErr w:type="gramStart"/>
+      <w:r>
+        <w:t xml:space="preserve">{{ </w:t>
+      </w:r>
+      <w:proofErr w:type="spellStart"/>
+      <w:r>
+        <w:t>customer</w:t>
+      </w:r>
+      <w:proofErr w:type="gramEnd"/>
+      <w:r>
+        <w:t>_</w:t>
+      </w:r>
+      <w:proofErr w:type="gramStart"/>
+      <w:r>
+        <w:t>name</w:t>
+      </w:r>
+      <w:proofErr w:type="spellEnd"/>
+      <w:r>
+        <w:t xml:space="preserve"> }</w:t>
+      </w:r>
+      <w:proofErr w:type="gramEnd"/>
+      <w:r>
+        <w:t>} moving forward.  The phases are made up as such:</w:t>
       </w:r>
     </w:p>
     <w:p/>
@@ -7110,13 +9471,59 @@
         </w:rPr>
         <w:t xml:space="preserve">Please find below a bespoke roadmap of suggested improvements tailored for </w:t>
       </w:r>
+      <w:proofErr w:type="gramStart"/>
       <w:r>
         <w:rPr>
           <w:rFonts w:ascii="Roboto" w:hAnsi="Roboto"/>
           <w:sz w:val="20"/>
           <w:szCs w:val="20"/>
         </w:rPr>
-        <w:t>{{ customer_name }}</w:t>
+        <w:t xml:space="preserve">{{ </w:t>
+      </w:r>
+      <w:proofErr w:type="spellStart"/>
+      <w:r>
+        <w:rPr>
+          <w:rFonts w:ascii="Roboto" w:hAnsi="Roboto"/>
+          <w:sz w:val="20"/>
+          <w:szCs w:val="20"/>
+        </w:rPr>
+        <w:t>customer</w:t>
+      </w:r>
+      <w:proofErr w:type="gramEnd"/>
+      <w:r>
+        <w:rPr>
+          <w:rFonts w:ascii="Roboto" w:hAnsi="Roboto"/>
+          <w:sz w:val="20"/>
+          <w:szCs w:val="20"/>
+        </w:rPr>
+        <w:t>_</w:t>
+      </w:r>
+      <w:proofErr w:type="gramStart"/>
+      <w:r>
+        <w:rPr>
+          <w:rFonts w:ascii="Roboto" w:hAnsi="Roboto"/>
+          <w:sz w:val="20"/>
+          <w:szCs w:val="20"/>
+        </w:rPr>
+        <w:t>name</w:t>
+      </w:r>
+      <w:proofErr w:type="spellEnd"/>
+      <w:r>
+        <w:rPr>
+          <w:rFonts w:ascii="Roboto" w:hAnsi="Roboto"/>
+          <w:sz w:val="20"/>
+          <w:szCs w:val="20"/>
+        </w:rPr>
+        <w:t xml:space="preserve"> }</w:t>
+      </w:r>
+      <w:proofErr w:type="gramEnd"/>
+      <w:r>
+        <w:rPr>
+          <w:rFonts w:ascii="Roboto" w:hAnsi="Roboto"/>
+          <w:sz w:val="20"/>
+          <w:szCs w:val="20"/>
+        </w:rPr>
+        <w:t>}</w:t>
       </w:r>
       <w:r>
         <w:rPr>
@@ -7137,14 +9544,32 @@
     </w:p>
     <w:p/>
     <w:p>
+      <w:proofErr w:type="gramStart"/>
       <w:r>
         <w:t>{{</w:t>
       </w:r>
       <w:r>
-        <w:t xml:space="preserve"> partnership_details</w:t>
-      </w:r>
-      <w:r>
-        <w:t xml:space="preserve"> }}</w:t>
+        <w:t xml:space="preserve"> </w:t>
+      </w:r>
+      <w:proofErr w:type="spellStart"/>
+      <w:r>
+        <w:t>partnership</w:t>
+      </w:r>
+      <w:proofErr w:type="gramEnd"/>
+      <w:r>
+        <w:t>_</w:t>
+      </w:r>
+      <w:proofErr w:type="gramStart"/>
+      <w:r>
+        <w:t>details</w:t>
+      </w:r>
+      <w:proofErr w:type="spellEnd"/>
+      <w:r>
+        <w:t xml:space="preserve"> }</w:t>
+      </w:r>
+      <w:proofErr w:type="gramEnd"/>
+      <w:r>
+        <w:t>}</w:t>
       </w:r>
     </w:p>
     <w:p>
@@ -7303,11 +9728,26 @@
             <w:hideMark/>
           </w:tcPr>
           <w:p>
+            <w:proofErr w:type="gramStart"/>
             <w:r>
               <w:rPr>
                 <w:rFonts w:cs="Courier New"/>
               </w:rPr>
-              <w:t>{{ r.phase_</w:t>
+              <w:t xml:space="preserve">{{ </w:t>
+            </w:r>
+            <w:proofErr w:type="spellStart"/>
+            <w:r>
+              <w:rPr>
+                <w:rFonts w:cs="Courier New"/>
+              </w:rPr>
+              <w:t>r</w:t>
+            </w:r>
+            <w:proofErr w:type="gramEnd"/>
+            <w:r>
+              <w:rPr>
+                <w:rFonts w:cs="Courier New"/>
+              </w:rPr>
+              <w:t>.phase_</w:t>
             </w:r>
             <w:r>
               <w:rPr>
@@ -7315,6 +9755,7 @@
               </w:rPr>
               <w:t>title</w:t>
             </w:r>
+            <w:proofErr w:type="spellEnd"/>
             <w:r>
               <w:rPr>
                 <w:rFonts w:cs="Courier New"/>
@@ -7384,11 +9825,33 @@
                 <w:rFonts w:cs="Courier New"/>
               </w:rPr>
             </w:pPr>
+            <w:proofErr w:type="gramStart"/>
             <w:r>
               <w:rPr>
                 <w:rFonts w:cs="Courier New"/>
               </w:rPr>
-              <w:t>{{ r.timeline }}</w:t>
+              <w:t xml:space="preserve">{{ </w:t>
+            </w:r>
+            <w:proofErr w:type="spellStart"/>
+            <w:r>
+              <w:rPr>
+                <w:rFonts w:cs="Courier New"/>
+              </w:rPr>
+              <w:t>r</w:t>
+            </w:r>
+            <w:proofErr w:type="gramEnd"/>
+            <w:r>
+              <w:rPr>
+                <w:rFonts w:cs="Courier New"/>
+              </w:rPr>
+              <w:t>.timeline</w:t>
+            </w:r>
+            <w:proofErr w:type="spellEnd"/>
+            <w:r>
+              <w:rPr>
+                <w:rFonts w:cs="Courier New"/>
+              </w:rPr>
+              <w:t xml:space="preserve"> }}</w:t>
             </w:r>
           </w:p>
         </w:tc>
@@ -7444,11 +9907,33 @@
             <w:hideMark/>
           </w:tcPr>
           <w:p>
+            <w:proofErr w:type="gramStart"/>
             <w:r>
               <w:rPr>
                 <w:rFonts w:cs="Courier New"/>
               </w:rPr>
-              <w:t>{{ r.primary_objective }}</w:t>
+              <w:t xml:space="preserve">{{ </w:t>
+            </w:r>
+            <w:proofErr w:type="spellStart"/>
+            <w:r>
+              <w:rPr>
+                <w:rFonts w:cs="Courier New"/>
+              </w:rPr>
+              <w:t>r</w:t>
+            </w:r>
+            <w:proofErr w:type="gramEnd"/>
+            <w:r>
+              <w:rPr>
+                <w:rFonts w:cs="Courier New"/>
+              </w:rPr>
+              <w:t>.primary_objective</w:t>
+            </w:r>
+            <w:proofErr w:type="spellEnd"/>
+            <w:r>
+              <w:rPr>
+                <w:rFonts w:cs="Courier New"/>
+              </w:rPr>
+              <w:t xml:space="preserve"> }}</w:t>
             </w:r>
           </w:p>
         </w:tc>
@@ -7513,11 +9998,33 @@
                 <w:rFonts w:cs="Courier New"/>
               </w:rPr>
             </w:pPr>
+            <w:proofErr w:type="gramStart"/>
             <w:r>
               <w:rPr>
                 <w:rFonts w:cs="Courier New"/>
               </w:rPr>
-              <w:t>{{ r.key_deliverables }}</w:t>
+              <w:t xml:space="preserve">{{ </w:t>
+            </w:r>
+            <w:proofErr w:type="spellStart"/>
+            <w:r>
+              <w:rPr>
+                <w:rFonts w:cs="Courier New"/>
+              </w:rPr>
+              <w:t>r.key</w:t>
+            </w:r>
+            <w:proofErr w:type="gramEnd"/>
+            <w:r>
+              <w:rPr>
+                <w:rFonts w:cs="Courier New"/>
+              </w:rPr>
+              <w:t>_deliverables</w:t>
+            </w:r>
+            <w:proofErr w:type="spellEnd"/>
+            <w:r>
+              <w:rPr>
+                <w:rFonts w:cs="Courier New"/>
+              </w:rPr>
+              <w:t xml:space="preserve"> }}</w:t>
             </w:r>
           </w:p>
         </w:tc>
@@ -7573,11 +10080,33 @@
             <w:hideMark/>
           </w:tcPr>
           <w:p>
+            <w:proofErr w:type="gramStart"/>
             <w:r>
               <w:rPr>
                 <w:rFonts w:cs="Courier New"/>
               </w:rPr>
-              <w:t>{{ r.estimated_effort }}</w:t>
+              <w:t xml:space="preserve">{{ </w:t>
+            </w:r>
+            <w:proofErr w:type="spellStart"/>
+            <w:r>
+              <w:rPr>
+                <w:rFonts w:cs="Courier New"/>
+              </w:rPr>
+              <w:t>r</w:t>
+            </w:r>
+            <w:proofErr w:type="gramEnd"/>
+            <w:r>
+              <w:rPr>
+                <w:rFonts w:cs="Courier New"/>
+              </w:rPr>
+              <w:t>.estimated_effort</w:t>
+            </w:r>
+            <w:proofErr w:type="spellEnd"/>
+            <w:r>
+              <w:rPr>
+                <w:rFonts w:cs="Courier New"/>
+              </w:rPr>
+              <w:t xml:space="preserve"> }}</w:t>
             </w:r>
           </w:p>
         </w:tc>
@@ -7637,7 +10166,37 @@
               <w:rPr>
                 <w:rFonts w:cs="Courier New"/>
               </w:rPr>
-              <w:t>{% for m in r.milestones %}</w:t>
+              <w:t xml:space="preserve">{% </w:t>
+            </w:r>
+            <w:proofErr w:type="spellStart"/>
+            <w:r>
+              <w:rPr>
+                <w:rFonts w:cs="Courier New"/>
+              </w:rPr>
+              <w:t>for m</w:t>
+            </w:r>
+            <w:proofErr w:type="spellEnd"/>
+            <w:r>
+              <w:rPr>
+                <w:rFonts w:cs="Courier New"/>
+              </w:rPr>
+              <w:t xml:space="preserve"> in </w:t>
+            </w:r>
+            <w:proofErr w:type="spellStart"/>
+            <w:proofErr w:type="gramStart"/>
+            <w:r>
+              <w:rPr>
+                <w:rFonts w:cs="Courier New"/>
+              </w:rPr>
+              <w:t>r.milestones</w:t>
+            </w:r>
+            <w:proofErr w:type="spellEnd"/>
+            <w:proofErr w:type="gramEnd"/>
+            <w:r>
+              <w:rPr>
+                <w:rFonts w:cs="Courier New"/>
+              </w:rPr>
+              <w:t xml:space="preserve"> %}</w:t>
             </w:r>
           </w:p>
           <w:p>
@@ -7646,7 +10205,21 @@
                 <w:rFonts w:cs="Courier New"/>
               </w:rPr>
               <w:lastRenderedPageBreak/>
-              <w:t>• {{ m }}</w:t>
+              <w:t xml:space="preserve">• </w:t>
+            </w:r>
+            <w:proofErr w:type="gramStart"/>
+            <w:r>
+              <w:rPr>
+                <w:rFonts w:cs="Courier New"/>
+              </w:rPr>
+              <w:t>{{ m</w:t>
+            </w:r>
+            <w:proofErr w:type="gramEnd"/>
+            <w:r>
+              <w:rPr>
+                <w:rFonts w:cs="Courier New"/>
+              </w:rPr>
+              <w:t xml:space="preserve"> }}</w:t>
             </w:r>
           </w:p>
           <w:p>
@@ -7660,7 +10233,21 @@
               <w:rPr>
                 <w:rFonts w:cs="Courier New"/>
               </w:rPr>
-              <w:t>{% endfor %}</w:t>
+              <w:t xml:space="preserve">{% </w:t>
+            </w:r>
+            <w:proofErr w:type="spellStart"/>
+            <w:r>
+              <w:rPr>
+                <w:rFonts w:cs="Courier New"/>
+              </w:rPr>
+              <w:t>endfor</w:t>
+            </w:r>
+            <w:proofErr w:type="spellEnd"/>
+            <w:r>
+              <w:rPr>
+                <w:rFonts w:cs="Courier New"/>
+              </w:rPr>
+              <w:t xml:space="preserve"> %}</w:t>
             </w:r>
           </w:p>
         </w:tc>
@@ -7717,11 +10304,33 @@
             <w:hideMark/>
           </w:tcPr>
           <w:p>
+            <w:proofErr w:type="gramStart"/>
             <w:r>
               <w:rPr>
                 <w:rFonts w:cs="Courier New"/>
               </w:rPr>
-              <w:t>{{ r.business_value_delivered }}</w:t>
+              <w:t xml:space="preserve">{{ </w:t>
+            </w:r>
+            <w:proofErr w:type="spellStart"/>
+            <w:r>
+              <w:rPr>
+                <w:rFonts w:cs="Courier New"/>
+              </w:rPr>
+              <w:t>r</w:t>
+            </w:r>
+            <w:proofErr w:type="gramEnd"/>
+            <w:r>
+              <w:rPr>
+                <w:rFonts w:cs="Courier New"/>
+              </w:rPr>
+              <w:t>.business_value_delivered</w:t>
+            </w:r>
+            <w:proofErr w:type="spellEnd"/>
+            <w:r>
+              <w:rPr>
+                <w:rFonts w:cs="Courier New"/>
+              </w:rPr>
+              <w:t xml:space="preserve"> }}</w:t>
             </w:r>
           </w:p>
         </w:tc>
@@ -7777,11 +10386,33 @@
             <w:hideMark/>
           </w:tcPr>
           <w:p>
+            <w:proofErr w:type="gramStart"/>
             <w:r>
               <w:rPr>
                 <w:rFonts w:cs="Courier New"/>
               </w:rPr>
-              <w:t>{{ r.resource_requirements }}</w:t>
+              <w:t xml:space="preserve">{{ </w:t>
+            </w:r>
+            <w:proofErr w:type="spellStart"/>
+            <w:r>
+              <w:rPr>
+                <w:rFonts w:cs="Courier New"/>
+              </w:rPr>
+              <w:t>r</w:t>
+            </w:r>
+            <w:proofErr w:type="gramEnd"/>
+            <w:r>
+              <w:rPr>
+                <w:rFonts w:cs="Courier New"/>
+              </w:rPr>
+              <w:t>.resource_requirements</w:t>
+            </w:r>
+            <w:proofErr w:type="spellEnd"/>
+            <w:r>
+              <w:rPr>
+                <w:rFonts w:cs="Courier New"/>
+              </w:rPr>
+              <w:t xml:space="preserve"> }}</w:t>
             </w:r>
           </w:p>
         </w:tc>
@@ -7799,7 +10430,21 @@
         <w:rPr>
           <w:rStyle w:val="HTMLCode"/>
         </w:rPr>
-        <w:t>{% endfor %}</w:t>
+        <w:t xml:space="preserve">{% </w:t>
+      </w:r>
+      <w:proofErr w:type="spellStart"/>
+      <w:r>
+        <w:rPr>
+          <w:rStyle w:val="HTMLCode"/>
+        </w:rPr>
+        <w:t>endfor</w:t>
+      </w:r>
+      <w:proofErr w:type="spellEnd"/>
+      <w:r>
+        <w:rPr>
+          <w:rStyle w:val="HTMLCode"/>
+        </w:rPr>
+        <w:t xml:space="preserve"> %}</w:t>
       </w:r>
     </w:p>
     <w:p/>
@@ -8192,7 +10837,15 @@
     <w:p/>
     <w:p>
       <w:r>
-        <w:t xml:space="preserve">Since the beginning, we have built our business on first-class customer service and employing the best people available. We continue that ethos today, constantly building and maintaining our </w:t>
+        <w:t xml:space="preserve">Since the beginning, we have built our business on first-class customer service and employing the best people available. We continue that ethos today, constantly building and maintaining </w:t>
+      </w:r>
+      <w:proofErr w:type="gramStart"/>
+      <w:r>
+        <w:t>our</w:t>
+      </w:r>
+      <w:proofErr w:type="gramEnd"/>
+      <w:r>
+        <w:t xml:space="preserve"> </w:t>
       </w:r>
     </w:p>
     <w:p>
@@ -8452,12 +11105,53 @@
         </w:rPr>
         <w:t>[</w:t>
       </w:r>
+      <w:proofErr w:type="gramStart"/>
       <w:r>
         <w:rPr>
           <w:sz w:val="13"/>
           <w:szCs w:val="18"/>
         </w:rPr>
-        <w:t>{{ customer_name }}</w:t>
+        <w:t xml:space="preserve">{{ </w:t>
+      </w:r>
+      <w:proofErr w:type="spellStart"/>
+      <w:r>
+        <w:rPr>
+          <w:sz w:val="13"/>
+          <w:szCs w:val="18"/>
+        </w:rPr>
+        <w:t>customer</w:t>
+      </w:r>
+      <w:proofErr w:type="gramEnd"/>
+      <w:r>
+        <w:rPr>
+          <w:sz w:val="13"/>
+          <w:szCs w:val="18"/>
+        </w:rPr>
+        <w:t>_</w:t>
+      </w:r>
+      <w:proofErr w:type="gramStart"/>
+      <w:r>
+        <w:rPr>
+          <w:sz w:val="13"/>
+          <w:szCs w:val="18"/>
+        </w:rPr>
+        <w:t>name</w:t>
+      </w:r>
+      <w:proofErr w:type="spellEnd"/>
+      <w:r>
+        <w:rPr>
+          <w:sz w:val="13"/>
+          <w:szCs w:val="18"/>
+        </w:rPr>
+        <w:t xml:space="preserve"> }</w:t>
+      </w:r>
+      <w:proofErr w:type="gramEnd"/>
+      <w:r>
+        <w:rPr>
+          <w:sz w:val="13"/>
+          <w:szCs w:val="18"/>
+        </w:rPr>
+        <w:t>}</w:t>
       </w:r>
       <w:r>
         <w:rPr>
@@ -12023,8 +14717,21 @@
             <w:r>
               <w:t xml:space="preserve"> </w:t>
             </w:r>
-            <w:r>
-              <w:t>{{ consultant_name }}</w:t>
+            <w:proofErr w:type="gramStart"/>
+            <w:r>
+              <w:t xml:space="preserve">{{ </w:t>
+            </w:r>
+            <w:proofErr w:type="spellStart"/>
+            <w:r>
+              <w:t>consultant</w:t>
+            </w:r>
+            <w:proofErr w:type="gramEnd"/>
+            <w:r>
+              <w:t>_name</w:t>
+            </w:r>
+            <w:proofErr w:type="spellEnd"/>
+            <w:r>
+              <w:t xml:space="preserve"> }}</w:t>
             </w:r>
           </w:p>
         </w:tc>
@@ -12745,11 +15452,38 @@
             <w:tcW w:w="2173" w:type="dxa"/>
           </w:tcPr>
           <w:p>
-            <w:r>
-              <w:t>J.Dell / A.</w:t>
-            </w:r>
-            <w:r>
-              <w:t>Sweeney / J.Towle / R. McClafferty</w:t>
+            <w:proofErr w:type="spellStart"/>
+            <w:proofErr w:type="gramStart"/>
+            <w:r>
+              <w:t>J.Dell</w:t>
+            </w:r>
+            <w:proofErr w:type="spellEnd"/>
+            <w:proofErr w:type="gramEnd"/>
+            <w:r>
+              <w:t xml:space="preserve"> / </w:t>
+            </w:r>
+            <w:proofErr w:type="spellStart"/>
+            <w:proofErr w:type="gramStart"/>
+            <w:r>
+              <w:t>A.</w:t>
+            </w:r>
+            <w:r>
+              <w:t>Sweeney</w:t>
+            </w:r>
+            <w:proofErr w:type="spellEnd"/>
+            <w:proofErr w:type="gramEnd"/>
+            <w:r>
+              <w:t xml:space="preserve"> / </w:t>
+            </w:r>
+            <w:proofErr w:type="spellStart"/>
+            <w:proofErr w:type="gramStart"/>
+            <w:r>
+              <w:t>J.Towle</w:t>
+            </w:r>
+            <w:proofErr w:type="spellEnd"/>
+            <w:proofErr w:type="gramEnd"/>
+            <w:r>
+              <w:t xml:space="preserve"> / R. McClafferty</w:t>
             </w:r>
           </w:p>
         </w:tc>
@@ -12790,8 +15524,21 @@
             <w:tcW w:w="2173" w:type="dxa"/>
           </w:tcPr>
           <w:p>
-            <w:r>
-              <w:t>{{ consultant_name }}</w:t>
+            <w:proofErr w:type="gramStart"/>
+            <w:r>
+              <w:t xml:space="preserve">{{ </w:t>
+            </w:r>
+            <w:proofErr w:type="spellStart"/>
+            <w:r>
+              <w:t>consultant</w:t>
+            </w:r>
+            <w:proofErr w:type="gramEnd"/>
+            <w:r>
+              <w:t>_name</w:t>
+            </w:r>
+            <w:proofErr w:type="spellEnd"/>
+            <w:r>
+              <w:t xml:space="preserve"> }}</w:t>
             </w:r>
           </w:p>
         </w:tc>
@@ -12985,8 +15732,29 @@
             </w:tcBorders>
           </w:tcPr>
           <w:p>
-            <w:r>
-              <w:t>{{ customer_name }}</w:t>
+            <w:proofErr w:type="gramStart"/>
+            <w:r>
+              <w:t xml:space="preserve">{{ </w:t>
+            </w:r>
+            <w:proofErr w:type="spellStart"/>
+            <w:r>
+              <w:t>customer</w:t>
+            </w:r>
+            <w:proofErr w:type="gramEnd"/>
+            <w:r>
+              <w:t>_</w:t>
+            </w:r>
+            <w:proofErr w:type="gramStart"/>
+            <w:r>
+              <w:t>name</w:t>
+            </w:r>
+            <w:proofErr w:type="spellEnd"/>
+            <w:r>
+              <w:t xml:space="preserve"> }</w:t>
+            </w:r>
+            <w:proofErr w:type="gramEnd"/>
+            <w:r>
+              <w:t>}</w:t>
             </w:r>
           </w:p>
           <w:p/>
@@ -17040,55 +19808,10 @@
 </file>
 
 <file path=customXml/item1.xml><?xml version="1.0" encoding="utf-8"?>
-<?mso-contentType ?>
-<FormTemplates xmlns="http://schemas.microsoft.com/sharepoint/v3/contenttype/forms">
-  <Display>DocumentLibraryForm</Display>
-  <Edit>DocumentLibraryForm</Edit>
-  <New>DocumentLibraryForm</New>
-</FormTemplates>
+<b:Sources xmlns:b="http://schemas.openxmlformats.org/officeDocument/2006/bibliography" xmlns="http://schemas.openxmlformats.org/officeDocument/2006/bibliography" SelectedStyle="\APASixthEditionOfficeOnline.xsl" StyleName="APA" Version="6"/>
 </file>
 
 <file path=customXml/item2.xml><?xml version="1.0" encoding="utf-8"?>
-<p:properties xmlns:p="http://schemas.microsoft.com/office/2006/metadata/properties" xmlns:xsi="http://www.w3.org/2001/XMLSchema-instance" xmlns:pc="http://schemas.microsoft.com/office/infopath/2007/PartnerControls">
-  <documentManagement>
-    <_ip_UnifiedCompliancePolicyUIAction xmlns="http://schemas.microsoft.com/sharepoint/v3" xsi:nil="true"/>
-    <_ip_UnifiedCompliancePolicyProperties xmlns="http://schemas.microsoft.com/sharepoint/v3" xsi:nil="true"/>
-    <lcf76f155ced4ddcb4097134ff3c332f xmlns="bc555557-3e8b-4e67-83dc-4a843c87bf48">
-      <Terms xmlns="http://schemas.microsoft.com/office/infopath/2007/PartnerControls"/>
-    </lcf76f155ced4ddcb4097134ff3c332f>
-    <TaxCatchAll xmlns="13e5e634-19bb-4da3-8eb1-d732f895062a" xsi:nil="true"/>
-    <SharedWithUsers xmlns="13e5e634-19bb-4da3-8eb1-d732f895062a">
-      <UserInfo>
-        <DisplayName>James Dell</DisplayName>
-        <AccountId>10</AccountId>
-        <AccountType/>
-      </UserInfo>
-      <UserInfo>
-        <DisplayName>Luke Finch</DisplayName>
-        <AccountId>44</AccountId>
-        <AccountType/>
-      </UserInfo>
-      <UserInfo>
-        <DisplayName>Sam Wray</DisplayName>
-        <AccountId>39</AccountId>
-        <AccountType/>
-      </UserInfo>
-      <UserInfo>
-        <DisplayName>Nick Johns</DisplayName>
-        <AccountId>18</AccountId>
-        <AccountType/>
-      </UserInfo>
-      <UserInfo>
-        <DisplayName>Justin Towle</DisplayName>
-        <AccountId>70</AccountId>
-        <AccountType/>
-      </UserInfo>
-    </SharedWithUsers>
-  </documentManagement>
-</p:properties>
-</file>
-
-<file path=customXml/item3.xml><?xml version="1.0" encoding="utf-8"?>
 <ct:contentTypeSchema xmlns:ct="http://schemas.microsoft.com/office/2006/metadata/contentType" xmlns:ma="http://schemas.microsoft.com/office/2006/metadata/properties/metaAttributes" ct:_="" ma:_="" ma:contentTypeName="Document" ma:contentTypeID="0x01010035785702D987474A98E5EB52BEDD3AA6" ma:contentTypeVersion="19" ma:contentTypeDescription="Create a new document." ma:contentTypeScope="" ma:versionID="7475e8a14b23e3b44613142ca3702c71">
   <xsd:schema xmlns:xsd="http://www.w3.org/2001/XMLSchema" xmlns:xs="http://www.w3.org/2001/XMLSchema" xmlns:p="http://schemas.microsoft.com/office/2006/metadata/properties" xmlns:ns1="http://schemas.microsoft.com/sharepoint/v3" xmlns:ns2="bc555557-3e8b-4e67-83dc-4a843c87bf48" xmlns:ns3="13e5e634-19bb-4da3-8eb1-d732f895062a" targetNamespace="http://schemas.microsoft.com/office/2006/metadata/properties" ma:root="true" ma:fieldsID="a0e591cb8f16aef1e2d445ad70521c76" ns1:_="" ns2:_="" ns3:_="">
     <xsd:import namespace="http://schemas.microsoft.com/sharepoint/v3"/>
@@ -17346,31 +20069,64 @@
 </ct:contentTypeSchema>
 </file>
 
+<file path=customXml/item3.xml><?xml version="1.0" encoding="utf-8"?>
+<?mso-contentType ?>
+<FormTemplates xmlns="http://schemas.microsoft.com/sharepoint/v3/contenttype/forms">
+  <Display>DocumentLibraryForm</Display>
+  <Edit>DocumentLibraryForm</Edit>
+  <New>DocumentLibraryForm</New>
+</FormTemplates>
+</file>
+
 <file path=customXml/item4.xml><?xml version="1.0" encoding="utf-8"?>
-<b:Sources xmlns:b="http://schemas.openxmlformats.org/officeDocument/2006/bibliography" xmlns="http://schemas.openxmlformats.org/officeDocument/2006/bibliography" SelectedStyle="\APASixthEditionOfficeOnline.xsl" StyleName="APA" Version="6"/>
+<p:properties xmlns:p="http://schemas.microsoft.com/office/2006/metadata/properties" xmlns:xsi="http://www.w3.org/2001/XMLSchema-instance" xmlns:pc="http://schemas.microsoft.com/office/infopath/2007/PartnerControls">
+  <documentManagement>
+    <_ip_UnifiedCompliancePolicyUIAction xmlns="http://schemas.microsoft.com/sharepoint/v3" xsi:nil="true"/>
+    <_ip_UnifiedCompliancePolicyProperties xmlns="http://schemas.microsoft.com/sharepoint/v3" xsi:nil="true"/>
+    <lcf76f155ced4ddcb4097134ff3c332f xmlns="bc555557-3e8b-4e67-83dc-4a843c87bf48">
+      <Terms xmlns="http://schemas.microsoft.com/office/infopath/2007/PartnerControls"/>
+    </lcf76f155ced4ddcb4097134ff3c332f>
+    <TaxCatchAll xmlns="13e5e634-19bb-4da3-8eb1-d732f895062a" xsi:nil="true"/>
+    <SharedWithUsers xmlns="13e5e634-19bb-4da3-8eb1-d732f895062a">
+      <UserInfo>
+        <DisplayName>James Dell</DisplayName>
+        <AccountId>10</AccountId>
+        <AccountType/>
+      </UserInfo>
+      <UserInfo>
+        <DisplayName>Luke Finch</DisplayName>
+        <AccountId>44</AccountId>
+        <AccountType/>
+      </UserInfo>
+      <UserInfo>
+        <DisplayName>Sam Wray</DisplayName>
+        <AccountId>39</AccountId>
+        <AccountType/>
+      </UserInfo>
+      <UserInfo>
+        <DisplayName>Nick Johns</DisplayName>
+        <AccountId>18</AccountId>
+        <AccountType/>
+      </UserInfo>
+      <UserInfo>
+        <DisplayName>Justin Towle</DisplayName>
+        <AccountId>70</AccountId>
+        <AccountType/>
+      </UserInfo>
+    </SharedWithUsers>
+  </documentManagement>
+</p:properties>
 </file>
 
 <file path=customXml/itemProps1.xml><?xml version="1.0" encoding="utf-8"?>
-<ds:datastoreItem xmlns:ds="http://schemas.openxmlformats.org/officeDocument/2006/customXml" ds:itemID="{02C30E68-946A-4504-B925-FF5230B8A4C3}">
+<ds:datastoreItem xmlns:ds="http://schemas.openxmlformats.org/officeDocument/2006/customXml" ds:itemID="{41B34B53-803B-4600-951E-8C7B6ABDE6A5}">
   <ds:schemaRefs>
-    <ds:schemaRef ds:uri="http://schemas.microsoft.com/sharepoint/v3/contenttype/forms"/>
+    <ds:schemaRef ds:uri="http://schemas.openxmlformats.org/officeDocument/2006/bibliography"/>
   </ds:schemaRefs>
 </ds:datastoreItem>
 </file>
 
 <file path=customXml/itemProps2.xml><?xml version="1.0" encoding="utf-8"?>
-<ds:datastoreItem xmlns:ds="http://schemas.openxmlformats.org/officeDocument/2006/customXml" ds:itemID="{EDF12601-A8A7-4B7A-9481-1111248E774A}">
-  <ds:schemaRefs>
-    <ds:schemaRef ds:uri="http://schemas.microsoft.com/office/2006/metadata/properties"/>
-    <ds:schemaRef ds:uri="http://schemas.microsoft.com/office/infopath/2007/PartnerControls"/>
-    <ds:schemaRef ds:uri="http://schemas.microsoft.com/sharepoint/v3"/>
-    <ds:schemaRef ds:uri="bc555557-3e8b-4e67-83dc-4a843c87bf48"/>
-    <ds:schemaRef ds:uri="13e5e634-19bb-4da3-8eb1-d732f895062a"/>
-  </ds:schemaRefs>
-</ds:datastoreItem>
-</file>
-
-<file path=customXml/itemProps3.xml><?xml version="1.0" encoding="utf-8"?>
 <ds:datastoreItem xmlns:ds="http://schemas.openxmlformats.org/officeDocument/2006/customXml" ds:itemID="{7F9D1B01-7FEE-4553-9877-3B31209422E5}">
   <ds:schemaRefs>
     <ds:schemaRef ds:uri="http://schemas.microsoft.com/office/2006/metadata/contentType"/>
@@ -17390,10 +20146,22 @@
 </ds:datastoreItem>
 </file>
 
+<file path=customXml/itemProps3.xml><?xml version="1.0" encoding="utf-8"?>
+<ds:datastoreItem xmlns:ds="http://schemas.openxmlformats.org/officeDocument/2006/customXml" ds:itemID="{02C30E68-946A-4504-B925-FF5230B8A4C3}">
+  <ds:schemaRefs>
+    <ds:schemaRef ds:uri="http://schemas.microsoft.com/sharepoint/v3/contenttype/forms"/>
+  </ds:schemaRefs>
+</ds:datastoreItem>
+</file>
+
 <file path=customXml/itemProps4.xml><?xml version="1.0" encoding="utf-8"?>
-<ds:datastoreItem xmlns:ds="http://schemas.openxmlformats.org/officeDocument/2006/customXml" ds:itemID="{41B34B53-803B-4600-951E-8C7B6ABDE6A5}">
+<ds:datastoreItem xmlns:ds="http://schemas.openxmlformats.org/officeDocument/2006/customXml" ds:itemID="{EDF12601-A8A7-4B7A-9481-1111248E774A}">
   <ds:schemaRefs>
-    <ds:schemaRef ds:uri="http://schemas.openxmlformats.org/officeDocument/2006/bibliography"/>
+    <ds:schemaRef ds:uri="http://schemas.microsoft.com/office/2006/metadata/properties"/>
+    <ds:schemaRef ds:uri="http://schemas.microsoft.com/office/infopath/2007/PartnerControls"/>
+    <ds:schemaRef ds:uri="http://schemas.microsoft.com/sharepoint/v3"/>
+    <ds:schemaRef ds:uri="bc555557-3e8b-4e67-83dc-4a843c87bf48"/>
+    <ds:schemaRef ds:uri="13e5e634-19bb-4da3-8eb1-d732f895062a"/>
   </ds:schemaRefs>
 </ds:datastoreItem>
 </file>
</xml_diff>